<commit_message>
Implement remaining VMS client feedback backlog (FR-002–FR-011).
Add home address collection, EMR presets, facility Google search, beds/acuity UX, DOCX dedup and template updates, gap review tweaks, and backlog docs linked to epic #97.

Co-authored-by: Cursor <cursoragent@cursor.com>
</commit_message>
<xml_diff>
--- a/server/assets/template.docx
+++ b/server/assets/template.docx
@@ -104,7 +104,8 @@
         <w:rPr>
           <w:rtl w:val="0"/>
         </w:rPr>
-        <w:t xml:space="preserve">{candidate_city}, {candidate_state}</w:t>
+        <w:t xml:space="preserve">{candidate_home_address}
+{candidate_city}, {candidate_state}</w:t>
       </w:r>
     </w:p>
     <w:p>
@@ -162,7 +163,7 @@
         <w:rPr>
           <w:rtl w:val="0"/>
         </w:rPr>
-        <w:t xml:space="preserve">{total_years_nursing_experience} years of experience specializing in {primary_specialty_unit}. Experience in {facility_types_trauma_levels}. Proficient in {core_clinical_competencies}.</w:t>
+        <w:t xml:space="preserve">{total_years_nursing_experience} years of experience specializing in {primary_specialty_unit}. Proficient in {core_clinical_competencies}.</w:t>
       </w:r>
     </w:p>
     <w:p>
@@ -184,7 +185,7 @@
         <w:rPr>
           <w:rtl w:val="0"/>
         </w:rPr>
-        <w:t xml:space="preserve">Patient Ratios: {average_patient_ratios}</w:t>
+        <w:t xml:space="preserve"/>
       </w:r>
     </w:p>
     <w:p>
@@ -784,7 +785,7 @@
         <w:rPr>
           <w:rtl w:val="0"/>
         </w:rPr>
-        <w:t xml:space="preserve">- Managed {experience_average_daily_patients}  patients in {experience_patient_acuity_level} setting</w:t>
+        <w:t xml:space="preserve">Patient ratio: {experience_average_daily_patients}</w:t>
       </w:r>
     </w:p>
     <w:p>

</xml_diff>

<commit_message>
Implement remaining VMS client feedback backlog (FR-002–FR-011). (#109)
Add home address collection, EMR presets, facility Google search, beds/acuity UX, DOCX dedup and template updates, gap review tweaks, and backlog docs linked to epic #97.

Co-authored-by: juanrod <juanrod@Skyss-MacBook-Neo.local>
Co-authored-by: Cursor <cursoragent@cursor.com>
</commit_message>
<xml_diff>
--- a/server/assets/template.docx
+++ b/server/assets/template.docx
@@ -104,7 +104,8 @@
         <w:rPr>
           <w:rtl w:val="0"/>
         </w:rPr>
-        <w:t xml:space="preserve">{candidate_city}, {candidate_state}</w:t>
+        <w:t xml:space="preserve">{candidate_home_address}
+{candidate_city}, {candidate_state}</w:t>
       </w:r>
     </w:p>
     <w:p>
@@ -162,7 +163,7 @@
         <w:rPr>
           <w:rtl w:val="0"/>
         </w:rPr>
-        <w:t xml:space="preserve">{total_years_nursing_experience} years of experience specializing in {primary_specialty_unit}. Experience in {facility_types_trauma_levels}. Proficient in {core_clinical_competencies}.</w:t>
+        <w:t xml:space="preserve">{total_years_nursing_experience} years of experience specializing in {primary_specialty_unit}. Proficient in {core_clinical_competencies}.</w:t>
       </w:r>
     </w:p>
     <w:p>
@@ -184,7 +185,7 @@
         <w:rPr>
           <w:rtl w:val="0"/>
         </w:rPr>
-        <w:t xml:space="preserve">Patient Ratios: {average_patient_ratios}</w:t>
+        <w:t xml:space="preserve"/>
       </w:r>
     </w:p>
     <w:p>
@@ -784,7 +785,7 @@
         <w:rPr>
           <w:rtl w:val="0"/>
         </w:rPr>
-        <w:t xml:space="preserve">- Managed {experience_average_daily_patients}  patients in {experience_patient_acuity_level} setting</w:t>
+        <w:t xml:space="preserve">Patient ratio: {experience_average_daily_patients}</w:t>
       </w:r>
     </w:p>
     <w:p>

</xml_diff>

<commit_message>
Expand certifications to multi-select browse with DOCX loop export.
Replace six pill toggles with 29 grouped certs, optional expiry dates, and a certifications_list template loop so every selected cert mirrors in the packet.

Co-authored-by: Cursor <cursoragent@cursor.com>
</commit_message>
<xml_diff>
--- a/server/assets/template.docx
+++ b/server/assets/template.docx
@@ -218,7 +218,7 @@
         <w:rPr>
           <w:rtl w:val="0"/>
         </w:rPr>
-        <w:t xml:space="preserve">Certifications: {core_life_support_certifications}</w:t>
+        <w:t xml:space="preserve">{#certifications_list}{certification_name}: {certification_expiration_date}{/certifications_list}</w:t>
       </w:r>
     </w:p>
     <w:p>
@@ -277,29 +277,29 @@
         <w:rPr>
           <w:rtl w:val="0"/>
         </w:rPr>
-        <w:t xml:space="preserve">BLS: {BLS_certification_expiration_date}</w:t>
-      </w:r>
-    </w:p>
-    <w:p>
-      <w:pPr>
-        <w:rPr/>
-      </w:pPr>
-      <w:r>
-        <w:rPr>
-          <w:rtl w:val="0"/>
-        </w:rPr>
-        <w:t xml:space="preserve">ACLS: {ACLS_certification_expiration_date}</w:t>
-      </w:r>
-    </w:p>
-    <w:p>
-      <w:pPr>
-        <w:rPr/>
-      </w:pPr>
-      <w:r>
-        <w:rPr>
-          <w:rtl w:val="0"/>
-        </w:rPr>
-        <w:t xml:space="preserve">PALS: {PALS_certification_expiration_date}</w:t>
+        <w:t xml:space="preserve"/>
+      </w:r>
+    </w:p>
+    <w:p>
+      <w:pPr>
+        <w:rPr/>
+      </w:pPr>
+      <w:r>
+        <w:rPr>
+          <w:rtl w:val="0"/>
+        </w:rPr>
+        <w:t xml:space="preserve"/>
+      </w:r>
+    </w:p>
+    <w:p>
+      <w:pPr>
+        <w:rPr/>
+      </w:pPr>
+      <w:r>
+        <w:rPr>
+          <w:rtl w:val="0"/>
+        </w:rPr>
+        <w:t xml:space="preserve"/>
       </w:r>
     </w:p>
     <w:p>

</xml_diff>

<commit_message>
Expand certifications to multi-select browse with DOCX loop export. (#112)
Replace six pill toggles with 29 grouped certs, optional expiry dates, and a certifications_list template loop so every selected cert mirrors in the packet.

Co-authored-by: juanrod <juanrod@Skyss-MacBook-Neo.local>
Co-authored-by: Cursor <cursoragent@cursor.com>
</commit_message>
<xml_diff>
--- a/server/assets/template.docx
+++ b/server/assets/template.docx
@@ -218,7 +218,7 @@
         <w:rPr>
           <w:rtl w:val="0"/>
         </w:rPr>
-        <w:t xml:space="preserve">Certifications: {core_life_support_certifications}</w:t>
+        <w:t xml:space="preserve">{#certifications_list}{certification_name}: {certification_expiration_date}{/certifications_list}</w:t>
       </w:r>
     </w:p>
     <w:p>
@@ -277,29 +277,29 @@
         <w:rPr>
           <w:rtl w:val="0"/>
         </w:rPr>
-        <w:t xml:space="preserve">BLS: {BLS_certification_expiration_date}</w:t>
-      </w:r>
-    </w:p>
-    <w:p>
-      <w:pPr>
-        <w:rPr/>
-      </w:pPr>
-      <w:r>
-        <w:rPr>
-          <w:rtl w:val="0"/>
-        </w:rPr>
-        <w:t xml:space="preserve">ACLS: {ACLS_certification_expiration_date}</w:t>
-      </w:r>
-    </w:p>
-    <w:p>
-      <w:pPr>
-        <w:rPr/>
-      </w:pPr>
-      <w:r>
-        <w:rPr>
-          <w:rtl w:val="0"/>
-        </w:rPr>
-        <w:t xml:space="preserve">PALS: {PALS_certification_expiration_date}</w:t>
+        <w:t xml:space="preserve"/>
+      </w:r>
+    </w:p>
+    <w:p>
+      <w:pPr>
+        <w:rPr/>
+      </w:pPr>
+      <w:r>
+        <w:rPr>
+          <w:rtl w:val="0"/>
+        </w:rPr>
+        <w:t xml:space="preserve"/>
+      </w:r>
+    </w:p>
+    <w:p>
+      <w:pPr>
+        <w:rPr/>
+      </w:pPr>
+      <w:r>
+        <w:rPr>
+          <w:rtl w:val="0"/>
+        </w:rPr>
+        <w:t xml:space="preserve"/>
       </w:r>
     </w:p>
     <w:p>

</xml_diff>

<commit_message>
Fix DOCX preview rendering undefined values and mapping gaps.
Sanitize nullish template data, wire patient acuity, and patch list loops to use {.} so docxtemplater renders specialties and list fields correctly.

Co-authored-by: Cursor <cursoragent@cursor.com>
</commit_message>
<xml_diff>
--- a/server/assets/template.docx
+++ b/server/assets/template.docx
@@ -124,7 +124,7 @@
         <w:rPr>
           <w:rtl w:val="0"/>
         </w:rPr>
-        <w:t xml:space="preserve">{#active_licenses_list}{ . }{/active_licenses_list}</w:t>
+        <w:t xml:space="preserve">{#active_licenses_list}{.}{/active_licenses_list}</w:t>
       </w:r>
     </w:p>
     <w:p>
@@ -174,7 +174,7 @@
         <w:rPr>
           <w:rtl w:val="0"/>
         </w:rPr>
-        <w:t xml:space="preserve">Specialties: {#clinical_specialties_list}{ . }{/clinical_specialties_list}</w:t>
+        <w:t xml:space="preserve">Specialties: {#clinical_specialties_list}{.}{/clinical_specialties_list}</w:t>
       </w:r>
     </w:p>
     <w:p>
@@ -737,7 +737,7 @@
         <w:rPr>
           <w:rtl w:val="0"/>
         </w:rPr>
-        <w:t xml:space="preserve">{#experience_floated_units_list}{ . }{/experience_floated_units_list}</w:t>
+        <w:t xml:space="preserve">{#experience_floated_units_list}{.}{/experience_floated_units_list}</w:t>
       </w:r>
     </w:p>
     <w:p>
@@ -756,7 +756,7 @@
         <w:rPr>
           <w:rtl w:val="0"/>
         </w:rPr>
-        <w:t xml:space="preserve">{#experience_equipment_procedures_list} { . } {/experience_equipment_procedures_list}</w:t>
+        <w:t xml:space="preserve">{#experience_equipment_procedures_list} {.} {/experience_equipment_procedures_list}</w:t>
       </w:r>
     </w:p>
     <w:p>
@@ -796,7 +796,7 @@
         <w:rPr>
           <w:rtl w:val="0"/>
         </w:rPr>
-        <w:t xml:space="preserve">{#experience_highlights} { . } {/experience_highlights}</w:t>
+        <w:t xml:space="preserve">{#experience_highlights} {.} {/experience_highlights}</w:t>
       </w:r>
     </w:p>
     <w:p>

</xml_diff>

<commit_message>
Fix DOCX preview rendering undefined values and mapping gaps. (#113)
Sanitize nullish template data, wire patient acuity, and patch list loops to use {.} so docxtemplater renders specialties and list fields correctly.

Co-authored-by: juanrod <juanrod@Skyss-MacBook-Neo.local>
Co-authored-by: Cursor <cursoragent@cursor.com>
</commit_message>
<xml_diff>
--- a/server/assets/template.docx
+++ b/server/assets/template.docx
@@ -124,7 +124,7 @@
         <w:rPr>
           <w:rtl w:val="0"/>
         </w:rPr>
-        <w:t xml:space="preserve">{#active_licenses_list}{ . }{/active_licenses_list}</w:t>
+        <w:t xml:space="preserve">{#active_licenses_list}{.}{/active_licenses_list}</w:t>
       </w:r>
     </w:p>
     <w:p>
@@ -174,7 +174,7 @@
         <w:rPr>
           <w:rtl w:val="0"/>
         </w:rPr>
-        <w:t xml:space="preserve">Specialties: {#clinical_specialties_list}{ . }{/clinical_specialties_list}</w:t>
+        <w:t xml:space="preserve">Specialties: {#clinical_specialties_list}{.}{/clinical_specialties_list}</w:t>
       </w:r>
     </w:p>
     <w:p>
@@ -737,7 +737,7 @@
         <w:rPr>
           <w:rtl w:val="0"/>
         </w:rPr>
-        <w:t xml:space="preserve">{#experience_floated_units_list}{ . }{/experience_floated_units_list}</w:t>
+        <w:t xml:space="preserve">{#experience_floated_units_list}{.}{/experience_floated_units_list}</w:t>
       </w:r>
     </w:p>
     <w:p>
@@ -756,7 +756,7 @@
         <w:rPr>
           <w:rtl w:val="0"/>
         </w:rPr>
-        <w:t xml:space="preserve">{#experience_equipment_procedures_list} { . } {/experience_equipment_procedures_list}</w:t>
+        <w:t xml:space="preserve">{#experience_equipment_procedures_list} {.} {/experience_equipment_procedures_list}</w:t>
       </w:r>
     </w:p>
     <w:p>
@@ -796,7 +796,7 @@
         <w:rPr>
           <w:rtl w:val="0"/>
         </w:rPr>
-        <w:t xml:space="preserve">{#experience_highlights} { . } {/experience_highlights}</w:t>
+        <w:t xml:space="preserve">{#experience_highlights} {.} {/experience_highlights}</w:t>
       </w:r>
     </w:p>
     <w:p>

</xml_diff>

<commit_message>
Reconcile July template manifest and add multi-license DOCX loop.
Adds licenses_list export, automated DOCX smoke in CI, and manifest/docs updates for the Professional Snapshot contract.

Co-authored-by: Cursor <cursoragent@cursor.com>
</commit_message>
<xml_diff>
--- a/server/assets/template.docx
+++ b/server/assets/template.docx
@@ -4,6 +4,7 @@
   <w:body>
     <w:p>
       <w:pPr>
+        <w:spacing w:line="240" w:lineRule="auto"/>
         <w:rPr/>
       </w:pPr>
       <w:r>
@@ -15,6 +16,7 @@
     </w:p>
     <w:p>
       <w:pPr>
+        <w:spacing w:line="240" w:lineRule="auto"/>
         <w:rPr/>
       </w:pPr>
       <w:r>
@@ -22,7 +24,17 @@
           <w:rtl w:val="0"/>
         </w:rPr>
         <w:t xml:space="preserve">{candidate_phone} | {candidate_email}</w:t>
-        <w:br w:type="textWrapping"/>
+      </w:r>
+    </w:p>
+    <w:p>
+      <w:pPr>
+        <w:spacing w:line="240" w:lineRule="auto"/>
+        <w:rPr/>
+      </w:pPr>
+      <w:r>
+        <w:rPr>
+          <w:rtl w:val="0"/>
+        </w:rPr>
         <w:t xml:space="preserve">{candidate_home_address}, {candidate_city}, {candidate_state}</w:t>
       </w:r>
     </w:p>
@@ -34,6 +46,16 @@
         <w:rPr>
           <w:rtl w:val="0"/>
         </w:rPr>
+      </w:r>
+    </w:p>
+    <w:p>
+      <w:pPr>
+        <w:rPr/>
+      </w:pPr>
+      <w:r>
+        <w:rPr>
+          <w:rtl w:val="0"/>
+        </w:rPr>
         <w:t xml:space="preserve">PROFESSIONAL SNAPSHOT</w:t>
       </w:r>
     </w:p>
@@ -49,21 +71,6 @@
         <w:rPr>
           <w:rtl w:val="0"/>
         </w:rPr>
-        <w:t xml:space="preserve">PROFESSIONAL SNAPSHOT</w:t>
-      </w:r>
-    </w:p>
-    <w:p>
-      <w:pPr>
-        <w:numPr>
-          <w:ilvl w:val="0"/>
-          <w:numId w:val="1"/>
-        </w:numPr>
-        <w:ind w:left="360"/>
-      </w:pPr>
-      <w:r>
-        <w:rPr>
-          <w:rtl w:val="0"/>
-        </w:rPr>
         <w:t xml:space="preserve">Specialty: {snapshot_specialty}</w:t>
       </w:r>
     </w:p>
@@ -265,7 +272,7 @@
         <w:rPr>
           <w:rtl w:val="0"/>
         </w:rPr>
-        <w:t xml:space="preserve">{rn_license_state_and_expiry}</w:t>
+        <w:t xml:space="preserve">{#licenses_list}{rn_license_state_and_expiry}{/licenses_list}</w:t>
       </w:r>
     </w:p>
     <w:p>
@@ -383,6 +390,16 @@
         <w:rPr>
           <w:rtl w:val="0"/>
         </w:rPr>
+      </w:r>
+    </w:p>
+    <w:p>
+      <w:pPr>
+        <w:rPr/>
+      </w:pPr>
+      <w:r>
+        <w:rPr>
+          <w:rtl w:val="0"/>
+        </w:rPr>
         <w:t xml:space="preserve">{/education}</w:t>
       </w:r>
     </w:p>
@@ -426,18 +443,18 @@
         <w:rPr>
           <w:rtl w:val="0"/>
         </w:rPr>
-        <w:t xml:space="preserve">RN - {experience_facility_type}</w:t>
-      </w:r>
-    </w:p>
-    <w:p>
-      <w:pPr>
-        <w:rPr/>
-      </w:pPr>
-      <w:r>
-        <w:rPr>
-          <w:rtl w:val="0"/>
-        </w:rPr>
-        <w:t xml:space="preserve">{experience_hospital_name}|{experience_facility_location}</w:t>
+        <w:t xml:space="preserve">RN - {experience_unit_specialty}</w:t>
+      </w:r>
+    </w:p>
+    <w:p>
+      <w:pPr>
+        <w:rPr/>
+      </w:pPr>
+      <w:r>
+        <w:rPr>
+          <w:rtl w:val="0"/>
+        </w:rPr>
+        <w:t xml:space="preserve">{experience_hospital_name} | {experience_facility_location}</w:t>
       </w:r>
     </w:p>
     <w:p>
@@ -460,6 +477,16 @@
           <w:rtl w:val="0"/>
         </w:rPr>
         <w:t xml:space="preserve">{experience_unit_bed_count} • {experience_hospital_total_beds} •  {experience_trauma_level} • {experience_is_teaching_facility} • {experience_emr_system} • {experience_patient_scope}</w:t>
+      </w:r>
+    </w:p>
+    <w:p>
+      <w:pPr>
+        <w:rPr/>
+      </w:pPr>
+      <w:r>
+        <w:rPr>
+          <w:rtl w:val="0"/>
+        </w:rPr>
       </w:r>
     </w:p>
     <w:p>

</xml_diff>

<commit_message>
Reconcile July template manifest and add multi-license DOCX loop. (#117)
Adds licenses_list export, automated DOCX smoke in CI, and manifest/docs updates for the Professional Snapshot contract.

Co-authored-by: juanrod <juanrod@Skyss-MacBook-Neo.local>
Co-authored-by: Cursor <cursoragent@cursor.com>
</commit_message>
<xml_diff>
--- a/server/assets/template.docx
+++ b/server/assets/template.docx
@@ -4,6 +4,7 @@
   <w:body>
     <w:p>
       <w:pPr>
+        <w:spacing w:line="240" w:lineRule="auto"/>
         <w:rPr/>
       </w:pPr>
       <w:r>
@@ -15,6 +16,7 @@
     </w:p>
     <w:p>
       <w:pPr>
+        <w:spacing w:line="240" w:lineRule="auto"/>
         <w:rPr/>
       </w:pPr>
       <w:r>
@@ -22,7 +24,17 @@
           <w:rtl w:val="0"/>
         </w:rPr>
         <w:t xml:space="preserve">{candidate_phone} | {candidate_email}</w:t>
-        <w:br w:type="textWrapping"/>
+      </w:r>
+    </w:p>
+    <w:p>
+      <w:pPr>
+        <w:spacing w:line="240" w:lineRule="auto"/>
+        <w:rPr/>
+      </w:pPr>
+      <w:r>
+        <w:rPr>
+          <w:rtl w:val="0"/>
+        </w:rPr>
         <w:t xml:space="preserve">{candidate_home_address}, {candidate_city}, {candidate_state}</w:t>
       </w:r>
     </w:p>
@@ -34,6 +46,16 @@
         <w:rPr>
           <w:rtl w:val="0"/>
         </w:rPr>
+      </w:r>
+    </w:p>
+    <w:p>
+      <w:pPr>
+        <w:rPr/>
+      </w:pPr>
+      <w:r>
+        <w:rPr>
+          <w:rtl w:val="0"/>
+        </w:rPr>
         <w:t xml:space="preserve">PROFESSIONAL SNAPSHOT</w:t>
       </w:r>
     </w:p>
@@ -49,21 +71,6 @@
         <w:rPr>
           <w:rtl w:val="0"/>
         </w:rPr>
-        <w:t xml:space="preserve">PROFESSIONAL SNAPSHOT</w:t>
-      </w:r>
-    </w:p>
-    <w:p>
-      <w:pPr>
-        <w:numPr>
-          <w:ilvl w:val="0"/>
-          <w:numId w:val="1"/>
-        </w:numPr>
-        <w:ind w:left="360"/>
-      </w:pPr>
-      <w:r>
-        <w:rPr>
-          <w:rtl w:val="0"/>
-        </w:rPr>
         <w:t xml:space="preserve">Specialty: {snapshot_specialty}</w:t>
       </w:r>
     </w:p>
@@ -265,7 +272,7 @@
         <w:rPr>
           <w:rtl w:val="0"/>
         </w:rPr>
-        <w:t xml:space="preserve">{rn_license_state_and_expiry}</w:t>
+        <w:t xml:space="preserve">{#licenses_list}{rn_license_state_and_expiry}{/licenses_list}</w:t>
       </w:r>
     </w:p>
     <w:p>
@@ -383,6 +390,16 @@
         <w:rPr>
           <w:rtl w:val="0"/>
         </w:rPr>
+      </w:r>
+    </w:p>
+    <w:p>
+      <w:pPr>
+        <w:rPr/>
+      </w:pPr>
+      <w:r>
+        <w:rPr>
+          <w:rtl w:val="0"/>
+        </w:rPr>
         <w:t xml:space="preserve">{/education}</w:t>
       </w:r>
     </w:p>
@@ -426,18 +443,18 @@
         <w:rPr>
           <w:rtl w:val="0"/>
         </w:rPr>
-        <w:t xml:space="preserve">RN - {experience_facility_type}</w:t>
-      </w:r>
-    </w:p>
-    <w:p>
-      <w:pPr>
-        <w:rPr/>
-      </w:pPr>
-      <w:r>
-        <w:rPr>
-          <w:rtl w:val="0"/>
-        </w:rPr>
-        <w:t xml:space="preserve">{experience_hospital_name}|{experience_facility_location}</w:t>
+        <w:t xml:space="preserve">RN - {experience_unit_specialty}</w:t>
+      </w:r>
+    </w:p>
+    <w:p>
+      <w:pPr>
+        <w:rPr/>
+      </w:pPr>
+      <w:r>
+        <w:rPr>
+          <w:rtl w:val="0"/>
+        </w:rPr>
+        <w:t xml:space="preserve">{experience_hospital_name} | {experience_facility_location}</w:t>
       </w:r>
     </w:p>
     <w:p>
@@ -460,6 +477,16 @@
           <w:rtl w:val="0"/>
         </w:rPr>
         <w:t xml:space="preserve">{experience_unit_bed_count} • {experience_hospital_total_beds} •  {experience_trauma_level} • {experience_is_teaching_facility} • {experience_emr_system} • {experience_patient_scope}</w:t>
+      </w:r>
+    </w:p>
+    <w:p>
+      <w:pPr>
+        <w:rPr/>
+      </w:pPr>
+      <w:r>
+        <w:rPr>
+          <w:rtl w:val="0"/>
+        </w:rPr>
       </w:r>
     </w:p>
     <w:p>

</xml_diff>

<commit_message>
Fix oversized Snapshot and license bullets in DOCX preview.
Replace the template's unsized ● marker with a 10pt bullet and cap preview ::before marker size so docx-preview matches Pages.

Co-authored-by: Cursor <cursoragent@cursor.com>
</commit_message>
<xml_diff>
--- a/server/assets/template.docx
+++ b/server/assets/template.docx
@@ -515,12 +515,15 @@
     <w:lvl w:ilvl="0">
       <w:start w:val="1"/>
       <w:numFmt w:val="bullet"/>
-      <w:lvlText w:val="●"/>
+      <w:lvlText w:val="•"/>
       <w:lvlJc w:val="left"/>
       <w:pPr>
         <w:ind w:left="360" w:hanging="360"/>
       </w:pPr>
       <w:rPr>
+        <w:rFonts w:ascii="Arial" w:hAnsi="Arial" w:cs="Arial" w:eastAsia="Arial"/>
+        <w:sz w:val="20"/>
+        <w:szCs w:val="20"/>
         <w:u w:val="none"/>
       </w:rPr>
     </w:lvl>

</xml_diff>

<commit_message>
Fix oversized Snapshot and license bullets in DOCX preview. (#118)
Replace the template's unsized ● marker with a 10pt bullet and cap preview ::before marker size so docx-preview matches Pages.

Co-authored-by: juanrod <juanrod@Skyss-MacBook-Neo.local>
Co-authored-by: Cursor <cursoragent@cursor.com>
</commit_message>
<xml_diff>
--- a/server/assets/template.docx
+++ b/server/assets/template.docx
@@ -515,12 +515,15 @@
     <w:lvl w:ilvl="0">
       <w:start w:val="1"/>
       <w:numFmt w:val="bullet"/>
-      <w:lvlText w:val="●"/>
+      <w:lvlText w:val="•"/>
       <w:lvlJc w:val="left"/>
       <w:pPr>
         <w:ind w:left="360" w:hanging="360"/>
       </w:pPr>
       <w:rPr>
+        <w:rFonts w:ascii="Arial" w:hAnsi="Arial" w:cs="Arial" w:eastAsia="Arial"/>
+        <w:sz w:val="20"/>
+        <w:szCs w:val="20"/>
         <w:u w:val="none"/>
       </w:rPr>
     </w:lvl>

</xml_diff>

<commit_message>
Omit unchecked Professional Snapshot lines from the DOCX packet.
Wrap each snapshot row in a docxtemplater section so Include: false clears both the value and the label in preview/download.

Co-authored-by: Cursor <cursoragent@cursor.com>
</commit_message>
<xml_diff>
--- a/server/assets/template.docx
+++ b/server/assets/template.docx
@@ -71,172 +71,172 @@
         <w:rPr>
           <w:rtl w:val="0"/>
         </w:rPr>
-        <w:t xml:space="preserve">Specialty: {snapshot_specialty}</w:t>
-      </w:r>
-    </w:p>
-    <w:p>
-      <w:pPr>
-        <w:numPr>
-          <w:ilvl w:val="0"/>
-          <w:numId w:val="1"/>
-        </w:numPr>
-        <w:ind w:left="360"/>
-      </w:pPr>
-      <w:r>
-        <w:rPr>
-          <w:rtl w:val="0"/>
-        </w:rPr>
-        <w:t xml:space="preserve">Years of Experience: {snapshot_years_experience}</w:t>
-      </w:r>
-    </w:p>
-    <w:p>
-      <w:pPr>
-        <w:numPr>
-          <w:ilvl w:val="0"/>
-          <w:numId w:val="1"/>
-        </w:numPr>
-        <w:ind w:left="360"/>
-      </w:pPr>
-      <w:r>
-        <w:rPr>
-          <w:rtl w:val="0"/>
-        </w:rPr>
-        <w:t xml:space="preserve">Travel Experience: {snapshot_travel_experience}</w:t>
-      </w:r>
-    </w:p>
-    <w:p>
-      <w:pPr>
-        <w:numPr>
-          <w:ilvl w:val="0"/>
-          <w:numId w:val="1"/>
-        </w:numPr>
-        <w:ind w:left="360"/>
-      </w:pPr>
-      <w:r>
-        <w:rPr>
-          <w:rtl w:val="0"/>
-        </w:rPr>
-        <w:t xml:space="preserve">Trauma Experience: {snapshot_trauma_experience}</w:t>
-      </w:r>
-    </w:p>
-    <w:p>
-      <w:pPr>
-        <w:numPr>
-          <w:ilvl w:val="0"/>
-          <w:numId w:val="1"/>
-        </w:numPr>
-        <w:ind w:left="360"/>
-      </w:pPr>
-      <w:r>
-        <w:rPr>
-          <w:rtl w:val="0"/>
-        </w:rPr>
-        <w:t xml:space="preserve">Teaching Facility Experience: {snapshot_teaching_facility_experience}</w:t>
-      </w:r>
-    </w:p>
-    <w:p>
-      <w:pPr>
-        <w:numPr>
-          <w:ilvl w:val="0"/>
-          <w:numId w:val="1"/>
-        </w:numPr>
-        <w:ind w:left="360"/>
-      </w:pPr>
-      <w:r>
-        <w:rPr>
-          <w:rtl w:val="0"/>
-        </w:rPr>
-        <w:t xml:space="preserve">Magnet Facility Experience: {snapshot_magnet_facility_experience}</w:t>
-      </w:r>
-    </w:p>
-    <w:p>
-      <w:pPr>
-        <w:numPr>
-          <w:ilvl w:val="0"/>
-          <w:numId w:val="1"/>
-        </w:numPr>
-        <w:ind w:left="360"/>
-      </w:pPr>
-      <w:r>
-        <w:rPr>
-          <w:rtl w:val="0"/>
-        </w:rPr>
-        <w:t xml:space="preserve">Charge Nurse Experience: {snapshot_charge_nurse_experience}</w:t>
-      </w:r>
-    </w:p>
-    <w:p>
-      <w:pPr>
-        <w:numPr>
-          <w:ilvl w:val="0"/>
-          <w:numId w:val="1"/>
-        </w:numPr>
-        <w:ind w:left="360"/>
-      </w:pPr>
-      <w:r>
-        <w:rPr>
-          <w:rtl w:val="0"/>
-        </w:rPr>
-        <w:t xml:space="preserve">Preceptor Experience: {snapshot_preceptor_experience}</w:t>
-      </w:r>
-    </w:p>
-    <w:p>
-      <w:pPr>
-        <w:numPr>
-          <w:ilvl w:val="0"/>
-          <w:numId w:val="1"/>
-        </w:numPr>
-        <w:ind w:left="360"/>
-      </w:pPr>
-      <w:r>
-        <w:rPr>
-          <w:rtl w:val="0"/>
-        </w:rPr>
-        <w:t xml:space="preserve">Float Experience: {snapshot_float_experience}</w:t>
-      </w:r>
-    </w:p>
-    <w:p>
-      <w:pPr>
-        <w:numPr>
-          <w:ilvl w:val="0"/>
-          <w:numId w:val="1"/>
-        </w:numPr>
-        <w:ind w:left="360"/>
-      </w:pPr>
-      <w:r>
-        <w:rPr>
-          <w:rtl w:val="0"/>
-        </w:rPr>
-        <w:t xml:space="preserve">EMR Systems: {snapshot_emr_systems}</w:t>
-      </w:r>
-    </w:p>
-    <w:p>
-      <w:pPr>
-        <w:numPr>
-          <w:ilvl w:val="0"/>
-          <w:numId w:val="1"/>
-        </w:numPr>
-        <w:ind w:left="360"/>
-      </w:pPr>
-      <w:r>
-        <w:rPr>
-          <w:rtl w:val="0"/>
-        </w:rPr>
-        <w:t xml:space="preserve">Patient Ratios Managed: {snapshot_patient_ratios_managed}</w:t>
-      </w:r>
-    </w:p>
-    <w:p>
-      <w:pPr>
-        <w:numPr>
-          <w:ilvl w:val="0"/>
-          <w:numId w:val="1"/>
-        </w:numPr>
-        <w:ind w:left="360"/>
-      </w:pPr>
-      <w:r>
-        <w:rPr>
-          <w:rtl w:val="0"/>
-        </w:rPr>
-        <w:t xml:space="preserve">Equipment/Skills: {snapshot_equipment_skills}</w:t>
+        <w:t xml:space="preserve">{#snapshot_specialty}Specialty: {snapshot_specialty}{/snapshot_specialty}</w:t>
+      </w:r>
+    </w:p>
+    <w:p>
+      <w:pPr>
+        <w:numPr>
+          <w:ilvl w:val="0"/>
+          <w:numId w:val="1"/>
+        </w:numPr>
+        <w:ind w:left="360"/>
+      </w:pPr>
+      <w:r>
+        <w:rPr>
+          <w:rtl w:val="0"/>
+        </w:rPr>
+        <w:t xml:space="preserve">{#snapshot_years_experience}Years of Experience: {snapshot_years_experience}{/snapshot_years_experience}</w:t>
+      </w:r>
+    </w:p>
+    <w:p>
+      <w:pPr>
+        <w:numPr>
+          <w:ilvl w:val="0"/>
+          <w:numId w:val="1"/>
+        </w:numPr>
+        <w:ind w:left="360"/>
+      </w:pPr>
+      <w:r>
+        <w:rPr>
+          <w:rtl w:val="0"/>
+        </w:rPr>
+        <w:t xml:space="preserve">{#snapshot_travel_experience}Travel Experience: {snapshot_travel_experience}{/snapshot_travel_experience}</w:t>
+      </w:r>
+    </w:p>
+    <w:p>
+      <w:pPr>
+        <w:numPr>
+          <w:ilvl w:val="0"/>
+          <w:numId w:val="1"/>
+        </w:numPr>
+        <w:ind w:left="360"/>
+      </w:pPr>
+      <w:r>
+        <w:rPr>
+          <w:rtl w:val="0"/>
+        </w:rPr>
+        <w:t xml:space="preserve">{#snapshot_trauma_experience}Trauma Experience: {snapshot_trauma_experience}{/snapshot_trauma_experience}</w:t>
+      </w:r>
+    </w:p>
+    <w:p>
+      <w:pPr>
+        <w:numPr>
+          <w:ilvl w:val="0"/>
+          <w:numId w:val="1"/>
+        </w:numPr>
+        <w:ind w:left="360"/>
+      </w:pPr>
+      <w:r>
+        <w:rPr>
+          <w:rtl w:val="0"/>
+        </w:rPr>
+        <w:t xml:space="preserve">{#snapshot_teaching_facility_experience}Teaching Facility Experience: {snapshot_teaching_facility_experience}{/snapshot_teaching_facility_experience}</w:t>
+      </w:r>
+    </w:p>
+    <w:p>
+      <w:pPr>
+        <w:numPr>
+          <w:ilvl w:val="0"/>
+          <w:numId w:val="1"/>
+        </w:numPr>
+        <w:ind w:left="360"/>
+      </w:pPr>
+      <w:r>
+        <w:rPr>
+          <w:rtl w:val="0"/>
+        </w:rPr>
+        <w:t xml:space="preserve">{#snapshot_magnet_facility_experience}Magnet Facility Experience: {snapshot_magnet_facility_experience}{/snapshot_magnet_facility_experience}</w:t>
+      </w:r>
+    </w:p>
+    <w:p>
+      <w:pPr>
+        <w:numPr>
+          <w:ilvl w:val="0"/>
+          <w:numId w:val="1"/>
+        </w:numPr>
+        <w:ind w:left="360"/>
+      </w:pPr>
+      <w:r>
+        <w:rPr>
+          <w:rtl w:val="0"/>
+        </w:rPr>
+        <w:t xml:space="preserve">{#snapshot_charge_nurse_experience}Charge Nurse Experience: {snapshot_charge_nurse_experience}{/snapshot_charge_nurse_experience}</w:t>
+      </w:r>
+    </w:p>
+    <w:p>
+      <w:pPr>
+        <w:numPr>
+          <w:ilvl w:val="0"/>
+          <w:numId w:val="1"/>
+        </w:numPr>
+        <w:ind w:left="360"/>
+      </w:pPr>
+      <w:r>
+        <w:rPr>
+          <w:rtl w:val="0"/>
+        </w:rPr>
+        <w:t xml:space="preserve">{#snapshot_preceptor_experience}Preceptor Experience: {snapshot_preceptor_experience}{/snapshot_preceptor_experience}</w:t>
+      </w:r>
+    </w:p>
+    <w:p>
+      <w:pPr>
+        <w:numPr>
+          <w:ilvl w:val="0"/>
+          <w:numId w:val="1"/>
+        </w:numPr>
+        <w:ind w:left="360"/>
+      </w:pPr>
+      <w:r>
+        <w:rPr>
+          <w:rtl w:val="0"/>
+        </w:rPr>
+        <w:t xml:space="preserve">{#snapshot_float_experience}Float Experience: {snapshot_float_experience}{/snapshot_float_experience}</w:t>
+      </w:r>
+    </w:p>
+    <w:p>
+      <w:pPr>
+        <w:numPr>
+          <w:ilvl w:val="0"/>
+          <w:numId w:val="1"/>
+        </w:numPr>
+        <w:ind w:left="360"/>
+      </w:pPr>
+      <w:r>
+        <w:rPr>
+          <w:rtl w:val="0"/>
+        </w:rPr>
+        <w:t xml:space="preserve">{#snapshot_emr_systems}EMR Systems: {snapshot_emr_systems}{/snapshot_emr_systems}</w:t>
+      </w:r>
+    </w:p>
+    <w:p>
+      <w:pPr>
+        <w:numPr>
+          <w:ilvl w:val="0"/>
+          <w:numId w:val="1"/>
+        </w:numPr>
+        <w:ind w:left="360"/>
+      </w:pPr>
+      <w:r>
+        <w:rPr>
+          <w:rtl w:val="0"/>
+        </w:rPr>
+        <w:t xml:space="preserve">{#snapshot_patient_ratios_managed}Patient Ratios Managed: {snapshot_patient_ratios_managed}{/snapshot_patient_ratios_managed}</w:t>
+      </w:r>
+    </w:p>
+    <w:p>
+      <w:pPr>
+        <w:numPr>
+          <w:ilvl w:val="0"/>
+          <w:numId w:val="1"/>
+        </w:numPr>
+        <w:ind w:left="360"/>
+      </w:pPr>
+      <w:r>
+        <w:rPr>
+          <w:rtl w:val="0"/>
+        </w:rPr>
+        <w:t xml:space="preserve">{#snapshot_equipment_skills}Equipment/Skills: {snapshot_equipment_skills}{/snapshot_equipment_skills}</w:t>
       </w:r>
     </w:p>
     <w:p>

</xml_diff>

<commit_message>
Render Professional Snapshot from an included-lines loop only.
Avoid empty bullet gaps between Include selections by driving {#snapshot_lines} instead of fixed paragraphs.

Co-authored-by: Cursor <cursoragent@cursor.com>
</commit_message>
<xml_diff>
--- a/server/assets/template.docx
+++ b/server/assets/template.docx
@@ -57,6 +57,17 @@
           <w:rtl w:val="0"/>
         </w:rPr>
         <w:t xml:space="preserve">PROFESSIONAL SNAPSHOT</w:t>
+      </w:r>
+    </w:p>
+    <w:p>
+      <w:pPr>
+        <w:rPr/>
+      </w:pPr>
+      <w:r>
+        <w:rPr>
+          <w:rtl w:val="0"/>
+        </w:rPr>
+        <w:t xml:space="preserve">{#snapshot_lines}</w:t>
       </w:r>
     </w:p>
     <w:p>
@@ -71,172 +82,18 @@
         <w:rPr>
           <w:rtl w:val="0"/>
         </w:rPr>
-        <w:t xml:space="preserve">{#snapshot_specialty}Specialty: {snapshot_specialty}{/snapshot_specialty}</w:t>
-      </w:r>
-    </w:p>
-    <w:p>
-      <w:pPr>
-        <w:numPr>
-          <w:ilvl w:val="0"/>
-          <w:numId w:val="1"/>
-        </w:numPr>
-        <w:ind w:left="360"/>
-      </w:pPr>
-      <w:r>
-        <w:rPr>
-          <w:rtl w:val="0"/>
-        </w:rPr>
-        <w:t xml:space="preserve">{#snapshot_years_experience}Years of Experience: {snapshot_years_experience}{/snapshot_years_experience}</w:t>
-      </w:r>
-    </w:p>
-    <w:p>
-      <w:pPr>
-        <w:numPr>
-          <w:ilvl w:val="0"/>
-          <w:numId w:val="1"/>
-        </w:numPr>
-        <w:ind w:left="360"/>
-      </w:pPr>
-      <w:r>
-        <w:rPr>
-          <w:rtl w:val="0"/>
-        </w:rPr>
-        <w:t xml:space="preserve">{#snapshot_travel_experience}Travel Experience: {snapshot_travel_experience}{/snapshot_travel_experience}</w:t>
-      </w:r>
-    </w:p>
-    <w:p>
-      <w:pPr>
-        <w:numPr>
-          <w:ilvl w:val="0"/>
-          <w:numId w:val="1"/>
-        </w:numPr>
-        <w:ind w:left="360"/>
-      </w:pPr>
-      <w:r>
-        <w:rPr>
-          <w:rtl w:val="0"/>
-        </w:rPr>
-        <w:t xml:space="preserve">{#snapshot_trauma_experience}Trauma Experience: {snapshot_trauma_experience}{/snapshot_trauma_experience}</w:t>
-      </w:r>
-    </w:p>
-    <w:p>
-      <w:pPr>
-        <w:numPr>
-          <w:ilvl w:val="0"/>
-          <w:numId w:val="1"/>
-        </w:numPr>
-        <w:ind w:left="360"/>
-      </w:pPr>
-      <w:r>
-        <w:rPr>
-          <w:rtl w:val="0"/>
-        </w:rPr>
-        <w:t xml:space="preserve">{#snapshot_teaching_facility_experience}Teaching Facility Experience: {snapshot_teaching_facility_experience}{/snapshot_teaching_facility_experience}</w:t>
-      </w:r>
-    </w:p>
-    <w:p>
-      <w:pPr>
-        <w:numPr>
-          <w:ilvl w:val="0"/>
-          <w:numId w:val="1"/>
-        </w:numPr>
-        <w:ind w:left="360"/>
-      </w:pPr>
-      <w:r>
-        <w:rPr>
-          <w:rtl w:val="0"/>
-        </w:rPr>
-        <w:t xml:space="preserve">{#snapshot_magnet_facility_experience}Magnet Facility Experience: {snapshot_magnet_facility_experience}{/snapshot_magnet_facility_experience}</w:t>
-      </w:r>
-    </w:p>
-    <w:p>
-      <w:pPr>
-        <w:numPr>
-          <w:ilvl w:val="0"/>
-          <w:numId w:val="1"/>
-        </w:numPr>
-        <w:ind w:left="360"/>
-      </w:pPr>
-      <w:r>
-        <w:rPr>
-          <w:rtl w:val="0"/>
-        </w:rPr>
-        <w:t xml:space="preserve">{#snapshot_charge_nurse_experience}Charge Nurse Experience: {snapshot_charge_nurse_experience}{/snapshot_charge_nurse_experience}</w:t>
-      </w:r>
-    </w:p>
-    <w:p>
-      <w:pPr>
-        <w:numPr>
-          <w:ilvl w:val="0"/>
-          <w:numId w:val="1"/>
-        </w:numPr>
-        <w:ind w:left="360"/>
-      </w:pPr>
-      <w:r>
-        <w:rPr>
-          <w:rtl w:val="0"/>
-        </w:rPr>
-        <w:t xml:space="preserve">{#snapshot_preceptor_experience}Preceptor Experience: {snapshot_preceptor_experience}{/snapshot_preceptor_experience}</w:t>
-      </w:r>
-    </w:p>
-    <w:p>
-      <w:pPr>
-        <w:numPr>
-          <w:ilvl w:val="0"/>
-          <w:numId w:val="1"/>
-        </w:numPr>
-        <w:ind w:left="360"/>
-      </w:pPr>
-      <w:r>
-        <w:rPr>
-          <w:rtl w:val="0"/>
-        </w:rPr>
-        <w:t xml:space="preserve">{#snapshot_float_experience}Float Experience: {snapshot_float_experience}{/snapshot_float_experience}</w:t>
-      </w:r>
-    </w:p>
-    <w:p>
-      <w:pPr>
-        <w:numPr>
-          <w:ilvl w:val="0"/>
-          <w:numId w:val="1"/>
-        </w:numPr>
-        <w:ind w:left="360"/>
-      </w:pPr>
-      <w:r>
-        <w:rPr>
-          <w:rtl w:val="0"/>
-        </w:rPr>
-        <w:t xml:space="preserve">{#snapshot_emr_systems}EMR Systems: {snapshot_emr_systems}{/snapshot_emr_systems}</w:t>
-      </w:r>
-    </w:p>
-    <w:p>
-      <w:pPr>
-        <w:numPr>
-          <w:ilvl w:val="0"/>
-          <w:numId w:val="1"/>
-        </w:numPr>
-        <w:ind w:left="360"/>
-      </w:pPr>
-      <w:r>
-        <w:rPr>
-          <w:rtl w:val="0"/>
-        </w:rPr>
-        <w:t xml:space="preserve">{#snapshot_patient_ratios_managed}Patient Ratios Managed: {snapshot_patient_ratios_managed}{/snapshot_patient_ratios_managed}</w:t>
-      </w:r>
-    </w:p>
-    <w:p>
-      <w:pPr>
-        <w:numPr>
-          <w:ilvl w:val="0"/>
-          <w:numId w:val="1"/>
-        </w:numPr>
-        <w:ind w:left="360"/>
-      </w:pPr>
-      <w:r>
-        <w:rPr>
-          <w:rtl w:val="0"/>
-        </w:rPr>
-        <w:t xml:space="preserve">{#snapshot_equipment_skills}Equipment/Skills: {snapshot_equipment_skills}{/snapshot_equipment_skills}</w:t>
+        <w:t xml:space="preserve">{snapshot_line}</w:t>
+      </w:r>
+    </w:p>
+    <w:p>
+      <w:pPr>
+        <w:rPr/>
+      </w:pPr>
+      <w:r>
+        <w:rPr>
+          <w:rtl w:val="0"/>
+        </w:rPr>
+        <w:t xml:space="preserve">{/snapshot_lines}</w:t>
       </w:r>
     </w:p>
     <w:p>

</xml_diff>

<commit_message>
Use paragraph loops for licenses and certifications in the DOCX.
Prevent empty bullets when licenses are missing and give each license/cert its own list item.

Co-authored-by: Cursor <cursoragent@cursor.com>
</commit_message>
<xml_diff>
--- a/server/assets/template.docx
+++ b/server/assets/template.docx
@@ -119,17 +119,40 @@
     </w:p>
     <w:p>
       <w:pPr>
+        <w:rPr/>
+      </w:pPr>
+      <w:r>
+        <w:rPr>
+          <w:rtl w:val="0"/>
+        </w:rPr>
+        <w:t xml:space="preserve">{#licenses_list}</w:t>
+      </w:r>
+    </w:p>
+    <w:p>
+      <w:pPr>
         <w:numPr>
           <w:ilvl w:val="0"/>
           <w:numId w:val="1"/>
         </w:numPr>
         <w:ind w:left="360"/>
-      </w:pPr>
-      <w:r>
-        <w:rPr>
-          <w:rtl w:val="0"/>
-        </w:rPr>
-        <w:t xml:space="preserve">{#licenses_list}{rn_license_state_and_expiry}{/licenses_list}</w:t>
+        <w:rPr/>
+      </w:pPr>
+      <w:r>
+        <w:rPr>
+          <w:rtl w:val="0"/>
+        </w:rPr>
+        <w:t xml:space="preserve">{rn_license_state_and_expiry}</w:t>
+      </w:r>
+    </w:p>
+    <w:p>
+      <w:pPr>
+        <w:rPr/>
+      </w:pPr>
+      <w:r>
+        <w:rPr>
+          <w:rtl w:val="0"/>
+        </w:rPr>
+        <w:t xml:space="preserve">{/licenses_list}</w:t>
       </w:r>
     </w:p>
     <w:p>
@@ -150,6 +173,7 @@
           <w:numId w:val="1"/>
         </w:numPr>
         <w:ind w:left="360"/>
+        <w:rPr/>
       </w:pPr>
       <w:r>
         <w:rPr>
@@ -160,50 +184,13 @@
     </w:p>
     <w:p>
       <w:pPr>
-        <w:rPr>
-          <w:vertAlign w:val="baseline"/>
-        </w:rPr>
+        <w:rPr/>
       </w:pPr>
       <w:r>
         <w:rPr>
           <w:rtl w:val="0"/>
         </w:rPr>
         <w:t xml:space="preserve">{/certifications_list}</w:t>
-      </w:r>
-      <w:r>
-        <w:rPr>
-          <w:rtl w:val="0"/>
-        </w:rPr>
-      </w:r>
-    </w:p>
-    <w:p>
-      <w:pPr>
-        <w:rPr/>
-      </w:pPr>
-      <w:r>
-        <w:rPr>
-          <w:rtl w:val="0"/>
-        </w:rPr>
-      </w:r>
-    </w:p>
-    <w:p>
-      <w:pPr>
-        <w:rPr/>
-      </w:pPr>
-      <w:r>
-        <w:rPr>
-          <w:rtl w:val="0"/>
-        </w:rPr>
-      </w:r>
-    </w:p>
-    <w:p>
-      <w:pPr>
-        <w:rPr/>
-      </w:pPr>
-      <w:r>
-        <w:rPr>
-          <w:rtl w:val="0"/>
-        </w:rPr>
       </w:r>
     </w:p>
     <w:p>

</xml_diff>

<commit_message>
Apply Inter font and tighter resume spacing.
Co-authored-by: Cursor <cursoragent@cursor.com>
</commit_message>
<xml_diff>
--- a/server/assets/template.docx
+++ b/server/assets/template.docx
@@ -4,11 +4,52 @@
   <w:body>
     <w:p>
       <w:pPr>
-        <w:spacing w:line="240" w:lineRule="auto"/>
-        <w:rPr/>
-      </w:pPr>
-      <w:r>
-        <w:rPr>
+        <w:keepNext w:val="0"/>
+        <w:keepLines w:val="0"/>
+        <w:pageBreakBefore w:val="0"/>
+        <w:widowControl w:val="1"/>
+        <w:pBdr>
+          <w:top w:space="0" w:sz="0" w:val="nil"/>
+          <w:left w:space="0" w:sz="0" w:val="nil"/>
+          <w:bottom w:space="0" w:sz="0" w:val="nil"/>
+          <w:right w:space="0" w:sz="0" w:val="nil"/>
+          <w:between w:space="0" w:sz="0" w:val="nil"/>
+        </w:pBdr>
+        <w:shd w:fill="auto" w:val="clear"/>
+        <w:spacing w:after="60" w:before="0" w:line="240" w:lineRule="auto"/>
+        <w:ind w:left="0" w:right="0" w:firstLine="0"/>
+        <w:jc w:val="left"/>
+        <w:rPr>
+          <w:rFonts w:ascii="Inter" w:cs="Inter" w:eastAsia="Inter" w:hAnsi="Inter"/>
+          <w:b w:val="0"/>
+          <w:bCs w:val="0"/>
+          <w:i w:val="0"/>
+          <w:iCs w:val="0"/>
+          <w:smallCaps w:val="0"/>
+          <w:strike w:val="0"/>
+          <w:color w:val="000000"/>
+          <w:sz w:val="22"/>
+          <w:szCs w:val="22"/>
+          <w:u w:val="none"/>
+          <w:shd w:fill="auto" w:val="clear"/>
+          <w:vertAlign w:val="baseline"/>
+        </w:rPr>
+      </w:pPr>
+      <w:r>
+        <w:rPr>
+          <w:rFonts w:ascii="Inter" w:cs="Inter" w:eastAsia="Inter" w:hAnsi="Inter"/>
+          <w:b w:val="0"/>
+          <w:bCs w:val="0"/>
+          <w:i w:val="0"/>
+          <w:iCs w:val="0"/>
+          <w:smallCaps w:val="0"/>
+          <w:strike w:val="0"/>
+          <w:color w:val="000000"/>
+          <w:sz w:val="22"/>
+          <w:szCs w:val="22"/>
+          <w:u w:val="none"/>
+          <w:shd w:fill="auto" w:val="clear"/>
+          <w:vertAlign w:val="baseline"/>
           <w:rtl w:val="0"/>
         </w:rPr>
         <w:t xml:space="preserve">{candidate_first_name} {candidate_last_name}, RN</w:t>
@@ -16,11 +57,52 @@
     </w:p>
     <w:p>
       <w:pPr>
-        <w:spacing w:line="240" w:lineRule="auto"/>
-        <w:rPr/>
-      </w:pPr>
-      <w:r>
-        <w:rPr>
+        <w:keepNext w:val="0"/>
+        <w:keepLines w:val="0"/>
+        <w:pageBreakBefore w:val="0"/>
+        <w:widowControl w:val="1"/>
+        <w:pBdr>
+          <w:top w:space="0" w:sz="0" w:val="nil"/>
+          <w:left w:space="0" w:sz="0" w:val="nil"/>
+          <w:bottom w:space="0" w:sz="0" w:val="nil"/>
+          <w:right w:space="0" w:sz="0" w:val="nil"/>
+          <w:between w:space="0" w:sz="0" w:val="nil"/>
+        </w:pBdr>
+        <w:shd w:fill="auto" w:val="clear"/>
+        <w:spacing w:after="60" w:before="0" w:line="240" w:lineRule="auto"/>
+        <w:ind w:left="0" w:right="0" w:firstLine="0"/>
+        <w:jc w:val="left"/>
+        <w:rPr>
+          <w:rFonts w:ascii="Inter" w:cs="Inter" w:eastAsia="Inter" w:hAnsi="Inter"/>
+          <w:b w:val="0"/>
+          <w:bCs w:val="0"/>
+          <w:i w:val="0"/>
+          <w:iCs w:val="0"/>
+          <w:smallCaps w:val="0"/>
+          <w:strike w:val="0"/>
+          <w:color w:val="000000"/>
+          <w:sz w:val="22"/>
+          <w:szCs w:val="22"/>
+          <w:u w:val="none"/>
+          <w:shd w:fill="auto" w:val="clear"/>
+          <w:vertAlign w:val="baseline"/>
+        </w:rPr>
+      </w:pPr>
+      <w:r>
+        <w:rPr>
+          <w:rFonts w:ascii="Inter" w:cs="Inter" w:eastAsia="Inter" w:hAnsi="Inter"/>
+          <w:b w:val="0"/>
+          <w:bCs w:val="0"/>
+          <w:i w:val="0"/>
+          <w:iCs w:val="0"/>
+          <w:smallCaps w:val="0"/>
+          <w:strike w:val="0"/>
+          <w:color w:val="000000"/>
+          <w:sz w:val="22"/>
+          <w:szCs w:val="22"/>
+          <w:u w:val="none"/>
+          <w:shd w:fill="auto" w:val="clear"/>
+          <w:vertAlign w:val="baseline"/>
           <w:rtl w:val="0"/>
         </w:rPr>
         <w:t xml:space="preserve">{candidate_phone} | {candidate_email}</w:t>
@@ -28,11 +110,52 @@
     </w:p>
     <w:p>
       <w:pPr>
-        <w:spacing w:line="240" w:lineRule="auto"/>
-        <w:rPr/>
-      </w:pPr>
-      <w:r>
-        <w:rPr>
+        <w:keepNext w:val="0"/>
+        <w:keepLines w:val="0"/>
+        <w:pageBreakBefore w:val="0"/>
+        <w:widowControl w:val="1"/>
+        <w:pBdr>
+          <w:top w:space="0" w:sz="0" w:val="nil"/>
+          <w:left w:space="0" w:sz="0" w:val="nil"/>
+          <w:bottom w:space="0" w:sz="0" w:val="nil"/>
+          <w:right w:space="0" w:sz="0" w:val="nil"/>
+          <w:between w:space="0" w:sz="0" w:val="nil"/>
+        </w:pBdr>
+        <w:shd w:fill="auto" w:val="clear"/>
+        <w:spacing w:after="60" w:before="0" w:line="240" w:lineRule="auto"/>
+        <w:ind w:left="0" w:right="0" w:firstLine="0"/>
+        <w:jc w:val="left"/>
+        <w:rPr>
+          <w:rFonts w:ascii="Inter" w:cs="Inter" w:eastAsia="Inter" w:hAnsi="Inter"/>
+          <w:b w:val="0"/>
+          <w:bCs w:val="0"/>
+          <w:i w:val="0"/>
+          <w:iCs w:val="0"/>
+          <w:smallCaps w:val="0"/>
+          <w:strike w:val="0"/>
+          <w:color w:val="000000"/>
+          <w:sz w:val="22"/>
+          <w:szCs w:val="22"/>
+          <w:u w:val="none"/>
+          <w:shd w:fill="auto" w:val="clear"/>
+          <w:vertAlign w:val="baseline"/>
+        </w:rPr>
+      </w:pPr>
+      <w:r>
+        <w:rPr>
+          <w:rFonts w:ascii="Inter" w:cs="Inter" w:eastAsia="Inter" w:hAnsi="Inter"/>
+          <w:b w:val="0"/>
+          <w:bCs w:val="0"/>
+          <w:i w:val="0"/>
+          <w:iCs w:val="0"/>
+          <w:smallCaps w:val="0"/>
+          <w:strike w:val="0"/>
+          <w:color w:val="000000"/>
+          <w:sz w:val="22"/>
+          <w:szCs w:val="22"/>
+          <w:u w:val="none"/>
+          <w:shd w:fill="auto" w:val="clear"/>
+          <w:vertAlign w:val="baseline"/>
           <w:rtl w:val="0"/>
         </w:rPr>
         <w:t xml:space="preserve">{candidate_home_address}, {candidate_city}, {candidate_state}</w:t>
@@ -40,20 +163,91 @@
     </w:p>
     <w:p>
       <w:pPr>
-        <w:rPr/>
-      </w:pPr>
-      <w:r>
-        <w:rPr>
-          <w:rtl w:val="0"/>
-        </w:rPr>
-      </w:r>
-    </w:p>
-    <w:p>
-      <w:pPr>
-        <w:rPr/>
-      </w:pPr>
-      <w:r>
-        <w:rPr>
+        <w:keepNext w:val="0"/>
+        <w:keepLines w:val="0"/>
+        <w:pageBreakBefore w:val="0"/>
+        <w:widowControl w:val="1"/>
+        <w:pBdr>
+          <w:top w:space="0" w:sz="0" w:val="nil"/>
+          <w:left w:space="0" w:sz="0" w:val="nil"/>
+          <w:bottom w:space="0" w:sz="0" w:val="nil"/>
+          <w:right w:space="0" w:sz="0" w:val="nil"/>
+          <w:between w:space="0" w:sz="0" w:val="nil"/>
+        </w:pBdr>
+        <w:shd w:fill="auto" w:val="clear"/>
+        <w:spacing w:after="60" w:before="0" w:line="240" w:lineRule="auto"/>
+        <w:ind w:left="0" w:right="0" w:firstLine="0"/>
+        <w:jc w:val="left"/>
+        <w:rPr>
+          <w:rFonts w:ascii="Inter" w:cs="Inter" w:eastAsia="Inter" w:hAnsi="Inter"/>
+          <w:b w:val="0"/>
+          <w:bCs w:val="0"/>
+          <w:i w:val="0"/>
+          <w:iCs w:val="0"/>
+          <w:smallCaps w:val="0"/>
+          <w:strike w:val="0"/>
+          <w:color w:val="000000"/>
+          <w:sz w:val="22"/>
+          <w:szCs w:val="22"/>
+          <w:u w:val="none"/>
+          <w:shd w:fill="auto" w:val="clear"/>
+          <w:vertAlign w:val="baseline"/>
+        </w:rPr>
+      </w:pPr>
+      <w:r>
+        <w:rPr>
+          <w:rtl w:val="0"/>
+        </w:rPr>
+      </w:r>
+    </w:p>
+    <w:p>
+      <w:pPr>
+        <w:keepNext w:val="0"/>
+        <w:keepLines w:val="0"/>
+        <w:pageBreakBefore w:val="0"/>
+        <w:widowControl w:val="1"/>
+        <w:pBdr>
+          <w:top w:space="0" w:sz="0" w:val="nil"/>
+          <w:left w:space="0" w:sz="0" w:val="nil"/>
+          <w:bottom w:space="0" w:sz="0" w:val="nil"/>
+          <w:right w:space="0" w:sz="0" w:val="nil"/>
+          <w:between w:space="0" w:sz="0" w:val="nil"/>
+        </w:pBdr>
+        <w:shd w:fill="auto" w:val="clear"/>
+        <w:spacing w:after="60" w:before="0" w:line="240" w:lineRule="auto"/>
+        <w:ind w:left="0" w:right="0" w:firstLine="0"/>
+        <w:jc w:val="left"/>
+        <w:rPr>
+          <w:rFonts w:ascii="Inter" w:cs="Inter" w:eastAsia="Inter" w:hAnsi="Inter"/>
+          <w:b w:val="0"/>
+          <w:bCs w:val="0"/>
+          <w:i w:val="0"/>
+          <w:iCs w:val="0"/>
+          <w:smallCaps w:val="0"/>
+          <w:strike w:val="0"/>
+          <w:color w:val="000000"/>
+          <w:sz w:val="22"/>
+          <w:szCs w:val="22"/>
+          <w:u w:val="none"/>
+          <w:shd w:fill="auto" w:val="clear"/>
+          <w:vertAlign w:val="baseline"/>
+        </w:rPr>
+      </w:pPr>
+      <w:r>
+        <w:rPr>
+          <w:rFonts w:ascii="Inter" w:cs="Inter" w:eastAsia="Inter" w:hAnsi="Inter"/>
+          <w:b w:val="0"/>
+          <w:bCs w:val="0"/>
+          <w:i w:val="0"/>
+          <w:iCs w:val="0"/>
+          <w:smallCaps w:val="0"/>
+          <w:strike w:val="0"/>
+          <w:color w:val="000000"/>
+          <w:sz w:val="22"/>
+          <w:szCs w:val="22"/>
+          <w:u w:val="none"/>
+          <w:shd w:fill="auto" w:val="clear"/>
+          <w:vertAlign w:val="baseline"/>
           <w:rtl w:val="0"/>
         </w:rPr>
         <w:t xml:space="preserve">PROFESSIONAL SNAPSHOT</w:t>
@@ -61,10 +255,52 @@
     </w:p>
     <w:p>
       <w:pPr>
-        <w:rPr/>
-      </w:pPr>
-      <w:r>
-        <w:rPr>
+        <w:keepNext w:val="0"/>
+        <w:keepLines w:val="0"/>
+        <w:pageBreakBefore w:val="0"/>
+        <w:widowControl w:val="1"/>
+        <w:pBdr>
+          <w:top w:space="0" w:sz="0" w:val="nil"/>
+          <w:left w:space="0" w:sz="0" w:val="nil"/>
+          <w:bottom w:space="0" w:sz="0" w:val="nil"/>
+          <w:right w:space="0" w:sz="0" w:val="nil"/>
+          <w:between w:space="0" w:sz="0" w:val="nil"/>
+        </w:pBdr>
+        <w:shd w:fill="auto" w:val="clear"/>
+        <w:spacing w:after="60" w:before="0" w:line="240" w:lineRule="auto"/>
+        <w:ind w:left="0" w:right="0" w:firstLine="0"/>
+        <w:jc w:val="left"/>
+        <w:rPr>
+          <w:rFonts w:ascii="Inter" w:cs="Inter" w:eastAsia="Inter" w:hAnsi="Inter"/>
+          <w:b w:val="0"/>
+          <w:bCs w:val="0"/>
+          <w:i w:val="0"/>
+          <w:iCs w:val="0"/>
+          <w:smallCaps w:val="0"/>
+          <w:strike w:val="0"/>
+          <w:color w:val="000000"/>
+          <w:sz w:val="22"/>
+          <w:szCs w:val="22"/>
+          <w:u w:val="none"/>
+          <w:shd w:fill="auto" w:val="clear"/>
+          <w:vertAlign w:val="baseline"/>
+        </w:rPr>
+      </w:pPr>
+      <w:r>
+        <w:rPr>
+          <w:rFonts w:ascii="Inter" w:cs="Inter" w:eastAsia="Inter" w:hAnsi="Inter"/>
+          <w:b w:val="0"/>
+          <w:bCs w:val="0"/>
+          <w:i w:val="0"/>
+          <w:iCs w:val="0"/>
+          <w:smallCaps w:val="0"/>
+          <w:strike w:val="0"/>
+          <w:color w:val="000000"/>
+          <w:sz w:val="22"/>
+          <w:szCs w:val="22"/>
+          <w:u w:val="none"/>
+          <w:shd w:fill="auto" w:val="clear"/>
+          <w:vertAlign w:val="baseline"/>
           <w:rtl w:val="0"/>
         </w:rPr>
         <w:t xml:space="preserve">{#snapshot_lines}</w:t>
@@ -72,14 +308,45 @@
     </w:p>
     <w:p>
       <w:pPr>
+        <w:keepNext w:val="0"/>
+        <w:keepLines w:val="0"/>
+        <w:pageBreakBefore w:val="0"/>
+        <w:widowControl w:val="1"/>
         <w:numPr>
           <w:ilvl w:val="0"/>
           <w:numId w:val="1"/>
         </w:numPr>
-        <w:ind w:left="360"/>
-      </w:pPr>
-      <w:r>
-        <w:rPr>
+        <w:pBdr>
+          <w:top w:space="0" w:sz="0" w:val="nil"/>
+          <w:left w:space="0" w:sz="0" w:val="nil"/>
+          <w:bottom w:space="0" w:sz="0" w:val="nil"/>
+          <w:right w:space="0" w:sz="0" w:val="nil"/>
+          <w:between w:space="0" w:sz="0" w:val="nil"/>
+        </w:pBdr>
+        <w:shd w:fill="auto" w:val="clear"/>
+        <w:spacing w:after="60" w:before="0" w:line="240" w:lineRule="auto"/>
+        <w:ind w:left="360" w:right="0" w:hanging="360"/>
+        <w:jc w:val="left"/>
+        <w:rPr>
+          <w:color w:val="000000"/>
+          <w:u w:val="none"/>
+        </w:rPr>
+      </w:pPr>
+      <w:r>
+        <w:rPr>
+          <w:rFonts w:ascii="Inter" w:cs="Inter" w:eastAsia="Inter" w:hAnsi="Inter"/>
+          <w:b w:val="0"/>
+          <w:bCs w:val="0"/>
+          <w:i w:val="0"/>
+          <w:iCs w:val="0"/>
+          <w:smallCaps w:val="0"/>
+          <w:strike w:val="0"/>
+          <w:color w:val="000000"/>
+          <w:sz w:val="22"/>
+          <w:szCs w:val="22"/>
+          <w:u w:val="none"/>
+          <w:shd w:fill="auto" w:val="clear"/>
+          <w:vertAlign w:val="baseline"/>
           <w:rtl w:val="0"/>
         </w:rPr>
         <w:t xml:space="preserve">{snapshot_line}</w:t>
@@ -87,10 +354,52 @@
     </w:p>
     <w:p>
       <w:pPr>
-        <w:rPr/>
-      </w:pPr>
-      <w:r>
-        <w:rPr>
+        <w:keepNext w:val="0"/>
+        <w:keepLines w:val="0"/>
+        <w:pageBreakBefore w:val="0"/>
+        <w:widowControl w:val="1"/>
+        <w:pBdr>
+          <w:top w:space="0" w:sz="0" w:val="nil"/>
+          <w:left w:space="0" w:sz="0" w:val="nil"/>
+          <w:bottom w:space="0" w:sz="0" w:val="nil"/>
+          <w:right w:space="0" w:sz="0" w:val="nil"/>
+          <w:between w:space="0" w:sz="0" w:val="nil"/>
+        </w:pBdr>
+        <w:shd w:fill="auto" w:val="clear"/>
+        <w:spacing w:after="60" w:before="0" w:line="240" w:lineRule="auto"/>
+        <w:ind w:left="0" w:right="0" w:firstLine="0"/>
+        <w:jc w:val="left"/>
+        <w:rPr>
+          <w:rFonts w:ascii="Inter" w:cs="Inter" w:eastAsia="Inter" w:hAnsi="Inter"/>
+          <w:b w:val="0"/>
+          <w:bCs w:val="0"/>
+          <w:i w:val="0"/>
+          <w:iCs w:val="0"/>
+          <w:smallCaps w:val="0"/>
+          <w:strike w:val="0"/>
+          <w:color w:val="000000"/>
+          <w:sz w:val="22"/>
+          <w:szCs w:val="22"/>
+          <w:u w:val="none"/>
+          <w:shd w:fill="auto" w:val="clear"/>
+          <w:vertAlign w:val="baseline"/>
+        </w:rPr>
+      </w:pPr>
+      <w:r>
+        <w:rPr>
+          <w:rFonts w:ascii="Inter" w:cs="Inter" w:eastAsia="Inter" w:hAnsi="Inter"/>
+          <w:b w:val="0"/>
+          <w:bCs w:val="0"/>
+          <w:i w:val="0"/>
+          <w:iCs w:val="0"/>
+          <w:smallCaps w:val="0"/>
+          <w:strike w:val="0"/>
+          <w:color w:val="000000"/>
+          <w:sz w:val="22"/>
+          <w:szCs w:val="22"/>
+          <w:u w:val="none"/>
+          <w:shd w:fill="auto" w:val="clear"/>
+          <w:vertAlign w:val="baseline"/>
           <w:rtl w:val="0"/>
         </w:rPr>
         <w:t xml:space="preserve">{/snapshot_lines}</w:t>
@@ -98,20 +407,91 @@
     </w:p>
     <w:p>
       <w:pPr>
-        <w:rPr/>
-      </w:pPr>
-      <w:r>
-        <w:rPr>
-          <w:rtl w:val="0"/>
-        </w:rPr>
-      </w:r>
-    </w:p>
-    <w:p>
-      <w:pPr>
-        <w:rPr/>
-      </w:pPr>
-      <w:r>
-        <w:rPr>
+        <w:keepNext w:val="0"/>
+        <w:keepLines w:val="0"/>
+        <w:pageBreakBefore w:val="0"/>
+        <w:widowControl w:val="1"/>
+        <w:pBdr>
+          <w:top w:space="0" w:sz="0" w:val="nil"/>
+          <w:left w:space="0" w:sz="0" w:val="nil"/>
+          <w:bottom w:space="0" w:sz="0" w:val="nil"/>
+          <w:right w:space="0" w:sz="0" w:val="nil"/>
+          <w:between w:space="0" w:sz="0" w:val="nil"/>
+        </w:pBdr>
+        <w:shd w:fill="auto" w:val="clear"/>
+        <w:spacing w:after="60" w:before="0" w:line="240" w:lineRule="auto"/>
+        <w:ind w:left="0" w:right="0" w:firstLine="0"/>
+        <w:jc w:val="left"/>
+        <w:rPr>
+          <w:rFonts w:ascii="Inter" w:cs="Inter" w:eastAsia="Inter" w:hAnsi="Inter"/>
+          <w:b w:val="0"/>
+          <w:bCs w:val="0"/>
+          <w:i w:val="0"/>
+          <w:iCs w:val="0"/>
+          <w:smallCaps w:val="0"/>
+          <w:strike w:val="0"/>
+          <w:color w:val="000000"/>
+          <w:sz w:val="22"/>
+          <w:szCs w:val="22"/>
+          <w:u w:val="none"/>
+          <w:shd w:fill="auto" w:val="clear"/>
+          <w:vertAlign w:val="baseline"/>
+        </w:rPr>
+      </w:pPr>
+      <w:r>
+        <w:rPr>
+          <w:rtl w:val="0"/>
+        </w:rPr>
+      </w:r>
+    </w:p>
+    <w:p>
+      <w:pPr>
+        <w:keepNext w:val="0"/>
+        <w:keepLines w:val="0"/>
+        <w:pageBreakBefore w:val="0"/>
+        <w:widowControl w:val="1"/>
+        <w:pBdr>
+          <w:top w:space="0" w:sz="0" w:val="nil"/>
+          <w:left w:space="0" w:sz="0" w:val="nil"/>
+          <w:bottom w:space="0" w:sz="0" w:val="nil"/>
+          <w:right w:space="0" w:sz="0" w:val="nil"/>
+          <w:between w:space="0" w:sz="0" w:val="nil"/>
+        </w:pBdr>
+        <w:shd w:fill="auto" w:val="clear"/>
+        <w:spacing w:after="60" w:before="0" w:line="240" w:lineRule="auto"/>
+        <w:ind w:left="0" w:right="0" w:firstLine="0"/>
+        <w:jc w:val="left"/>
+        <w:rPr>
+          <w:rFonts w:ascii="Inter" w:cs="Inter" w:eastAsia="Inter" w:hAnsi="Inter"/>
+          <w:b w:val="0"/>
+          <w:bCs w:val="0"/>
+          <w:i w:val="0"/>
+          <w:iCs w:val="0"/>
+          <w:smallCaps w:val="0"/>
+          <w:strike w:val="0"/>
+          <w:color w:val="000000"/>
+          <w:sz w:val="22"/>
+          <w:szCs w:val="22"/>
+          <w:u w:val="none"/>
+          <w:shd w:fill="auto" w:val="clear"/>
+          <w:vertAlign w:val="baseline"/>
+        </w:rPr>
+      </w:pPr>
+      <w:r>
+        <w:rPr>
+          <w:rFonts w:ascii="Inter" w:cs="Inter" w:eastAsia="Inter" w:hAnsi="Inter"/>
+          <w:b w:val="0"/>
+          <w:bCs w:val="0"/>
+          <w:i w:val="0"/>
+          <w:iCs w:val="0"/>
+          <w:smallCaps w:val="0"/>
+          <w:strike w:val="0"/>
+          <w:color w:val="000000"/>
+          <w:sz w:val="22"/>
+          <w:szCs w:val="22"/>
+          <w:u w:val="none"/>
+          <w:shd w:fill="auto" w:val="clear"/>
+          <w:vertAlign w:val="baseline"/>
           <w:rtl w:val="0"/>
         </w:rPr>
         <w:t xml:space="preserve">LICENSES &amp; CERTIFICATIONS</w:t>
@@ -119,10 +499,52 @@
     </w:p>
     <w:p>
       <w:pPr>
-        <w:rPr/>
-      </w:pPr>
-      <w:r>
-        <w:rPr>
+        <w:keepNext w:val="0"/>
+        <w:keepLines w:val="0"/>
+        <w:pageBreakBefore w:val="0"/>
+        <w:widowControl w:val="1"/>
+        <w:pBdr>
+          <w:top w:space="0" w:sz="0" w:val="nil"/>
+          <w:left w:space="0" w:sz="0" w:val="nil"/>
+          <w:bottom w:space="0" w:sz="0" w:val="nil"/>
+          <w:right w:space="0" w:sz="0" w:val="nil"/>
+          <w:between w:space="0" w:sz="0" w:val="nil"/>
+        </w:pBdr>
+        <w:shd w:fill="auto" w:val="clear"/>
+        <w:spacing w:after="60" w:before="0" w:line="240" w:lineRule="auto"/>
+        <w:ind w:left="0" w:right="0" w:firstLine="0"/>
+        <w:jc w:val="left"/>
+        <w:rPr>
+          <w:rFonts w:ascii="Inter" w:cs="Inter" w:eastAsia="Inter" w:hAnsi="Inter"/>
+          <w:b w:val="0"/>
+          <w:bCs w:val="0"/>
+          <w:i w:val="0"/>
+          <w:iCs w:val="0"/>
+          <w:smallCaps w:val="0"/>
+          <w:strike w:val="0"/>
+          <w:color w:val="000000"/>
+          <w:sz w:val="22"/>
+          <w:szCs w:val="22"/>
+          <w:u w:val="none"/>
+          <w:shd w:fill="auto" w:val="clear"/>
+          <w:vertAlign w:val="baseline"/>
+        </w:rPr>
+      </w:pPr>
+      <w:r>
+        <w:rPr>
+          <w:rFonts w:ascii="Inter" w:cs="Inter" w:eastAsia="Inter" w:hAnsi="Inter"/>
+          <w:b w:val="0"/>
+          <w:bCs w:val="0"/>
+          <w:i w:val="0"/>
+          <w:iCs w:val="0"/>
+          <w:smallCaps w:val="0"/>
+          <w:strike w:val="0"/>
+          <w:color w:val="000000"/>
+          <w:sz w:val="22"/>
+          <w:szCs w:val="22"/>
+          <w:u w:val="none"/>
+          <w:shd w:fill="auto" w:val="clear"/>
+          <w:vertAlign w:val="baseline"/>
           <w:rtl w:val="0"/>
         </w:rPr>
         <w:t xml:space="preserve">{#licenses_list}</w:t>
@@ -130,15 +552,45 @@
     </w:p>
     <w:p>
       <w:pPr>
+        <w:keepNext w:val="0"/>
+        <w:keepLines w:val="0"/>
+        <w:pageBreakBefore w:val="0"/>
+        <w:widowControl w:val="1"/>
         <w:numPr>
           <w:ilvl w:val="0"/>
           <w:numId w:val="1"/>
         </w:numPr>
-        <w:ind w:left="360"/>
-        <w:rPr/>
-      </w:pPr>
-      <w:r>
-        <w:rPr>
+        <w:pBdr>
+          <w:top w:space="0" w:sz="0" w:val="nil"/>
+          <w:left w:space="0" w:sz="0" w:val="nil"/>
+          <w:bottom w:space="0" w:sz="0" w:val="nil"/>
+          <w:right w:space="0" w:sz="0" w:val="nil"/>
+          <w:between w:space="0" w:sz="0" w:val="nil"/>
+        </w:pBdr>
+        <w:shd w:fill="auto" w:val="clear"/>
+        <w:spacing w:after="60" w:before="0" w:line="240" w:lineRule="auto"/>
+        <w:ind w:left="360" w:right="0" w:hanging="360"/>
+        <w:jc w:val="left"/>
+        <w:rPr>
+          <w:color w:val="000000"/>
+          <w:u w:val="none"/>
+        </w:rPr>
+      </w:pPr>
+      <w:r>
+        <w:rPr>
+          <w:rFonts w:ascii="Inter" w:cs="Inter" w:eastAsia="Inter" w:hAnsi="Inter"/>
+          <w:b w:val="0"/>
+          <w:bCs w:val="0"/>
+          <w:i w:val="0"/>
+          <w:iCs w:val="0"/>
+          <w:smallCaps w:val="0"/>
+          <w:strike w:val="0"/>
+          <w:color w:val="000000"/>
+          <w:sz w:val="22"/>
+          <w:szCs w:val="22"/>
+          <w:u w:val="none"/>
+          <w:shd w:fill="auto" w:val="clear"/>
+          <w:vertAlign w:val="baseline"/>
           <w:rtl w:val="0"/>
         </w:rPr>
         <w:t xml:space="preserve">{rn_license_state_and_expiry}</w:t>
@@ -146,10 +598,52 @@
     </w:p>
     <w:p>
       <w:pPr>
-        <w:rPr/>
-      </w:pPr>
-      <w:r>
-        <w:rPr>
+        <w:keepNext w:val="0"/>
+        <w:keepLines w:val="0"/>
+        <w:pageBreakBefore w:val="0"/>
+        <w:widowControl w:val="1"/>
+        <w:pBdr>
+          <w:top w:space="0" w:sz="0" w:val="nil"/>
+          <w:left w:space="0" w:sz="0" w:val="nil"/>
+          <w:bottom w:space="0" w:sz="0" w:val="nil"/>
+          <w:right w:space="0" w:sz="0" w:val="nil"/>
+          <w:between w:space="0" w:sz="0" w:val="nil"/>
+        </w:pBdr>
+        <w:shd w:fill="auto" w:val="clear"/>
+        <w:spacing w:after="60" w:before="0" w:line="240" w:lineRule="auto"/>
+        <w:ind w:left="0" w:right="0" w:firstLine="0"/>
+        <w:jc w:val="left"/>
+        <w:rPr>
+          <w:rFonts w:ascii="Inter" w:cs="Inter" w:eastAsia="Inter" w:hAnsi="Inter"/>
+          <w:b w:val="0"/>
+          <w:bCs w:val="0"/>
+          <w:i w:val="0"/>
+          <w:iCs w:val="0"/>
+          <w:smallCaps w:val="0"/>
+          <w:strike w:val="0"/>
+          <w:color w:val="000000"/>
+          <w:sz w:val="22"/>
+          <w:szCs w:val="22"/>
+          <w:u w:val="none"/>
+          <w:shd w:fill="auto" w:val="clear"/>
+          <w:vertAlign w:val="baseline"/>
+        </w:rPr>
+      </w:pPr>
+      <w:r>
+        <w:rPr>
+          <w:rFonts w:ascii="Inter" w:cs="Inter" w:eastAsia="Inter" w:hAnsi="Inter"/>
+          <w:b w:val="0"/>
+          <w:bCs w:val="0"/>
+          <w:i w:val="0"/>
+          <w:iCs w:val="0"/>
+          <w:smallCaps w:val="0"/>
+          <w:strike w:val="0"/>
+          <w:color w:val="000000"/>
+          <w:sz w:val="22"/>
+          <w:szCs w:val="22"/>
+          <w:u w:val="none"/>
+          <w:shd w:fill="auto" w:val="clear"/>
+          <w:vertAlign w:val="baseline"/>
           <w:rtl w:val="0"/>
         </w:rPr>
         <w:t xml:space="preserve">{/licenses_list}</w:t>
@@ -157,10 +651,52 @@
     </w:p>
     <w:p>
       <w:pPr>
-        <w:rPr/>
-      </w:pPr>
-      <w:r>
-        <w:rPr>
+        <w:keepNext w:val="0"/>
+        <w:keepLines w:val="0"/>
+        <w:pageBreakBefore w:val="0"/>
+        <w:widowControl w:val="1"/>
+        <w:pBdr>
+          <w:top w:space="0" w:sz="0" w:val="nil"/>
+          <w:left w:space="0" w:sz="0" w:val="nil"/>
+          <w:bottom w:space="0" w:sz="0" w:val="nil"/>
+          <w:right w:space="0" w:sz="0" w:val="nil"/>
+          <w:between w:space="0" w:sz="0" w:val="nil"/>
+        </w:pBdr>
+        <w:shd w:fill="auto" w:val="clear"/>
+        <w:spacing w:after="60" w:before="0" w:line="240" w:lineRule="auto"/>
+        <w:ind w:left="0" w:right="0" w:firstLine="0"/>
+        <w:jc w:val="left"/>
+        <w:rPr>
+          <w:rFonts w:ascii="Inter" w:cs="Inter" w:eastAsia="Inter" w:hAnsi="Inter"/>
+          <w:b w:val="0"/>
+          <w:bCs w:val="0"/>
+          <w:i w:val="0"/>
+          <w:iCs w:val="0"/>
+          <w:smallCaps w:val="0"/>
+          <w:strike w:val="0"/>
+          <w:color w:val="000000"/>
+          <w:sz w:val="22"/>
+          <w:szCs w:val="22"/>
+          <w:u w:val="none"/>
+          <w:shd w:fill="auto" w:val="clear"/>
+          <w:vertAlign w:val="baseline"/>
+        </w:rPr>
+      </w:pPr>
+      <w:r>
+        <w:rPr>
+          <w:rFonts w:ascii="Inter" w:cs="Inter" w:eastAsia="Inter" w:hAnsi="Inter"/>
+          <w:b w:val="0"/>
+          <w:bCs w:val="0"/>
+          <w:i w:val="0"/>
+          <w:iCs w:val="0"/>
+          <w:smallCaps w:val="0"/>
+          <w:strike w:val="0"/>
+          <w:color w:val="000000"/>
+          <w:sz w:val="22"/>
+          <w:szCs w:val="22"/>
+          <w:u w:val="none"/>
+          <w:shd w:fill="auto" w:val="clear"/>
+          <w:vertAlign w:val="baseline"/>
           <w:rtl w:val="0"/>
         </w:rPr>
         <w:t xml:space="preserve">{#certifications_list}</w:t>
@@ -168,15 +704,45 @@
     </w:p>
     <w:p>
       <w:pPr>
+        <w:keepNext w:val="0"/>
+        <w:keepLines w:val="0"/>
+        <w:pageBreakBefore w:val="0"/>
+        <w:widowControl w:val="1"/>
         <w:numPr>
           <w:ilvl w:val="0"/>
           <w:numId w:val="1"/>
         </w:numPr>
-        <w:ind w:left="360"/>
-        <w:rPr/>
-      </w:pPr>
-      <w:r>
-        <w:rPr>
+        <w:pBdr>
+          <w:top w:space="0" w:sz="0" w:val="nil"/>
+          <w:left w:space="0" w:sz="0" w:val="nil"/>
+          <w:bottom w:space="0" w:sz="0" w:val="nil"/>
+          <w:right w:space="0" w:sz="0" w:val="nil"/>
+          <w:between w:space="0" w:sz="0" w:val="nil"/>
+        </w:pBdr>
+        <w:shd w:fill="auto" w:val="clear"/>
+        <w:spacing w:after="60" w:before="0" w:line="240" w:lineRule="auto"/>
+        <w:ind w:left="360" w:right="0" w:hanging="360"/>
+        <w:jc w:val="left"/>
+        <w:rPr>
+          <w:color w:val="000000"/>
+          <w:u w:val="none"/>
+        </w:rPr>
+      </w:pPr>
+      <w:r>
+        <w:rPr>
+          <w:rFonts w:ascii="Inter" w:cs="Inter" w:eastAsia="Inter" w:hAnsi="Inter"/>
+          <w:b w:val="0"/>
+          <w:bCs w:val="0"/>
+          <w:i w:val="0"/>
+          <w:iCs w:val="0"/>
+          <w:smallCaps w:val="0"/>
+          <w:strike w:val="0"/>
+          <w:color w:val="000000"/>
+          <w:sz w:val="22"/>
+          <w:szCs w:val="22"/>
+          <w:u w:val="none"/>
+          <w:shd w:fill="auto" w:val="clear"/>
+          <w:vertAlign w:val="baseline"/>
           <w:rtl w:val="0"/>
         </w:rPr>
         <w:t xml:space="preserve">{certification_name} | {certification_expiration_date}</w:t>
@@ -184,10 +750,52 @@
     </w:p>
     <w:p>
       <w:pPr>
-        <w:rPr/>
-      </w:pPr>
-      <w:r>
-        <w:rPr>
+        <w:keepNext w:val="0"/>
+        <w:keepLines w:val="0"/>
+        <w:pageBreakBefore w:val="0"/>
+        <w:widowControl w:val="1"/>
+        <w:pBdr>
+          <w:top w:space="0" w:sz="0" w:val="nil"/>
+          <w:left w:space="0" w:sz="0" w:val="nil"/>
+          <w:bottom w:space="0" w:sz="0" w:val="nil"/>
+          <w:right w:space="0" w:sz="0" w:val="nil"/>
+          <w:between w:space="0" w:sz="0" w:val="nil"/>
+        </w:pBdr>
+        <w:shd w:fill="auto" w:val="clear"/>
+        <w:spacing w:after="60" w:before="0" w:line="240" w:lineRule="auto"/>
+        <w:ind w:left="0" w:right="0" w:firstLine="0"/>
+        <w:jc w:val="left"/>
+        <w:rPr>
+          <w:rFonts w:ascii="Inter" w:cs="Inter" w:eastAsia="Inter" w:hAnsi="Inter"/>
+          <w:b w:val="0"/>
+          <w:bCs w:val="0"/>
+          <w:i w:val="0"/>
+          <w:iCs w:val="0"/>
+          <w:smallCaps w:val="0"/>
+          <w:strike w:val="0"/>
+          <w:color w:val="000000"/>
+          <w:sz w:val="22"/>
+          <w:szCs w:val="22"/>
+          <w:u w:val="none"/>
+          <w:shd w:fill="auto" w:val="clear"/>
+          <w:vertAlign w:val="baseline"/>
+        </w:rPr>
+      </w:pPr>
+      <w:r>
+        <w:rPr>
+          <w:rFonts w:ascii="Inter" w:cs="Inter" w:eastAsia="Inter" w:hAnsi="Inter"/>
+          <w:b w:val="0"/>
+          <w:bCs w:val="0"/>
+          <w:i w:val="0"/>
+          <w:iCs w:val="0"/>
+          <w:smallCaps w:val="0"/>
+          <w:strike w:val="0"/>
+          <w:color w:val="000000"/>
+          <w:sz w:val="22"/>
+          <w:szCs w:val="22"/>
+          <w:u w:val="none"/>
+          <w:shd w:fill="auto" w:val="clear"/>
+          <w:vertAlign w:val="baseline"/>
           <w:rtl w:val="0"/>
         </w:rPr>
         <w:t xml:space="preserve">{/certifications_list}</w:t>
@@ -195,10 +803,91 @@
     </w:p>
     <w:p>
       <w:pPr>
-        <w:rPr/>
-      </w:pPr>
-      <w:r>
-        <w:rPr>
+        <w:keepNext w:val="0"/>
+        <w:keepLines w:val="0"/>
+        <w:pageBreakBefore w:val="0"/>
+        <w:widowControl w:val="1"/>
+        <w:pBdr>
+          <w:top w:space="0" w:sz="0" w:val="nil"/>
+          <w:left w:space="0" w:sz="0" w:val="nil"/>
+          <w:bottom w:space="0" w:sz="0" w:val="nil"/>
+          <w:right w:space="0" w:sz="0" w:val="nil"/>
+          <w:between w:space="0" w:sz="0" w:val="nil"/>
+        </w:pBdr>
+        <w:shd w:fill="auto" w:val="clear"/>
+        <w:spacing w:after="60" w:before="0" w:line="240" w:lineRule="auto"/>
+        <w:ind w:left="0" w:right="0" w:firstLine="0"/>
+        <w:jc w:val="left"/>
+        <w:rPr>
+          <w:rFonts w:ascii="Inter" w:cs="Inter" w:eastAsia="Inter" w:hAnsi="Inter"/>
+          <w:b w:val="0"/>
+          <w:bCs w:val="0"/>
+          <w:i w:val="0"/>
+          <w:iCs w:val="0"/>
+          <w:smallCaps w:val="0"/>
+          <w:strike w:val="0"/>
+          <w:color w:val="000000"/>
+          <w:sz w:val="22"/>
+          <w:szCs w:val="22"/>
+          <w:u w:val="none"/>
+          <w:shd w:fill="auto" w:val="clear"/>
+          <w:vertAlign w:val="baseline"/>
+        </w:rPr>
+      </w:pPr>
+      <w:r>
+        <w:rPr>
+          <w:rtl w:val="0"/>
+        </w:rPr>
+      </w:r>
+    </w:p>
+    <w:p>
+      <w:pPr>
+        <w:keepNext w:val="0"/>
+        <w:keepLines w:val="0"/>
+        <w:pageBreakBefore w:val="0"/>
+        <w:widowControl w:val="1"/>
+        <w:pBdr>
+          <w:top w:space="0" w:sz="0" w:val="nil"/>
+          <w:left w:space="0" w:sz="0" w:val="nil"/>
+          <w:bottom w:space="0" w:sz="0" w:val="nil"/>
+          <w:right w:space="0" w:sz="0" w:val="nil"/>
+          <w:between w:space="0" w:sz="0" w:val="nil"/>
+        </w:pBdr>
+        <w:shd w:fill="auto" w:val="clear"/>
+        <w:spacing w:after="60" w:before="0" w:line="240" w:lineRule="auto"/>
+        <w:ind w:left="0" w:right="0" w:firstLine="0"/>
+        <w:jc w:val="left"/>
+        <w:rPr>
+          <w:rFonts w:ascii="Inter" w:cs="Inter" w:eastAsia="Inter" w:hAnsi="Inter"/>
+          <w:b w:val="0"/>
+          <w:bCs w:val="0"/>
+          <w:i w:val="0"/>
+          <w:iCs w:val="0"/>
+          <w:smallCaps w:val="0"/>
+          <w:strike w:val="0"/>
+          <w:color w:val="000000"/>
+          <w:sz w:val="22"/>
+          <w:szCs w:val="22"/>
+          <w:u w:val="none"/>
+          <w:shd w:fill="auto" w:val="clear"/>
+          <w:vertAlign w:val="baseline"/>
+        </w:rPr>
+      </w:pPr>
+      <w:r>
+        <w:rPr>
+          <w:rFonts w:ascii="Inter" w:cs="Inter" w:eastAsia="Inter" w:hAnsi="Inter"/>
+          <w:b w:val="0"/>
+          <w:bCs w:val="0"/>
+          <w:i w:val="0"/>
+          <w:iCs w:val="0"/>
+          <w:smallCaps w:val="0"/>
+          <w:strike w:val="0"/>
+          <w:color w:val="000000"/>
+          <w:sz w:val="22"/>
+          <w:szCs w:val="22"/>
+          <w:u w:val="none"/>
+          <w:shd w:fill="auto" w:val="clear"/>
+          <w:vertAlign w:val="baseline"/>
           <w:rtl w:val="0"/>
         </w:rPr>
         <w:t xml:space="preserve">EDUCATION</w:t>
@@ -206,10 +895,52 @@
     </w:p>
     <w:p>
       <w:pPr>
-        <w:rPr/>
-      </w:pPr>
-      <w:r>
-        <w:rPr>
+        <w:keepNext w:val="0"/>
+        <w:keepLines w:val="0"/>
+        <w:pageBreakBefore w:val="0"/>
+        <w:widowControl w:val="1"/>
+        <w:pBdr>
+          <w:top w:space="0" w:sz="0" w:val="nil"/>
+          <w:left w:space="0" w:sz="0" w:val="nil"/>
+          <w:bottom w:space="0" w:sz="0" w:val="nil"/>
+          <w:right w:space="0" w:sz="0" w:val="nil"/>
+          <w:between w:space="0" w:sz="0" w:val="nil"/>
+        </w:pBdr>
+        <w:shd w:fill="auto" w:val="clear"/>
+        <w:spacing w:after="60" w:before="0" w:line="240" w:lineRule="auto"/>
+        <w:ind w:left="0" w:right="0" w:firstLine="0"/>
+        <w:jc w:val="left"/>
+        <w:rPr>
+          <w:rFonts w:ascii="Inter" w:cs="Inter" w:eastAsia="Inter" w:hAnsi="Inter"/>
+          <w:b w:val="0"/>
+          <w:bCs w:val="0"/>
+          <w:i w:val="0"/>
+          <w:iCs w:val="0"/>
+          <w:smallCaps w:val="0"/>
+          <w:strike w:val="0"/>
+          <w:color w:val="000000"/>
+          <w:sz w:val="22"/>
+          <w:szCs w:val="22"/>
+          <w:u w:val="none"/>
+          <w:shd w:fill="auto" w:val="clear"/>
+          <w:vertAlign w:val="baseline"/>
+        </w:rPr>
+      </w:pPr>
+      <w:r>
+        <w:rPr>
+          <w:rFonts w:ascii="Inter" w:cs="Inter" w:eastAsia="Inter" w:hAnsi="Inter"/>
+          <w:b w:val="0"/>
+          <w:bCs w:val="0"/>
+          <w:i w:val="0"/>
+          <w:iCs w:val="0"/>
+          <w:smallCaps w:val="0"/>
+          <w:strike w:val="0"/>
+          <w:color w:val="000000"/>
+          <w:sz w:val="22"/>
+          <w:szCs w:val="22"/>
+          <w:u w:val="none"/>
+          <w:shd w:fill="auto" w:val="clear"/>
+          <w:vertAlign w:val="baseline"/>
           <w:rtl w:val="0"/>
         </w:rPr>
         <w:t xml:space="preserve">{#education}</w:t>
@@ -217,31 +948,105 @@
     </w:p>
     <w:p>
       <w:pPr>
-        <w:rPr/>
-      </w:pPr>
-      <w:r>
-        <w:rPr>
-          <w:rtl w:val="0"/>
-        </w:rPr>
-        <w:t xml:space="preserve">{education_degree} | {education_school_name} |{education_graduation_year}</w:t>
-      </w:r>
-    </w:p>
-    <w:p>
-      <w:pPr>
-        <w:rPr/>
-      </w:pPr>
-      <w:r>
-        <w:rPr>
-          <w:rtl w:val="0"/>
-        </w:rPr>
-      </w:r>
-    </w:p>
-    <w:p>
-      <w:pPr>
-        <w:rPr/>
-      </w:pPr>
-      <w:r>
-        <w:rPr>
+        <w:keepNext w:val="0"/>
+        <w:keepLines w:val="0"/>
+        <w:pageBreakBefore w:val="0"/>
+        <w:widowControl w:val="1"/>
+        <w:pBdr>
+          <w:top w:space="0" w:sz="0" w:val="nil"/>
+          <w:left w:space="0" w:sz="0" w:val="nil"/>
+          <w:bottom w:space="0" w:sz="0" w:val="nil"/>
+          <w:right w:space="0" w:sz="0" w:val="nil"/>
+          <w:between w:space="0" w:sz="0" w:val="nil"/>
+        </w:pBdr>
+        <w:shd w:fill="auto" w:val="clear"/>
+        <w:spacing w:after="60" w:before="0" w:line="240" w:lineRule="auto"/>
+        <w:ind w:left="0" w:right="0" w:firstLine="0"/>
+        <w:jc w:val="left"/>
+        <w:rPr>
+          <w:rFonts w:ascii="Inter" w:cs="Inter" w:eastAsia="Inter" w:hAnsi="Inter"/>
+          <w:b w:val="0"/>
+          <w:bCs w:val="0"/>
+          <w:i w:val="0"/>
+          <w:iCs w:val="0"/>
+          <w:smallCaps w:val="0"/>
+          <w:strike w:val="0"/>
+          <w:color w:val="000000"/>
+          <w:sz w:val="22"/>
+          <w:szCs w:val="22"/>
+          <w:u w:val="none"/>
+          <w:shd w:fill="auto" w:val="clear"/>
+          <w:vertAlign w:val="baseline"/>
+        </w:rPr>
+      </w:pPr>
+      <w:r>
+        <w:rPr>
+          <w:rFonts w:ascii="Inter" w:cs="Inter" w:eastAsia="Inter" w:hAnsi="Inter"/>
+          <w:b w:val="0"/>
+          <w:bCs w:val="0"/>
+          <w:i w:val="0"/>
+          <w:iCs w:val="0"/>
+          <w:smallCaps w:val="0"/>
+          <w:strike w:val="0"/>
+          <w:color w:val="000000"/>
+          <w:sz w:val="22"/>
+          <w:szCs w:val="22"/>
+          <w:u w:val="none"/>
+          <w:shd w:fill="auto" w:val="clear"/>
+          <w:vertAlign w:val="baseline"/>
+          <w:rtl w:val="0"/>
+        </w:rPr>
+        <w:t xml:space="preserve">{education_degree} | {education_school_name} | {education_graduation_year}</w:t>
+      </w:r>
+    </w:p>
+    <w:p>
+      <w:pPr>
+        <w:keepNext w:val="0"/>
+        <w:keepLines w:val="0"/>
+        <w:pageBreakBefore w:val="0"/>
+        <w:widowControl w:val="1"/>
+        <w:pBdr>
+          <w:top w:space="0" w:sz="0" w:val="nil"/>
+          <w:left w:space="0" w:sz="0" w:val="nil"/>
+          <w:bottom w:space="0" w:sz="0" w:val="nil"/>
+          <w:right w:space="0" w:sz="0" w:val="nil"/>
+          <w:between w:space="0" w:sz="0" w:val="nil"/>
+        </w:pBdr>
+        <w:shd w:fill="auto" w:val="clear"/>
+        <w:spacing w:after="60" w:before="0" w:line="240" w:lineRule="auto"/>
+        <w:ind w:left="0" w:right="0" w:firstLine="0"/>
+        <w:jc w:val="left"/>
+        <w:rPr>
+          <w:rFonts w:ascii="Inter" w:cs="Inter" w:eastAsia="Inter" w:hAnsi="Inter"/>
+          <w:b w:val="0"/>
+          <w:bCs w:val="0"/>
+          <w:i w:val="0"/>
+          <w:iCs w:val="0"/>
+          <w:smallCaps w:val="0"/>
+          <w:strike w:val="0"/>
+          <w:color w:val="000000"/>
+          <w:sz w:val="22"/>
+          <w:szCs w:val="22"/>
+          <w:u w:val="none"/>
+          <w:shd w:fill="auto" w:val="clear"/>
+          <w:vertAlign w:val="baseline"/>
+        </w:rPr>
+      </w:pPr>
+      <w:r>
+        <w:rPr>
+          <w:rFonts w:ascii="Inter" w:cs="Inter" w:eastAsia="Inter" w:hAnsi="Inter"/>
+          <w:b w:val="0"/>
+          <w:bCs w:val="0"/>
+          <w:i w:val="0"/>
+          <w:iCs w:val="0"/>
+          <w:smallCaps w:val="0"/>
+          <w:strike w:val="0"/>
+          <w:color w:val="000000"/>
+          <w:sz w:val="22"/>
+          <w:szCs w:val="22"/>
+          <w:u w:val="none"/>
+          <w:shd w:fill="auto" w:val="clear"/>
+          <w:vertAlign w:val="baseline"/>
           <w:rtl w:val="0"/>
         </w:rPr>
         <w:t xml:space="preserve">{/education}</w:t>
@@ -249,20 +1054,91 @@
     </w:p>
     <w:p>
       <w:pPr>
-        <w:rPr/>
-      </w:pPr>
-      <w:r>
-        <w:rPr>
-          <w:rtl w:val="0"/>
-        </w:rPr>
-      </w:r>
-    </w:p>
-    <w:p>
-      <w:pPr>
-        <w:rPr/>
-      </w:pPr>
-      <w:r>
-        <w:rPr>
+        <w:keepNext w:val="0"/>
+        <w:keepLines w:val="0"/>
+        <w:pageBreakBefore w:val="0"/>
+        <w:widowControl w:val="1"/>
+        <w:pBdr>
+          <w:top w:space="0" w:sz="0" w:val="nil"/>
+          <w:left w:space="0" w:sz="0" w:val="nil"/>
+          <w:bottom w:space="0" w:sz="0" w:val="nil"/>
+          <w:right w:space="0" w:sz="0" w:val="nil"/>
+          <w:between w:space="0" w:sz="0" w:val="nil"/>
+        </w:pBdr>
+        <w:shd w:fill="auto" w:val="clear"/>
+        <w:spacing w:after="60" w:before="0" w:line="240" w:lineRule="auto"/>
+        <w:ind w:left="0" w:right="0" w:firstLine="0"/>
+        <w:jc w:val="left"/>
+        <w:rPr>
+          <w:rFonts w:ascii="Inter" w:cs="Inter" w:eastAsia="Inter" w:hAnsi="Inter"/>
+          <w:b w:val="0"/>
+          <w:bCs w:val="0"/>
+          <w:i w:val="0"/>
+          <w:iCs w:val="0"/>
+          <w:smallCaps w:val="0"/>
+          <w:strike w:val="0"/>
+          <w:color w:val="000000"/>
+          <w:sz w:val="22"/>
+          <w:szCs w:val="22"/>
+          <w:u w:val="none"/>
+          <w:shd w:fill="auto" w:val="clear"/>
+          <w:vertAlign w:val="baseline"/>
+        </w:rPr>
+      </w:pPr>
+      <w:r>
+        <w:rPr>
+          <w:rtl w:val="0"/>
+        </w:rPr>
+      </w:r>
+    </w:p>
+    <w:p>
+      <w:pPr>
+        <w:keepNext w:val="0"/>
+        <w:keepLines w:val="0"/>
+        <w:pageBreakBefore w:val="0"/>
+        <w:widowControl w:val="1"/>
+        <w:pBdr>
+          <w:top w:space="0" w:sz="0" w:val="nil"/>
+          <w:left w:space="0" w:sz="0" w:val="nil"/>
+          <w:bottom w:space="0" w:sz="0" w:val="nil"/>
+          <w:right w:space="0" w:sz="0" w:val="nil"/>
+          <w:between w:space="0" w:sz="0" w:val="nil"/>
+        </w:pBdr>
+        <w:shd w:fill="auto" w:val="clear"/>
+        <w:spacing w:after="60" w:before="0" w:line="240" w:lineRule="auto"/>
+        <w:ind w:left="0" w:right="0" w:firstLine="0"/>
+        <w:jc w:val="left"/>
+        <w:rPr>
+          <w:rFonts w:ascii="Inter" w:cs="Inter" w:eastAsia="Inter" w:hAnsi="Inter"/>
+          <w:b w:val="0"/>
+          <w:bCs w:val="0"/>
+          <w:i w:val="0"/>
+          <w:iCs w:val="0"/>
+          <w:smallCaps w:val="0"/>
+          <w:strike w:val="0"/>
+          <w:color w:val="000000"/>
+          <w:sz w:val="22"/>
+          <w:szCs w:val="22"/>
+          <w:u w:val="none"/>
+          <w:shd w:fill="auto" w:val="clear"/>
+          <w:vertAlign w:val="baseline"/>
+        </w:rPr>
+      </w:pPr>
+      <w:r>
+        <w:rPr>
+          <w:rFonts w:ascii="Inter" w:cs="Inter" w:eastAsia="Inter" w:hAnsi="Inter"/>
+          <w:b w:val="0"/>
+          <w:bCs w:val="0"/>
+          <w:i w:val="0"/>
+          <w:iCs w:val="0"/>
+          <w:smallCaps w:val="0"/>
+          <w:strike w:val="0"/>
+          <w:color w:val="000000"/>
+          <w:sz w:val="22"/>
+          <w:szCs w:val="22"/>
+          <w:u w:val="none"/>
+          <w:shd w:fill="auto" w:val="clear"/>
+          <w:vertAlign w:val="baseline"/>
           <w:rtl w:val="0"/>
         </w:rPr>
         <w:t xml:space="preserve">PROFESSIONAL EXPERIENCE</w:t>
@@ -270,10 +1146,52 @@
     </w:p>
     <w:p>
       <w:pPr>
-        <w:rPr/>
-      </w:pPr>
-      <w:r>
-        <w:rPr>
+        <w:keepNext w:val="0"/>
+        <w:keepLines w:val="0"/>
+        <w:pageBreakBefore w:val="0"/>
+        <w:widowControl w:val="1"/>
+        <w:pBdr>
+          <w:top w:space="0" w:sz="0" w:val="nil"/>
+          <w:left w:space="0" w:sz="0" w:val="nil"/>
+          <w:bottom w:space="0" w:sz="0" w:val="nil"/>
+          <w:right w:space="0" w:sz="0" w:val="nil"/>
+          <w:between w:space="0" w:sz="0" w:val="nil"/>
+        </w:pBdr>
+        <w:shd w:fill="auto" w:val="clear"/>
+        <w:spacing w:after="60" w:before="0" w:line="240" w:lineRule="auto"/>
+        <w:ind w:left="0" w:right="0" w:firstLine="0"/>
+        <w:jc w:val="left"/>
+        <w:rPr>
+          <w:rFonts w:ascii="Inter" w:cs="Inter" w:eastAsia="Inter" w:hAnsi="Inter"/>
+          <w:b w:val="0"/>
+          <w:bCs w:val="0"/>
+          <w:i w:val="0"/>
+          <w:iCs w:val="0"/>
+          <w:smallCaps w:val="0"/>
+          <w:strike w:val="0"/>
+          <w:color w:val="000000"/>
+          <w:sz w:val="22"/>
+          <w:szCs w:val="22"/>
+          <w:u w:val="none"/>
+          <w:shd w:fill="auto" w:val="clear"/>
+          <w:vertAlign w:val="baseline"/>
+        </w:rPr>
+      </w:pPr>
+      <w:r>
+        <w:rPr>
+          <w:rFonts w:ascii="Inter" w:cs="Inter" w:eastAsia="Inter" w:hAnsi="Inter"/>
+          <w:b w:val="0"/>
+          <w:bCs w:val="0"/>
+          <w:i w:val="0"/>
+          <w:iCs w:val="0"/>
+          <w:smallCaps w:val="0"/>
+          <w:strike w:val="0"/>
+          <w:color w:val="000000"/>
+          <w:sz w:val="22"/>
+          <w:szCs w:val="22"/>
+          <w:u w:val="none"/>
+          <w:shd w:fill="auto" w:val="clear"/>
+          <w:vertAlign w:val="baseline"/>
           <w:rtl w:val="0"/>
         </w:rPr>
         <w:t xml:space="preserve">{#professional_experiences}</w:t>
@@ -281,10 +1199,52 @@
     </w:p>
     <w:p>
       <w:pPr>
-        <w:rPr/>
-      </w:pPr>
-      <w:r>
-        <w:rPr>
+        <w:keepNext w:val="0"/>
+        <w:keepLines w:val="0"/>
+        <w:pageBreakBefore w:val="0"/>
+        <w:widowControl w:val="1"/>
+        <w:pBdr>
+          <w:top w:space="0" w:sz="0" w:val="nil"/>
+          <w:left w:space="0" w:sz="0" w:val="nil"/>
+          <w:bottom w:space="0" w:sz="0" w:val="nil"/>
+          <w:right w:space="0" w:sz="0" w:val="nil"/>
+          <w:between w:space="0" w:sz="0" w:val="nil"/>
+        </w:pBdr>
+        <w:shd w:fill="auto" w:val="clear"/>
+        <w:spacing w:after="60" w:before="300" w:line="240" w:lineRule="auto"/>
+        <w:ind w:left="0" w:right="0" w:firstLine="0"/>
+        <w:jc w:val="left"/>
+        <w:rPr>
+          <w:rFonts w:ascii="Inter" w:cs="Inter" w:eastAsia="Inter" w:hAnsi="Inter"/>
+          <w:b w:val="0"/>
+          <w:bCs w:val="0"/>
+          <w:i w:val="0"/>
+          <w:iCs w:val="0"/>
+          <w:smallCaps w:val="0"/>
+          <w:strike w:val="0"/>
+          <w:color w:val="000000"/>
+          <w:sz w:val="22"/>
+          <w:szCs w:val="22"/>
+          <w:u w:val="none"/>
+          <w:shd w:fill="auto" w:val="clear"/>
+          <w:vertAlign w:val="baseline"/>
+        </w:rPr>
+      </w:pPr>
+      <w:r>
+        <w:rPr>
+          <w:rFonts w:ascii="Inter" w:cs="Inter" w:eastAsia="Inter" w:hAnsi="Inter"/>
+          <w:b w:val="0"/>
+          <w:bCs w:val="0"/>
+          <w:i w:val="0"/>
+          <w:iCs w:val="0"/>
+          <w:smallCaps w:val="0"/>
+          <w:strike w:val="0"/>
+          <w:color w:val="000000"/>
+          <w:sz w:val="22"/>
+          <w:szCs w:val="22"/>
+          <w:u w:val="none"/>
+          <w:shd w:fill="auto" w:val="clear"/>
+          <w:vertAlign w:val="baseline"/>
           <w:rtl w:val="0"/>
         </w:rPr>
         <w:t xml:space="preserve">RN - {experience_unit_specialty}</w:t>
@@ -292,10 +1252,52 @@
     </w:p>
     <w:p>
       <w:pPr>
-        <w:rPr/>
-      </w:pPr>
-      <w:r>
-        <w:rPr>
+        <w:keepNext w:val="0"/>
+        <w:keepLines w:val="0"/>
+        <w:pageBreakBefore w:val="0"/>
+        <w:widowControl w:val="1"/>
+        <w:pBdr>
+          <w:top w:space="0" w:sz="0" w:val="nil"/>
+          <w:left w:space="0" w:sz="0" w:val="nil"/>
+          <w:bottom w:space="0" w:sz="0" w:val="nil"/>
+          <w:right w:space="0" w:sz="0" w:val="nil"/>
+          <w:between w:space="0" w:sz="0" w:val="nil"/>
+        </w:pBdr>
+        <w:shd w:fill="auto" w:val="clear"/>
+        <w:spacing w:after="60" w:before="0" w:line="240" w:lineRule="auto"/>
+        <w:ind w:left="0" w:right="0" w:firstLine="0"/>
+        <w:jc w:val="left"/>
+        <w:rPr>
+          <w:rFonts w:ascii="Inter" w:cs="Inter" w:eastAsia="Inter" w:hAnsi="Inter"/>
+          <w:b w:val="0"/>
+          <w:bCs w:val="0"/>
+          <w:i w:val="0"/>
+          <w:iCs w:val="0"/>
+          <w:smallCaps w:val="0"/>
+          <w:strike w:val="0"/>
+          <w:color w:val="000000"/>
+          <w:sz w:val="22"/>
+          <w:szCs w:val="22"/>
+          <w:u w:val="none"/>
+          <w:shd w:fill="auto" w:val="clear"/>
+          <w:vertAlign w:val="baseline"/>
+        </w:rPr>
+      </w:pPr>
+      <w:r>
+        <w:rPr>
+          <w:rFonts w:ascii="Inter" w:cs="Inter" w:eastAsia="Inter" w:hAnsi="Inter"/>
+          <w:b w:val="0"/>
+          <w:bCs w:val="0"/>
+          <w:i w:val="0"/>
+          <w:iCs w:val="0"/>
+          <w:smallCaps w:val="0"/>
+          <w:strike w:val="0"/>
+          <w:color w:val="000000"/>
+          <w:sz w:val="22"/>
+          <w:szCs w:val="22"/>
+          <w:u w:val="none"/>
+          <w:shd w:fill="auto" w:val="clear"/>
+          <w:vertAlign w:val="baseline"/>
           <w:rtl w:val="0"/>
         </w:rPr>
         <w:t xml:space="preserve">{experience_hospital_name} | {experience_facility_location}</w:t>
@@ -303,10 +1305,52 @@
     </w:p>
     <w:p>
       <w:pPr>
-        <w:rPr/>
-      </w:pPr>
-      <w:r>
-        <w:rPr>
+        <w:keepNext w:val="0"/>
+        <w:keepLines w:val="0"/>
+        <w:pageBreakBefore w:val="0"/>
+        <w:widowControl w:val="1"/>
+        <w:pBdr>
+          <w:top w:space="0" w:sz="0" w:val="nil"/>
+          <w:left w:space="0" w:sz="0" w:val="nil"/>
+          <w:bottom w:space="0" w:sz="0" w:val="nil"/>
+          <w:right w:space="0" w:sz="0" w:val="nil"/>
+          <w:between w:space="0" w:sz="0" w:val="nil"/>
+        </w:pBdr>
+        <w:shd w:fill="auto" w:val="clear"/>
+        <w:spacing w:after="60" w:before="0" w:line="240" w:lineRule="auto"/>
+        <w:ind w:left="0" w:right="0" w:firstLine="0"/>
+        <w:jc w:val="left"/>
+        <w:rPr>
+          <w:rFonts w:ascii="Inter" w:cs="Inter" w:eastAsia="Inter" w:hAnsi="Inter"/>
+          <w:b w:val="0"/>
+          <w:bCs w:val="0"/>
+          <w:i w:val="0"/>
+          <w:iCs w:val="0"/>
+          <w:smallCaps w:val="0"/>
+          <w:strike w:val="0"/>
+          <w:color w:val="000000"/>
+          <w:sz w:val="22"/>
+          <w:szCs w:val="22"/>
+          <w:u w:val="none"/>
+          <w:shd w:fill="auto" w:val="clear"/>
+          <w:vertAlign w:val="baseline"/>
+        </w:rPr>
+      </w:pPr>
+      <w:r>
+        <w:rPr>
+          <w:rFonts w:ascii="Inter" w:cs="Inter" w:eastAsia="Inter" w:hAnsi="Inter"/>
+          <w:b w:val="0"/>
+          <w:bCs w:val="0"/>
+          <w:i w:val="0"/>
+          <w:iCs w:val="0"/>
+          <w:smallCaps w:val="0"/>
+          <w:strike w:val="0"/>
+          <w:color w:val="000000"/>
+          <w:sz w:val="22"/>
+          <w:szCs w:val="22"/>
+          <w:u w:val="none"/>
+          <w:shd w:fill="auto" w:val="clear"/>
+          <w:vertAlign w:val="baseline"/>
           <w:rtl w:val="0"/>
         </w:rPr>
         <w:t xml:space="preserve">{experience_employment_dates}</w:t>
@@ -314,10 +1358,52 @@
     </w:p>
     <w:p>
       <w:pPr>
-        <w:rPr/>
-      </w:pPr>
-      <w:r>
-        <w:rPr>
+        <w:keepNext w:val="0"/>
+        <w:keepLines w:val="0"/>
+        <w:pageBreakBefore w:val="0"/>
+        <w:widowControl w:val="1"/>
+        <w:pBdr>
+          <w:top w:space="0" w:sz="0" w:val="nil"/>
+          <w:left w:space="0" w:sz="0" w:val="nil"/>
+          <w:bottom w:space="0" w:sz="0" w:val="nil"/>
+          <w:right w:space="0" w:sz="0" w:val="nil"/>
+          <w:between w:space="0" w:sz="0" w:val="nil"/>
+        </w:pBdr>
+        <w:shd w:fill="auto" w:val="clear"/>
+        <w:spacing w:after="60" w:before="0" w:line="240" w:lineRule="auto"/>
+        <w:ind w:left="0" w:right="0" w:firstLine="0"/>
+        <w:jc w:val="left"/>
+        <w:rPr>
+          <w:rFonts w:ascii="Inter" w:cs="Inter" w:eastAsia="Inter" w:hAnsi="Inter"/>
+          <w:b w:val="0"/>
+          <w:bCs w:val="0"/>
+          <w:i w:val="0"/>
+          <w:iCs w:val="0"/>
+          <w:smallCaps w:val="0"/>
+          <w:strike w:val="0"/>
+          <w:color w:val="000000"/>
+          <w:sz w:val="22"/>
+          <w:szCs w:val="22"/>
+          <w:u w:val="none"/>
+          <w:shd w:fill="auto" w:val="clear"/>
+          <w:vertAlign w:val="baseline"/>
+        </w:rPr>
+      </w:pPr>
+      <w:r>
+        <w:rPr>
+          <w:rFonts w:ascii="Inter" w:cs="Inter" w:eastAsia="Inter" w:hAnsi="Inter"/>
+          <w:b w:val="0"/>
+          <w:bCs w:val="0"/>
+          <w:i w:val="0"/>
+          <w:iCs w:val="0"/>
+          <w:smallCaps w:val="0"/>
+          <w:strike w:val="0"/>
+          <w:color w:val="000000"/>
+          <w:sz w:val="22"/>
+          <w:szCs w:val="22"/>
+          <w:u w:val="none"/>
+          <w:shd w:fill="auto" w:val="clear"/>
+          <w:vertAlign w:val="baseline"/>
           <w:rtl w:val="0"/>
         </w:rPr>
         <w:t xml:space="preserve">{experience_metrics_line}</w:t>
@@ -325,32 +1411,160 @@
     </w:p>
     <w:p>
       <w:pPr>
-        <w:rPr/>
-      </w:pPr>
-      <w:r>
-        <w:rPr>
-          <w:rtl w:val="0"/>
-        </w:rPr>
-      </w:r>
-    </w:p>
-    <w:p>
-      <w:pPr>
-        <w:rPr/>
-      </w:pPr>
-      <w:r>
-        <w:rPr>
+        <w:keepNext w:val="0"/>
+        <w:keepLines w:val="0"/>
+        <w:pageBreakBefore w:val="0"/>
+        <w:widowControl w:val="1"/>
+        <w:pBdr>
+          <w:top w:space="0" w:sz="0" w:val="nil"/>
+          <w:left w:space="0" w:sz="0" w:val="nil"/>
+          <w:bottom w:space="0" w:sz="0" w:val="nil"/>
+          <w:right w:space="0" w:sz="0" w:val="nil"/>
+          <w:between w:space="0" w:sz="0" w:val="nil"/>
+        </w:pBdr>
+        <w:shd w:fill="auto" w:val="clear"/>
+        <w:spacing w:after="60" w:before="0" w:line="240" w:lineRule="auto"/>
+        <w:ind w:left="0" w:right="0" w:firstLine="0"/>
+        <w:jc w:val="left"/>
+        <w:rPr>
+          <w:rFonts w:ascii="Inter" w:cs="Inter" w:eastAsia="Inter" w:hAnsi="Inter"/>
+          <w:b w:val="0"/>
+          <w:bCs w:val="0"/>
+          <w:i w:val="0"/>
+          <w:iCs w:val="0"/>
+          <w:smallCaps w:val="0"/>
+          <w:strike w:val="0"/>
+          <w:color w:val="000000"/>
+          <w:sz w:val="22"/>
+          <w:szCs w:val="22"/>
+          <w:u w:val="none"/>
+          <w:shd w:fill="auto" w:val="clear"/>
+          <w:vertAlign w:val="baseline"/>
+        </w:rPr>
+      </w:pPr>
+      <w:r>
+        <w:rPr>
+          <w:rFonts w:ascii="Inter" w:cs="Inter" w:eastAsia="Inter" w:hAnsi="Inter"/>
+          <w:b w:val="0"/>
+          <w:bCs w:val="0"/>
+          <w:i w:val="0"/>
+          <w:iCs w:val="0"/>
+          <w:smallCaps w:val="0"/>
+          <w:strike w:val="0"/>
+          <w:color w:val="000000"/>
+          <w:sz w:val="22"/>
+          <w:szCs w:val="22"/>
+          <w:u w:val="none"/>
+          <w:shd w:fill="auto" w:val="clear"/>
+          <w:vertAlign w:val="baseline"/>
           <w:rtl w:val="0"/>
         </w:rPr>
         <w:t xml:space="preserve">{/professional_experiences}</w:t>
       </w:r>
     </w:p>
     <w:sectPr>
+      <w:headerReference r:id="rId6" w:type="default"/>
+      <w:footerReference r:id="rId7" w:type="default"/>
       <w:pgSz w:h="15840" w:w="12240" w:orient="portrait"/>
       <w:pgMar w:bottom="1440" w:top="1440" w:left="1800" w:right="1800" w:header="720" w:footer="720"/>
       <w:pgNumType w:start="1"/>
     </w:sectPr>
   </w:body>
 </w:document>
+</file>
+
+<file path=word/footer1.xml><?xml version="1.0" encoding="utf-8"?>
+<w:ftr xmlns:mc="http://schemas.openxmlformats.org/markup-compatibility/2006" xmlns:o="urn:schemas-microsoft-com:office:office" xmlns:r="http://schemas.openxmlformats.org/officeDocument/2006/relationships" xmlns:m="http://schemas.openxmlformats.org/officeDocument/2006/math" xmlns:v="urn:schemas-microsoft-com:vml" xmlns:wp="http://schemas.openxmlformats.org/drawingml/2006/wordprocessingDrawing" xmlns:w10="urn:schemas-microsoft-com:office:word" xmlns:w="http://schemas.openxmlformats.org/wordprocessingml/2006/main" xmlns:wne="http://schemas.microsoft.com/office/word/2006/wordml" xmlns:sl="http://schemas.openxmlformats.org/schemaLibrary/2006/main" xmlns:a="http://schemas.openxmlformats.org/drawingml/2006/main" xmlns:pic="http://schemas.openxmlformats.org/drawingml/2006/picture" xmlns:c="http://schemas.openxmlformats.org/drawingml/2006/chart" xmlns:lc="http://schemas.openxmlformats.org/drawingml/2006/lockedCanvas" xmlns:dgm="http://schemas.openxmlformats.org/drawingml/2006/diagram" xmlns:wps="http://schemas.microsoft.com/office/word/2010/wordprocessingShape" xmlns:wpg="http://schemas.microsoft.com/office/word/2010/wordprocessingGroup" xmlns:w14="http://schemas.microsoft.com/office/word/2010/wordml" xmlns:w15="http://schemas.microsoft.com/office/word/2012/wordml" xmlns:w16="http://schemas.microsoft.com/office/word/2018/wordml" xmlns:w16cex="http://schemas.microsoft.com/office/word/2018/wordml/cex" xmlns:w16cid="http://schemas.microsoft.com/office/word/2016/wordml/cid" xmlns="http://schemas.microsoft.com/office/tasks/2019/documenttasks" xmlns:cr="http://schemas.microsoft.com/office/comments/2020/reactions">
+  <w:p>
+    <w:pPr>
+      <w:keepNext w:val="0"/>
+      <w:keepLines w:val="0"/>
+      <w:pageBreakBefore w:val="0"/>
+      <w:widowControl w:val="1"/>
+      <w:pBdr>
+        <w:top w:space="0" w:sz="0" w:val="nil"/>
+        <w:left w:space="0" w:sz="0" w:val="nil"/>
+        <w:bottom w:space="0" w:sz="0" w:val="nil"/>
+        <w:right w:space="0" w:sz="0" w:val="nil"/>
+        <w:between w:space="0" w:sz="0" w:val="nil"/>
+      </w:pBdr>
+      <w:shd w:fill="auto" w:val="clear"/>
+      <w:tabs>
+        <w:tab w:val="right" w:leader="none" w:pos="9020"/>
+      </w:tabs>
+      <w:spacing w:after="0" w:before="0" w:line="240" w:lineRule="auto"/>
+      <w:ind w:left="0" w:right="0" w:firstLine="0"/>
+      <w:jc w:val="left"/>
+      <w:rPr>
+        <w:rFonts w:ascii="Inter" w:cs="Inter" w:eastAsia="Inter" w:hAnsi="Inter"/>
+        <w:b w:val="0"/>
+        <w:bCs w:val="0"/>
+        <w:i w:val="0"/>
+        <w:iCs w:val="0"/>
+        <w:smallCaps w:val="0"/>
+        <w:strike w:val="0"/>
+        <w:color w:val="000000"/>
+        <w:sz w:val="24"/>
+        <w:szCs w:val="24"/>
+        <w:u w:val="none"/>
+        <w:shd w:fill="auto" w:val="clear"/>
+        <w:vertAlign w:val="baseline"/>
+      </w:rPr>
+    </w:pPr>
+    <w:r>
+      <w:rPr>
+        <w:rtl w:val="0"/>
+      </w:rPr>
+    </w:r>
+  </w:p>
+</w:ftr>
+</file>
+
+<file path=word/header1.xml><?xml version="1.0" encoding="utf-8"?>
+<w:hdr xmlns:mc="http://schemas.openxmlformats.org/markup-compatibility/2006" xmlns:o="urn:schemas-microsoft-com:office:office" xmlns:r="http://schemas.openxmlformats.org/officeDocument/2006/relationships" xmlns:m="http://schemas.openxmlformats.org/officeDocument/2006/math" xmlns:v="urn:schemas-microsoft-com:vml" xmlns:wp="http://schemas.openxmlformats.org/drawingml/2006/wordprocessingDrawing" xmlns:w10="urn:schemas-microsoft-com:office:word" xmlns:w="http://schemas.openxmlformats.org/wordprocessingml/2006/main" xmlns:wne="http://schemas.microsoft.com/office/word/2006/wordml" xmlns:sl="http://schemas.openxmlformats.org/schemaLibrary/2006/main" xmlns:a="http://schemas.openxmlformats.org/drawingml/2006/main" xmlns:pic="http://schemas.openxmlformats.org/drawingml/2006/picture" xmlns:c="http://schemas.openxmlformats.org/drawingml/2006/chart" xmlns:lc="http://schemas.openxmlformats.org/drawingml/2006/lockedCanvas" xmlns:dgm="http://schemas.openxmlformats.org/drawingml/2006/diagram" xmlns:wps="http://schemas.microsoft.com/office/word/2010/wordprocessingShape" xmlns:wpg="http://schemas.microsoft.com/office/word/2010/wordprocessingGroup" xmlns:w14="http://schemas.microsoft.com/office/word/2010/wordml" xmlns:w15="http://schemas.microsoft.com/office/word/2012/wordml" xmlns:w16="http://schemas.microsoft.com/office/word/2018/wordml" xmlns:w16cex="http://schemas.microsoft.com/office/word/2018/wordml/cex" xmlns:w16cid="http://schemas.microsoft.com/office/word/2016/wordml/cid" xmlns="http://schemas.microsoft.com/office/tasks/2019/documenttasks" xmlns:cr="http://schemas.microsoft.com/office/comments/2020/reactions">
+  <w:p>
+    <w:pPr>
+      <w:keepNext w:val="0"/>
+      <w:keepLines w:val="0"/>
+      <w:pageBreakBefore w:val="0"/>
+      <w:widowControl w:val="1"/>
+      <w:pBdr>
+        <w:top w:space="0" w:sz="0" w:val="nil"/>
+        <w:left w:space="0" w:sz="0" w:val="nil"/>
+        <w:bottom w:space="0" w:sz="0" w:val="nil"/>
+        <w:right w:space="0" w:sz="0" w:val="nil"/>
+        <w:between w:space="0" w:sz="0" w:val="nil"/>
+      </w:pBdr>
+      <w:shd w:fill="auto" w:val="clear"/>
+      <w:tabs>
+        <w:tab w:val="right" w:leader="none" w:pos="9020"/>
+      </w:tabs>
+      <w:spacing w:after="0" w:before="0" w:line="240" w:lineRule="auto"/>
+      <w:ind w:left="0" w:right="0" w:firstLine="0"/>
+      <w:jc w:val="left"/>
+      <w:rPr>
+        <w:rFonts w:ascii="Inter" w:cs="Inter" w:eastAsia="Inter" w:hAnsi="Inter"/>
+        <w:b w:val="0"/>
+        <w:bCs w:val="0"/>
+        <w:i w:val="0"/>
+        <w:iCs w:val="0"/>
+        <w:smallCaps w:val="0"/>
+        <w:strike w:val="0"/>
+        <w:color w:val="000000"/>
+        <w:sz w:val="24"/>
+        <w:szCs w:val="24"/>
+        <w:u w:val="none"/>
+        <w:shd w:fill="auto" w:val="clear"/>
+        <w:vertAlign w:val="baseline"/>
+      </w:rPr>
+    </w:pPr>
+    <w:r>
+      <w:rPr>
+        <w:rtl w:val="0"/>
+      </w:rPr>
+    </w:r>
+  </w:p>
+</w:hdr>
 </file>
 
 <file path=word/numbering.xml><?xml version="1.0" encoding="utf-8"?>
@@ -365,106 +1579,193 @@
         <w:ind w:left="360" w:hanging="360"/>
       </w:pPr>
       <w:rPr>
-        <w:rFonts w:ascii="Arial" w:hAnsi="Arial" w:cs="Arial" w:eastAsia="Arial"/>
+        <w:rFonts w:ascii="Inter" w:cs="Inter" w:eastAsia="Inter" w:hAnsi="Inter"/>
+        <w:b w:val="0"/>
+        <w:bCs w:val="0"/>
+        <w:i w:val="0"/>
+        <w:iCs w:val="0"/>
+        <w:smallCaps w:val="0"/>
+        <w:strike w:val="0"/>
         <w:sz w:val="20"/>
         <w:szCs w:val="20"/>
-        <w:u w:val="none"/>
+        <w:shd w:fill="auto" w:val="clear"/>
+        <w:vertAlign w:val="baseline"/>
       </w:rPr>
     </w:lvl>
     <w:lvl w:ilvl="1">
       <w:start w:val="1"/>
       <w:numFmt w:val="bullet"/>
-      <w:lvlText w:val=""/>
+      <w:lvlText w:val="•"/>
       <w:lvlJc w:val="left"/>
       <w:pPr>
-        <w:ind w:left="0" w:firstLine="0"/>
+        <w:ind w:left="1080" w:hanging="360"/>
       </w:pPr>
       <w:rPr>
-        <w:u w:val="none"/>
+        <w:rFonts w:ascii="Inter" w:cs="Inter" w:eastAsia="Inter" w:hAnsi="Inter"/>
+        <w:b w:val="0"/>
+        <w:bCs w:val="0"/>
+        <w:i w:val="0"/>
+        <w:iCs w:val="0"/>
+        <w:smallCaps w:val="0"/>
+        <w:strike w:val="0"/>
+        <w:sz w:val="20"/>
+        <w:szCs w:val="20"/>
+        <w:shd w:fill="auto" w:val="clear"/>
+        <w:vertAlign w:val="baseline"/>
       </w:rPr>
     </w:lvl>
     <w:lvl w:ilvl="2">
       <w:start w:val="1"/>
       <w:numFmt w:val="bullet"/>
-      <w:lvlText w:val=""/>
+      <w:lvlText w:val="•"/>
       <w:lvlJc w:val="left"/>
       <w:pPr>
-        <w:ind w:left="0" w:firstLine="0"/>
+        <w:ind w:left="1800" w:hanging="360"/>
       </w:pPr>
       <w:rPr>
-        <w:u w:val="none"/>
+        <w:rFonts w:ascii="Inter" w:cs="Inter" w:eastAsia="Inter" w:hAnsi="Inter"/>
+        <w:b w:val="0"/>
+        <w:bCs w:val="0"/>
+        <w:i w:val="0"/>
+        <w:iCs w:val="0"/>
+        <w:smallCaps w:val="0"/>
+        <w:strike w:val="0"/>
+        <w:sz w:val="20"/>
+        <w:szCs w:val="20"/>
+        <w:shd w:fill="auto" w:val="clear"/>
+        <w:vertAlign w:val="baseline"/>
       </w:rPr>
     </w:lvl>
     <w:lvl w:ilvl="3">
       <w:start w:val="1"/>
       <w:numFmt w:val="bullet"/>
-      <w:lvlText w:val=""/>
+      <w:lvlText w:val="•"/>
       <w:lvlJc w:val="left"/>
       <w:pPr>
-        <w:ind w:left="0" w:firstLine="0"/>
+        <w:ind w:left="2520" w:hanging="360"/>
       </w:pPr>
       <w:rPr>
-        <w:u w:val="none"/>
+        <w:rFonts w:ascii="Inter" w:cs="Inter" w:eastAsia="Inter" w:hAnsi="Inter"/>
+        <w:b w:val="0"/>
+        <w:bCs w:val="0"/>
+        <w:i w:val="0"/>
+        <w:iCs w:val="0"/>
+        <w:smallCaps w:val="0"/>
+        <w:strike w:val="0"/>
+        <w:sz w:val="20"/>
+        <w:szCs w:val="20"/>
+        <w:shd w:fill="auto" w:val="clear"/>
+        <w:vertAlign w:val="baseline"/>
       </w:rPr>
     </w:lvl>
     <w:lvl w:ilvl="4">
       <w:start w:val="1"/>
       <w:numFmt w:val="bullet"/>
-      <w:lvlText w:val=""/>
+      <w:lvlText w:val="•"/>
       <w:lvlJc w:val="left"/>
       <w:pPr>
-        <w:ind w:left="0" w:firstLine="0"/>
+        <w:ind w:left="3240" w:hanging="360"/>
       </w:pPr>
       <w:rPr>
-        <w:u w:val="none"/>
+        <w:rFonts w:ascii="Inter" w:cs="Inter" w:eastAsia="Inter" w:hAnsi="Inter"/>
+        <w:b w:val="0"/>
+        <w:bCs w:val="0"/>
+        <w:i w:val="0"/>
+        <w:iCs w:val="0"/>
+        <w:smallCaps w:val="0"/>
+        <w:strike w:val="0"/>
+        <w:sz w:val="20"/>
+        <w:szCs w:val="20"/>
+        <w:shd w:fill="auto" w:val="clear"/>
+        <w:vertAlign w:val="baseline"/>
       </w:rPr>
     </w:lvl>
     <w:lvl w:ilvl="5">
       <w:start w:val="1"/>
       <w:numFmt w:val="bullet"/>
-      <w:lvlText w:val=""/>
+      <w:lvlText w:val="•"/>
       <w:lvlJc w:val="left"/>
       <w:pPr>
-        <w:ind w:left="0" w:firstLine="0"/>
+        <w:ind w:left="3960" w:hanging="360"/>
       </w:pPr>
       <w:rPr>
-        <w:u w:val="none"/>
+        <w:rFonts w:ascii="Inter" w:cs="Inter" w:eastAsia="Inter" w:hAnsi="Inter"/>
+        <w:b w:val="0"/>
+        <w:bCs w:val="0"/>
+        <w:i w:val="0"/>
+        <w:iCs w:val="0"/>
+        <w:smallCaps w:val="0"/>
+        <w:strike w:val="0"/>
+        <w:sz w:val="20"/>
+        <w:szCs w:val="20"/>
+        <w:shd w:fill="auto" w:val="clear"/>
+        <w:vertAlign w:val="baseline"/>
       </w:rPr>
     </w:lvl>
     <w:lvl w:ilvl="6">
       <w:start w:val="1"/>
       <w:numFmt w:val="bullet"/>
-      <w:lvlText w:val=""/>
+      <w:lvlText w:val="•"/>
       <w:lvlJc w:val="left"/>
       <w:pPr>
-        <w:ind w:left="0" w:firstLine="0"/>
+        <w:ind w:left="4680" w:hanging="360"/>
       </w:pPr>
       <w:rPr>
-        <w:u w:val="none"/>
+        <w:rFonts w:ascii="Inter" w:cs="Inter" w:eastAsia="Inter" w:hAnsi="Inter"/>
+        <w:b w:val="0"/>
+        <w:bCs w:val="0"/>
+        <w:i w:val="0"/>
+        <w:iCs w:val="0"/>
+        <w:smallCaps w:val="0"/>
+        <w:strike w:val="0"/>
+        <w:sz w:val="20"/>
+        <w:szCs w:val="20"/>
+        <w:shd w:fill="auto" w:val="clear"/>
+        <w:vertAlign w:val="baseline"/>
       </w:rPr>
     </w:lvl>
     <w:lvl w:ilvl="7">
       <w:start w:val="1"/>
       <w:numFmt w:val="bullet"/>
-      <w:lvlText w:val=""/>
+      <w:lvlText w:val="•"/>
       <w:lvlJc w:val="left"/>
       <w:pPr>
-        <w:ind w:left="0" w:firstLine="0"/>
+        <w:ind w:left="5400" w:hanging="360"/>
       </w:pPr>
       <w:rPr>
-        <w:u w:val="none"/>
+        <w:rFonts w:ascii="Inter" w:cs="Inter" w:eastAsia="Inter" w:hAnsi="Inter"/>
+        <w:b w:val="0"/>
+        <w:bCs w:val="0"/>
+        <w:i w:val="0"/>
+        <w:iCs w:val="0"/>
+        <w:smallCaps w:val="0"/>
+        <w:strike w:val="0"/>
+        <w:sz w:val="20"/>
+        <w:szCs w:val="20"/>
+        <w:shd w:fill="auto" w:val="clear"/>
+        <w:vertAlign w:val="baseline"/>
       </w:rPr>
     </w:lvl>
     <w:lvl w:ilvl="8">
       <w:start w:val="1"/>
       <w:numFmt w:val="bullet"/>
-      <w:lvlText w:val=""/>
+      <w:lvlText w:val="•"/>
       <w:lvlJc w:val="left"/>
       <w:pPr>
-        <w:ind w:left="0" w:firstLine="0"/>
+        <w:ind w:left="6120" w:hanging="360"/>
       </w:pPr>
       <w:rPr>
-        <w:u w:val="none"/>
+        <w:rFonts w:ascii="Inter" w:cs="Inter" w:eastAsia="Inter" w:hAnsi="Inter"/>
+        <w:b w:val="0"/>
+        <w:bCs w:val="0"/>
+        <w:i w:val="0"/>
+        <w:iCs w:val="0"/>
+        <w:smallCaps w:val="0"/>
+        <w:strike w:val="0"/>
+        <w:sz w:val="20"/>
+        <w:szCs w:val="20"/>
+        <w:shd w:fill="auto" w:val="clear"/>
+        <w:vertAlign w:val="baseline"/>
       </w:rPr>
     </w:lvl>
   </w:abstractNum>
@@ -479,16 +1780,13 @@
   <w:docDefaults>
     <w:rPrDefault>
       <w:rPr>
-        <w:rFonts w:ascii="Cambria" w:cs="Cambria" w:eastAsia="Cambria" w:hAnsi="Cambria"/>
-        <w:sz w:val="22"/>
-        <w:szCs w:val="22"/>
+        <w:sz w:val="24"/>
+        <w:szCs w:val="24"/>
         <w:lang w:val="en"/>
       </w:rPr>
     </w:rPrDefault>
     <w:pPrDefault>
-      <w:pPr>
-        <w:spacing w:after="200" w:line="276" w:lineRule="auto"/>
-      </w:pPr>
+      <w:pPr/>
     </w:pPrDefault>
   </w:docDefaults>
   <w:style w:type="table" w:styleId="TableNormal" w:default="1">
@@ -512,15 +1810,14 @@
     <w:pPr>
       <w:keepNext w:val="1"/>
       <w:keepLines w:val="1"/>
-      <w:spacing w:after="0" w:before="480" w:lineRule="auto"/>
+      <w:pageBreakBefore w:val="0"/>
+      <w:spacing w:after="120" w:before="480" w:lineRule="auto"/>
     </w:pPr>
     <w:rPr>
-      <w:rFonts w:ascii="Calibri" w:cs="Calibri" w:eastAsia="Calibri" w:hAnsi="Calibri"/>
       <w:b w:val="1"/>
       <w:bCs w:val="1"/>
-      <w:color w:val="366091"/>
-      <w:sz w:val="28"/>
-      <w:szCs w:val="28"/>
+      <w:sz w:val="48"/>
+      <w:szCs w:val="48"/>
     </w:rPr>
   </w:style>
   <w:style w:type="paragraph" w:styleId="Heading2">
@@ -530,15 +1827,14 @@
     <w:pPr>
       <w:keepNext w:val="1"/>
       <w:keepLines w:val="1"/>
-      <w:spacing w:after="0" w:before="200" w:lineRule="auto"/>
+      <w:pageBreakBefore w:val="0"/>
+      <w:spacing w:after="80" w:before="360" w:lineRule="auto"/>
     </w:pPr>
     <w:rPr>
-      <w:rFonts w:ascii="Calibri" w:cs="Calibri" w:eastAsia="Calibri" w:hAnsi="Calibri"/>
       <w:b w:val="1"/>
       <w:bCs w:val="1"/>
-      <w:color w:val="4f81bd"/>
-      <w:sz w:val="26"/>
-      <w:szCs w:val="26"/>
+      <w:sz w:val="36"/>
+      <w:szCs w:val="36"/>
     </w:rPr>
   </w:style>
   <w:style w:type="paragraph" w:styleId="Heading3">
@@ -548,13 +1844,14 @@
     <w:pPr>
       <w:keepNext w:val="1"/>
       <w:keepLines w:val="1"/>
-      <w:spacing w:after="0" w:before="200" w:lineRule="auto"/>
+      <w:pageBreakBefore w:val="0"/>
+      <w:spacing w:after="80" w:before="280" w:lineRule="auto"/>
     </w:pPr>
     <w:rPr>
-      <w:rFonts w:ascii="Calibri" w:cs="Calibri" w:eastAsia="Calibri" w:hAnsi="Calibri"/>
       <w:b w:val="1"/>
       <w:bCs w:val="1"/>
-      <w:color w:val="4f81bd"/>
+      <w:sz w:val="28"/>
+      <w:szCs w:val="28"/>
     </w:rPr>
   </w:style>
   <w:style w:type="paragraph" w:styleId="Heading4">
@@ -564,15 +1861,14 @@
     <w:pPr>
       <w:keepNext w:val="1"/>
       <w:keepLines w:val="1"/>
-      <w:spacing w:after="0" w:before="200" w:lineRule="auto"/>
+      <w:pageBreakBefore w:val="0"/>
+      <w:spacing w:after="40" w:before="240" w:lineRule="auto"/>
     </w:pPr>
     <w:rPr>
-      <w:rFonts w:ascii="Calibri" w:cs="Calibri" w:eastAsia="Calibri" w:hAnsi="Calibri"/>
       <w:b w:val="1"/>
       <w:bCs w:val="1"/>
-      <w:i w:val="1"/>
-      <w:iCs w:val="1"/>
-      <w:color w:val="4f81bd"/>
+      <w:sz w:val="24"/>
+      <w:szCs w:val="24"/>
     </w:rPr>
   </w:style>
   <w:style w:type="paragraph" w:styleId="Heading5">
@@ -582,11 +1878,14 @@
     <w:pPr>
       <w:keepNext w:val="1"/>
       <w:keepLines w:val="1"/>
-      <w:spacing w:after="0" w:before="200" w:lineRule="auto"/>
+      <w:pageBreakBefore w:val="0"/>
+      <w:spacing w:after="40" w:before="220" w:lineRule="auto"/>
     </w:pPr>
     <w:rPr>
-      <w:rFonts w:ascii="Calibri" w:cs="Calibri" w:eastAsia="Calibri" w:hAnsi="Calibri"/>
-      <w:color w:val="243f61"/>
+      <w:b w:val="1"/>
+      <w:bCs w:val="1"/>
+      <w:sz w:val="22"/>
+      <w:szCs w:val="22"/>
     </w:rPr>
   </w:style>
   <w:style w:type="paragraph" w:styleId="Heading6">
@@ -596,13 +1895,14 @@
     <w:pPr>
       <w:keepNext w:val="1"/>
       <w:keepLines w:val="1"/>
-      <w:spacing w:after="0" w:before="200" w:lineRule="auto"/>
+      <w:pageBreakBefore w:val="0"/>
+      <w:spacing w:after="40" w:before="200" w:lineRule="auto"/>
     </w:pPr>
     <w:rPr>
-      <w:rFonts w:ascii="Calibri" w:cs="Calibri" w:eastAsia="Calibri" w:hAnsi="Calibri"/>
-      <w:i w:val="1"/>
-      <w:iCs w:val="1"/>
-      <w:color w:val="243f61"/>
+      <w:b w:val="1"/>
+      <w:bCs w:val="1"/>
+      <w:sz w:val="20"/>
+      <w:szCs w:val="20"/>
     </w:rPr>
   </w:style>
   <w:style w:type="paragraph" w:styleId="Title">
@@ -610,30 +1910,35 @@
     <w:basedOn w:val="Normal"/>
     <w:next w:val="Normal"/>
     <w:pPr>
-      <w:pBdr>
-        <w:bottom w:color="4f81bd" w:space="4" w:sz="8" w:val="single"/>
-      </w:pBdr>
-      <w:spacing w:after="300" w:line="240" w:lineRule="auto"/>
+      <w:keepNext w:val="1"/>
+      <w:keepLines w:val="1"/>
+      <w:pageBreakBefore w:val="0"/>
+      <w:spacing w:after="120" w:before="480" w:lineRule="auto"/>
     </w:pPr>
     <w:rPr>
-      <w:rFonts w:ascii="Calibri" w:cs="Calibri" w:eastAsia="Calibri" w:hAnsi="Calibri"/>
-      <w:color w:val="17365d"/>
-      <w:sz w:val="52"/>
-      <w:szCs w:val="52"/>
+      <w:b w:val="1"/>
+      <w:bCs w:val="1"/>
+      <w:sz w:val="72"/>
+      <w:szCs w:val="72"/>
     </w:rPr>
   </w:style>
   <w:style w:type="paragraph" w:styleId="Subtitle">
     <w:name w:val="Subtitle"/>
     <w:basedOn w:val="Normal"/>
     <w:next w:val="Normal"/>
-    <w:pPr/>
+    <w:pPr>
+      <w:keepNext w:val="1"/>
+      <w:keepLines w:val="1"/>
+      <w:pageBreakBefore w:val="0"/>
+      <w:spacing w:after="80" w:before="360" w:lineRule="auto"/>
+    </w:pPr>
     <w:rPr>
-      <w:rFonts w:ascii="Calibri" w:cs="Calibri" w:eastAsia="Calibri" w:hAnsi="Calibri"/>
+      <w:rFonts w:ascii="Inter" w:cs="Inter" w:eastAsia="Inter" w:hAnsi="Inter"/>
       <w:i w:val="1"/>
       <w:iCs w:val="1"/>
-      <w:color w:val="4f81bd"/>
-      <w:sz w:val="24"/>
-      <w:szCs w:val="24"/>
+      <w:color w:val="666666"/>
+      <w:sz w:val="48"/>
+      <w:szCs w:val="48"/>
     </w:rPr>
   </w:style>
 </w:styles>
@@ -682,7 +1987,7 @@
     </a:clrScheme>
     <a:fontScheme name="Office">
       <a:majorFont>
-        <a:latin typeface="Calibri"/>
+        <a:latin typeface="Inter"/>
         <a:ea typeface=""/>
         <a:cs typeface=""/>
         <a:font script="Jpan" typeface="ＭＳ ゴシック"/>
@@ -717,15 +2022,15 @@
         <a:font script="Geor" typeface="Sylfaen"/>
       </a:majorFont>
       <a:minorFont>
-        <a:latin typeface="Cambria"/>
+        <a:latin typeface="Inter"/>
         <a:ea typeface=""/>
         <a:cs typeface=""/>
         <a:font script="Jpan" typeface="ＭＳ 明朝"/>
         <a:font script="Hang" typeface="맑은 고딕"/>
         <a:font script="Hans" typeface="宋体"/>
         <a:font script="Hant" typeface="新細明體"/>
-        <a:font script="Arab" typeface="Arial"/>
-        <a:font script="Hebr" typeface="Arial"/>
+        <a:font script="Arab" typeface="Inter"/>
+        <a:font script="Hebr" typeface="Inter"/>
         <a:font script="Thai" typeface="Cordia New"/>
         <a:font script="Ethi" typeface="Nyala"/>
         <a:font script="Beng" typeface="Vrinda"/>
@@ -747,7 +2052,7 @@
         <a:font script="Laoo" typeface="DokChampa"/>
         <a:font script="Sinh" typeface="Iskoola Pota"/>
         <a:font script="Mong" typeface="Mongolian Baiti"/>
-        <a:font script="Viet" typeface="Arial"/>
+        <a:font script="Viet" typeface="Inter"/>
         <a:font script="Uigh" typeface="Microsoft Uighur"/>
         <a:font script="Geor" typeface="Sylfaen"/>
       </a:minorFont>

</xml_diff>

<commit_message>
Restyle DOCX packet with Inter and tighter resume layout.
Co-authored-by: Cursor <cursoragent@cursor.com>
</commit_message>
<xml_diff>
--- a/server/assets/template.docx
+++ b/server/assets/template.docx
@@ -4,68 +4,152 @@
   <w:body>
     <w:p>
       <w:pPr>
-        <w:spacing w:line="240" w:lineRule="auto"/>
-        <w:rPr/>
-      </w:pPr>
-      <w:r>
-        <w:rPr>
-          <w:rtl w:val="0"/>
+        <w:spacing w:after="80" w:before="0" w:line="276" w:lineRule="auto"/>
+        <w:jc w:val="left"/>
+        <w:rPr>
+          <w:rFonts w:ascii="Inter" w:hAnsi="Inter" w:cs="Inter" w:eastAsia="Inter"/>
+          <w:b/>
+          <w:bCs/>
+          <w:i w:val="0"/>
+          <w:iCs w:val="0"/>
+          <w:caps/>
+          <w:color w:val="333333"/>
+          <w:sz w:val="40"/>
+          <w:szCs w:val="40"/>
+        </w:rPr>
+      </w:pPr>
+      <w:r>
+        <w:rPr>
+          <w:rFonts w:ascii="Inter" w:hAnsi="Inter" w:cs="Inter" w:eastAsia="Inter"/>
+          <w:b/>
+          <w:bCs/>
+          <w:i w:val="0"/>
+          <w:iCs w:val="0"/>
+          <w:caps/>
+          <w:color w:val="333333"/>
+          <w:sz w:val="40"/>
+          <w:szCs w:val="40"/>
         </w:rPr>
         <w:t xml:space="preserve">{candidate_first_name} {candidate_last_name}, RN</w:t>
       </w:r>
     </w:p>
     <w:p>
       <w:pPr>
-        <w:spacing w:line="240" w:lineRule="auto"/>
-        <w:rPr/>
-      </w:pPr>
-      <w:r>
-        <w:rPr>
-          <w:rtl w:val="0"/>
+        <w:spacing w:after="40" w:before="0" w:line="276" w:lineRule="auto"/>
+        <w:jc w:val="left"/>
+        <w:rPr>
+          <w:rFonts w:ascii="Inter" w:hAnsi="Inter" w:cs="Inter" w:eastAsia="Inter"/>
+          <w:b w:val="0"/>
+          <w:bCs w:val="0"/>
+          <w:i w:val="0"/>
+          <w:iCs w:val="0"/>
+          <w:color w:val="555555"/>
+          <w:sz w:val="20"/>
+          <w:szCs w:val="20"/>
+        </w:rPr>
+      </w:pPr>
+      <w:r>
+        <w:rPr>
+          <w:rFonts w:ascii="Inter" w:hAnsi="Inter" w:cs="Inter" w:eastAsia="Inter"/>
+          <w:b w:val="0"/>
+          <w:bCs w:val="0"/>
+          <w:i w:val="0"/>
+          <w:iCs w:val="0"/>
+          <w:color w:val="555555"/>
+          <w:sz w:val="20"/>
+          <w:szCs w:val="20"/>
         </w:rPr>
         <w:t xml:space="preserve">{candidate_phone} | {candidate_email}</w:t>
       </w:r>
     </w:p>
     <w:p>
       <w:pPr>
-        <w:spacing w:line="240" w:lineRule="auto"/>
-        <w:rPr/>
-      </w:pPr>
-      <w:r>
-        <w:rPr>
-          <w:rtl w:val="0"/>
+        <w:spacing w:after="360" w:before="0" w:line="276" w:lineRule="auto"/>
+        <w:jc w:val="left"/>
+        <w:rPr>
+          <w:rFonts w:ascii="Inter" w:hAnsi="Inter" w:cs="Inter" w:eastAsia="Inter"/>
+          <w:b w:val="0"/>
+          <w:bCs w:val="0"/>
+          <w:i w:val="0"/>
+          <w:iCs w:val="0"/>
+          <w:color w:val="555555"/>
+          <w:sz w:val="20"/>
+          <w:szCs w:val="20"/>
+        </w:rPr>
+      </w:pPr>
+      <w:r>
+        <w:rPr>
+          <w:rFonts w:ascii="Inter" w:hAnsi="Inter" w:cs="Inter" w:eastAsia="Inter"/>
+          <w:b w:val="0"/>
+          <w:bCs w:val="0"/>
+          <w:i w:val="0"/>
+          <w:iCs w:val="0"/>
+          <w:color w:val="555555"/>
+          <w:sz w:val="20"/>
+          <w:szCs w:val="20"/>
         </w:rPr>
         <w:t xml:space="preserve">{candidate_home_address}, {candidate_city}, {candidate_state}</w:t>
       </w:r>
     </w:p>
     <w:p>
       <w:pPr>
-        <w:rPr/>
-      </w:pPr>
-      <w:r>
-        <w:rPr>
-          <w:rtl w:val="0"/>
-        </w:rPr>
-      </w:r>
-    </w:p>
-    <w:p>
-      <w:pPr>
-        <w:rPr/>
-      </w:pPr>
-      <w:r>
-        <w:rPr>
-          <w:rtl w:val="0"/>
-        </w:rPr>
-        <w:t xml:space="preserve">PROFESSIONAL SNAPSHOT</w:t>
-      </w:r>
-    </w:p>
-    <w:p>
-      <w:pPr>
-        <w:rPr/>
-      </w:pPr>
-      <w:r>
-        <w:rPr>
-          <w:rtl w:val="0"/>
+        <w:pBdr>
+          <w:bottom w:val="single" w:sz="6" w:space="1" w:color="C0C0C0"/>
+        </w:pBdr>
+        <w:spacing w:after="120" w:before="280" w:line="276" w:lineRule="auto"/>
+        <w:jc w:val="left"/>
+        <w:rPr>
+          <w:rFonts w:ascii="Inter" w:hAnsi="Inter" w:cs="Inter" w:eastAsia="Inter"/>
+          <w:b/>
+          <w:bCs/>
+          <w:i w:val="0"/>
+          <w:iCs w:val="0"/>
+          <w:caps/>
+          <w:color w:val="333333"/>
+          <w:sz w:val="24"/>
+          <w:szCs w:val="24"/>
+        </w:rPr>
+      </w:pPr>
+      <w:r>
+        <w:rPr>
+          <w:rFonts w:ascii="Inter" w:hAnsi="Inter" w:cs="Inter" w:eastAsia="Inter"/>
+          <w:b/>
+          <w:bCs/>
+          <w:i w:val="0"/>
+          <w:iCs w:val="0"/>
+          <w:caps/>
+          <w:color w:val="333333"/>
+          <w:sz w:val="24"/>
+          <w:szCs w:val="24"/>
+        </w:rPr>
+        <w:t>PROFESSIONAL SNAPSHOT</w:t>
+      </w:r>
+    </w:p>
+    <w:p>
+      <w:pPr>
+        <w:spacing w:after="0" w:before="0" w:line="240" w:lineRule="auto"/>
+        <w:jc w:val="left"/>
+        <w:rPr>
+          <w:rFonts w:ascii="Inter" w:hAnsi="Inter" w:cs="Inter" w:eastAsia="Inter"/>
+          <w:b w:val="0"/>
+          <w:bCs w:val="0"/>
+          <w:i w:val="0"/>
+          <w:iCs w:val="0"/>
+          <w:color w:val="333333"/>
+          <w:sz w:val="21"/>
+          <w:szCs w:val="21"/>
+        </w:rPr>
+      </w:pPr>
+      <w:r>
+        <w:rPr>
+          <w:rFonts w:ascii="Inter" w:hAnsi="Inter" w:cs="Inter" w:eastAsia="Inter"/>
+          <w:b w:val="0"/>
+          <w:bCs w:val="0"/>
+          <w:i w:val="0"/>
+          <w:iCs w:val="0"/>
+          <w:color w:val="333333"/>
+          <w:sz w:val="21"/>
+          <w:szCs w:val="21"/>
         </w:rPr>
         <w:t xml:space="preserve">{#snapshot_lines}</w:t>
       </w:r>
@@ -76,54 +160,121 @@
           <w:ilvl w:val="0"/>
           <w:numId w:val="1"/>
         </w:numPr>
-        <w:ind w:left="360"/>
-      </w:pPr>
-      <w:r>
-        <w:rPr>
-          <w:rtl w:val="0"/>
+        <w:spacing w:after="60" w:before="0" w:line="276" w:lineRule="auto"/>
+        <w:jc w:val="left"/>
+        <w:rPr>
+          <w:rFonts w:ascii="Inter" w:hAnsi="Inter" w:cs="Inter" w:eastAsia="Inter"/>
+          <w:b w:val="0"/>
+          <w:bCs w:val="0"/>
+          <w:i w:val="0"/>
+          <w:iCs w:val="0"/>
+          <w:color w:val="333333"/>
+          <w:sz w:val="21"/>
+          <w:szCs w:val="21"/>
+        </w:rPr>
+      </w:pPr>
+      <w:r>
+        <w:rPr>
+          <w:rFonts w:ascii="Inter" w:hAnsi="Inter" w:cs="Inter" w:eastAsia="Inter"/>
+          <w:b w:val="0"/>
+          <w:bCs w:val="0"/>
+          <w:i w:val="0"/>
+          <w:iCs w:val="0"/>
+          <w:color w:val="333333"/>
+          <w:sz w:val="21"/>
+          <w:szCs w:val="21"/>
         </w:rPr>
         <w:t xml:space="preserve">{snapshot_line}</w:t>
       </w:r>
     </w:p>
     <w:p>
       <w:pPr>
-        <w:rPr/>
-      </w:pPr>
-      <w:r>
-        <w:rPr>
-          <w:rtl w:val="0"/>
+        <w:spacing w:after="0" w:before="0" w:line="240" w:lineRule="auto"/>
+        <w:jc w:val="left"/>
+        <w:rPr>
+          <w:rFonts w:ascii="Inter" w:hAnsi="Inter" w:cs="Inter" w:eastAsia="Inter"/>
+          <w:b w:val="0"/>
+          <w:bCs w:val="0"/>
+          <w:i w:val="0"/>
+          <w:iCs w:val="0"/>
+          <w:color w:val="333333"/>
+          <w:sz w:val="21"/>
+          <w:szCs w:val="21"/>
+        </w:rPr>
+      </w:pPr>
+      <w:r>
+        <w:rPr>
+          <w:rFonts w:ascii="Inter" w:hAnsi="Inter" w:cs="Inter" w:eastAsia="Inter"/>
+          <w:b w:val="0"/>
+          <w:bCs w:val="0"/>
+          <w:i w:val="0"/>
+          <w:iCs w:val="0"/>
+          <w:color w:val="333333"/>
+          <w:sz w:val="21"/>
+          <w:szCs w:val="21"/>
         </w:rPr>
         <w:t xml:space="preserve">{/snapshot_lines}</w:t>
       </w:r>
     </w:p>
     <w:p>
       <w:pPr>
-        <w:rPr/>
-      </w:pPr>
-      <w:r>
-        <w:rPr>
-          <w:rtl w:val="0"/>
-        </w:rPr>
-      </w:r>
-    </w:p>
-    <w:p>
-      <w:pPr>
-        <w:rPr/>
-      </w:pPr>
-      <w:r>
-        <w:rPr>
-          <w:rtl w:val="0"/>
-        </w:rPr>
-        <w:t xml:space="preserve">LICENSES &amp; CERTIFICATIONS</w:t>
-      </w:r>
-    </w:p>
-    <w:p>
-      <w:pPr>
-        <w:rPr/>
-      </w:pPr>
-      <w:r>
-        <w:rPr>
-          <w:rtl w:val="0"/>
+        <w:pBdr>
+          <w:bottom w:val="single" w:sz="6" w:space="1" w:color="C0C0C0"/>
+        </w:pBdr>
+        <w:spacing w:after="120" w:before="280" w:line="276" w:lineRule="auto"/>
+        <w:jc w:val="left"/>
+        <w:rPr>
+          <w:rFonts w:ascii="Inter" w:hAnsi="Inter" w:cs="Inter" w:eastAsia="Inter"/>
+          <w:b/>
+          <w:bCs/>
+          <w:i w:val="0"/>
+          <w:iCs w:val="0"/>
+          <w:caps/>
+          <w:color w:val="333333"/>
+          <w:sz w:val="24"/>
+          <w:szCs w:val="24"/>
+        </w:rPr>
+      </w:pPr>
+      <w:r>
+        <w:rPr>
+          <w:rFonts w:ascii="Inter" w:hAnsi="Inter" w:cs="Inter" w:eastAsia="Inter"/>
+          <w:b/>
+          <w:bCs/>
+          <w:i w:val="0"/>
+          <w:iCs w:val="0"/>
+          <w:caps/>
+          <w:color w:val="333333"/>
+          <w:sz w:val="24"/>
+          <w:szCs w:val="24"/>
+        </w:rPr>
+        <w:t>LICENSES &amp; CERTIFICATIONS</w:t>
+      </w:r>
+    </w:p>
+    <w:p>
+      <w:pPr>
+        <w:spacing w:after="0" w:before="0" w:line="240" w:lineRule="auto"/>
+        <w:jc w:val="left"/>
+        <w:rPr>
+          <w:rFonts w:ascii="Inter" w:hAnsi="Inter" w:cs="Inter" w:eastAsia="Inter"/>
+          <w:b w:val="0"/>
+          <w:bCs w:val="0"/>
+          <w:i w:val="0"/>
+          <w:iCs w:val="0"/>
+          <w:color w:val="333333"/>
+          <w:sz w:val="21"/>
+          <w:szCs w:val="21"/>
+        </w:rPr>
+      </w:pPr>
+      <w:r>
+        <w:rPr>
+          <w:rFonts w:ascii="Inter" w:hAnsi="Inter" w:cs="Inter" w:eastAsia="Inter"/>
+          <w:b w:val="0"/>
+          <w:bCs w:val="0"/>
+          <w:i w:val="0"/>
+          <w:iCs w:val="0"/>
+          <w:color w:val="333333"/>
+          <w:sz w:val="21"/>
+          <w:szCs w:val="21"/>
         </w:rPr>
         <w:t xml:space="preserve">{#licenses_list}</w:t>
       </w:r>
@@ -134,34 +285,87 @@
           <w:ilvl w:val="0"/>
           <w:numId w:val="1"/>
         </w:numPr>
-        <w:ind w:left="360"/>
-        <w:rPr/>
-      </w:pPr>
-      <w:r>
-        <w:rPr>
-          <w:rtl w:val="0"/>
+        <w:spacing w:after="60" w:before="0" w:line="276" w:lineRule="auto"/>
+        <w:jc w:val="left"/>
+        <w:rPr>
+          <w:rFonts w:ascii="Inter" w:hAnsi="Inter" w:cs="Inter" w:eastAsia="Inter"/>
+          <w:b w:val="0"/>
+          <w:bCs w:val="0"/>
+          <w:i w:val="0"/>
+          <w:iCs w:val="0"/>
+          <w:color w:val="333333"/>
+          <w:sz w:val="21"/>
+          <w:szCs w:val="21"/>
+        </w:rPr>
+      </w:pPr>
+      <w:r>
+        <w:rPr>
+          <w:rFonts w:ascii="Inter" w:hAnsi="Inter" w:cs="Inter" w:eastAsia="Inter"/>
+          <w:b w:val="0"/>
+          <w:bCs w:val="0"/>
+          <w:i w:val="0"/>
+          <w:iCs w:val="0"/>
+          <w:color w:val="333333"/>
+          <w:sz w:val="21"/>
+          <w:szCs w:val="21"/>
         </w:rPr>
         <w:t xml:space="preserve">{rn_license_state_and_expiry}</w:t>
       </w:r>
     </w:p>
     <w:p>
       <w:pPr>
-        <w:rPr/>
-      </w:pPr>
-      <w:r>
-        <w:rPr>
-          <w:rtl w:val="0"/>
+        <w:spacing w:after="0" w:before="0" w:line="240" w:lineRule="auto"/>
+        <w:jc w:val="left"/>
+        <w:rPr>
+          <w:rFonts w:ascii="Inter" w:hAnsi="Inter" w:cs="Inter" w:eastAsia="Inter"/>
+          <w:b w:val="0"/>
+          <w:bCs w:val="0"/>
+          <w:i w:val="0"/>
+          <w:iCs w:val="0"/>
+          <w:color w:val="333333"/>
+          <w:sz w:val="21"/>
+          <w:szCs w:val="21"/>
+        </w:rPr>
+      </w:pPr>
+      <w:r>
+        <w:rPr>
+          <w:rFonts w:ascii="Inter" w:hAnsi="Inter" w:cs="Inter" w:eastAsia="Inter"/>
+          <w:b w:val="0"/>
+          <w:bCs w:val="0"/>
+          <w:i w:val="0"/>
+          <w:iCs w:val="0"/>
+          <w:color w:val="333333"/>
+          <w:sz w:val="21"/>
+          <w:szCs w:val="21"/>
         </w:rPr>
         <w:t xml:space="preserve">{/licenses_list}</w:t>
       </w:r>
     </w:p>
     <w:p>
       <w:pPr>
-        <w:rPr/>
-      </w:pPr>
-      <w:r>
-        <w:rPr>
-          <w:rtl w:val="0"/>
+        <w:spacing w:after="0" w:before="0" w:line="240" w:lineRule="auto"/>
+        <w:jc w:val="left"/>
+        <w:rPr>
+          <w:rFonts w:ascii="Inter" w:hAnsi="Inter" w:cs="Inter" w:eastAsia="Inter"/>
+          <w:b w:val="0"/>
+          <w:bCs w:val="0"/>
+          <w:i w:val="0"/>
+          <w:iCs w:val="0"/>
+          <w:color w:val="333333"/>
+          <w:sz w:val="21"/>
+          <w:szCs w:val="21"/>
+        </w:rPr>
+      </w:pPr>
+      <w:r>
+        <w:rPr>
+          <w:rFonts w:ascii="Inter" w:hAnsi="Inter" w:cs="Inter" w:eastAsia="Inter"/>
+          <w:b w:val="0"/>
+          <w:bCs w:val="0"/>
+          <w:i w:val="0"/>
+          <w:iCs w:val="0"/>
+          <w:color w:val="333333"/>
+          <w:sz w:val="21"/>
+          <w:szCs w:val="21"/>
         </w:rPr>
         <w:t xml:space="preserve">{#certifications_list}</w:t>
       </w:r>
@@ -172,185 +376,697 @@
           <w:ilvl w:val="0"/>
           <w:numId w:val="1"/>
         </w:numPr>
-        <w:ind w:left="360"/>
-        <w:rPr/>
-      </w:pPr>
-      <w:r>
-        <w:rPr>
-          <w:rtl w:val="0"/>
+        <w:spacing w:after="60" w:before="0" w:line="276" w:lineRule="auto"/>
+        <w:jc w:val="left"/>
+        <w:rPr>
+          <w:rFonts w:ascii="Inter" w:hAnsi="Inter" w:cs="Inter" w:eastAsia="Inter"/>
+          <w:b w:val="0"/>
+          <w:bCs w:val="0"/>
+          <w:i w:val="0"/>
+          <w:iCs w:val="0"/>
+          <w:color w:val="333333"/>
+          <w:sz w:val="21"/>
+          <w:szCs w:val="21"/>
+        </w:rPr>
+      </w:pPr>
+      <w:r>
+        <w:rPr>
+          <w:rFonts w:ascii="Inter" w:hAnsi="Inter" w:cs="Inter" w:eastAsia="Inter"/>
+          <w:b w:val="0"/>
+          <w:bCs w:val="0"/>
+          <w:i w:val="0"/>
+          <w:iCs w:val="0"/>
+          <w:color w:val="333333"/>
+          <w:sz w:val="21"/>
+          <w:szCs w:val="21"/>
         </w:rPr>
         <w:t xml:space="preserve">{certification_name} | {certification_expiration_date}</w:t>
       </w:r>
     </w:p>
     <w:p>
       <w:pPr>
-        <w:rPr/>
-      </w:pPr>
-      <w:r>
-        <w:rPr>
-          <w:rtl w:val="0"/>
+        <w:spacing w:after="0" w:before="0" w:line="240" w:lineRule="auto"/>
+        <w:jc w:val="left"/>
+        <w:rPr>
+          <w:rFonts w:ascii="Inter" w:hAnsi="Inter" w:cs="Inter" w:eastAsia="Inter"/>
+          <w:b w:val="0"/>
+          <w:bCs w:val="0"/>
+          <w:i w:val="0"/>
+          <w:iCs w:val="0"/>
+          <w:color w:val="333333"/>
+          <w:sz w:val="21"/>
+          <w:szCs w:val="21"/>
+        </w:rPr>
+      </w:pPr>
+      <w:r>
+        <w:rPr>
+          <w:rFonts w:ascii="Inter" w:hAnsi="Inter" w:cs="Inter" w:eastAsia="Inter"/>
+          <w:b w:val="0"/>
+          <w:bCs w:val="0"/>
+          <w:i w:val="0"/>
+          <w:iCs w:val="0"/>
+          <w:color w:val="333333"/>
+          <w:sz w:val="21"/>
+          <w:szCs w:val="21"/>
         </w:rPr>
         <w:t xml:space="preserve">{/certifications_list}</w:t>
       </w:r>
     </w:p>
     <w:p>
       <w:pPr>
-        <w:rPr/>
-      </w:pPr>
-      <w:r>
-        <w:rPr>
-          <w:rtl w:val="0"/>
-        </w:rPr>
-        <w:t xml:space="preserve">EDUCATION</w:t>
-      </w:r>
-    </w:p>
-    <w:p>
-      <w:pPr>
-        <w:rPr/>
-      </w:pPr>
-      <w:r>
-        <w:rPr>
-          <w:rtl w:val="0"/>
+        <w:pBdr>
+          <w:bottom w:val="single" w:sz="6" w:space="1" w:color="C0C0C0"/>
+        </w:pBdr>
+        <w:spacing w:after="120" w:before="280" w:line="276" w:lineRule="auto"/>
+        <w:jc w:val="left"/>
+        <w:rPr>
+          <w:rFonts w:ascii="Inter" w:hAnsi="Inter" w:cs="Inter" w:eastAsia="Inter"/>
+          <w:b/>
+          <w:bCs/>
+          <w:i w:val="0"/>
+          <w:iCs w:val="0"/>
+          <w:caps/>
+          <w:color w:val="333333"/>
+          <w:sz w:val="24"/>
+          <w:szCs w:val="24"/>
+        </w:rPr>
+      </w:pPr>
+      <w:r>
+        <w:rPr>
+          <w:rFonts w:ascii="Inter" w:hAnsi="Inter" w:cs="Inter" w:eastAsia="Inter"/>
+          <w:b/>
+          <w:bCs/>
+          <w:i w:val="0"/>
+          <w:iCs w:val="0"/>
+          <w:caps/>
+          <w:color w:val="333333"/>
+          <w:sz w:val="24"/>
+          <w:szCs w:val="24"/>
+        </w:rPr>
+        <w:t>EDUCATION</w:t>
+      </w:r>
+    </w:p>
+    <w:p>
+      <w:pPr>
+        <w:spacing w:after="0" w:before="0" w:line="240" w:lineRule="auto"/>
+        <w:jc w:val="left"/>
+        <w:rPr>
+          <w:rFonts w:ascii="Inter" w:hAnsi="Inter" w:cs="Inter" w:eastAsia="Inter"/>
+          <w:b w:val="0"/>
+          <w:bCs w:val="0"/>
+          <w:i w:val="0"/>
+          <w:iCs w:val="0"/>
+          <w:color w:val="333333"/>
+          <w:sz w:val="21"/>
+          <w:szCs w:val="21"/>
+        </w:rPr>
+      </w:pPr>
+      <w:r>
+        <w:rPr>
+          <w:rFonts w:ascii="Inter" w:hAnsi="Inter" w:cs="Inter" w:eastAsia="Inter"/>
+          <w:b w:val="0"/>
+          <w:bCs w:val="0"/>
+          <w:i w:val="0"/>
+          <w:iCs w:val="0"/>
+          <w:color w:val="333333"/>
+          <w:sz w:val="21"/>
+          <w:szCs w:val="21"/>
         </w:rPr>
         <w:t xml:space="preserve">{#education}</w:t>
       </w:r>
     </w:p>
     <w:p>
       <w:pPr>
-        <w:rPr/>
-      </w:pPr>
-      <w:r>
-        <w:rPr>
-          <w:rtl w:val="0"/>
-        </w:rPr>
-        <w:t xml:space="preserve">{education_degree} | {education_school_name} |{education_graduation_year}</w:t>
-      </w:r>
-    </w:p>
-    <w:p>
-      <w:pPr>
-        <w:rPr/>
-      </w:pPr>
-      <w:r>
-        <w:rPr>
-          <w:rtl w:val="0"/>
-        </w:rPr>
-      </w:r>
-    </w:p>
-    <w:p>
-      <w:pPr>
-        <w:rPr/>
-      </w:pPr>
-      <w:r>
-        <w:rPr>
-          <w:rtl w:val="0"/>
+        <w:tabs>
+          <w:tab w:val="right" w:pos="8640"/>
+        </w:tabs>
+        <w:spacing w:after="40" w:before="120" w:line="276" w:lineRule="auto"/>
+        <w:jc w:val="left"/>
+        <w:rPr>
+          <w:rFonts w:ascii="Inter" w:hAnsi="Inter" w:cs="Inter" w:eastAsia="Inter"/>
+          <w:b/>
+          <w:bCs/>
+          <w:i w:val="0"/>
+          <w:iCs w:val="0"/>
+          <w:color w:val="333333"/>
+          <w:sz w:val="22"/>
+          <w:szCs w:val="22"/>
+        </w:rPr>
+      </w:pPr>
+      <w:r>
+        <w:rPr>
+          <w:rFonts w:ascii="Inter" w:hAnsi="Inter" w:cs="Inter" w:eastAsia="Inter"/>
+          <w:b/>
+          <w:bCs/>
+          <w:i w:val="0"/>
+          <w:iCs w:val="0"/>
+          <w:color w:val="333333"/>
+          <w:sz w:val="22"/>
+          <w:szCs w:val="22"/>
+        </w:rPr>
+        <w:t xml:space="preserve">{education_degree}</w:t>
+      </w:r>
+      <w:r>
+        <w:rPr>
+          <w:rFonts w:ascii="Inter" w:hAnsi="Inter" w:cs="Inter" w:eastAsia="Inter"/>
+          <w:b/>
+          <w:bCs/>
+          <w:i w:val="0"/>
+          <w:iCs w:val="0"/>
+          <w:color w:val="333333"/>
+          <w:sz w:val="22"/>
+          <w:szCs w:val="22"/>
+        </w:rPr>
+        <w:tab/>
+      </w:r>
+      <w:r>
+        <w:rPr>
+          <w:rFonts w:ascii="Inter" w:hAnsi="Inter" w:cs="Inter" w:eastAsia="Inter"/>
+          <w:b/>
+          <w:bCs/>
+          <w:i w:val="0"/>
+          <w:iCs w:val="0"/>
+          <w:color w:val="333333"/>
+          <w:sz w:val="22"/>
+          <w:szCs w:val="22"/>
+        </w:rPr>
+        <w:t xml:space="preserve">{education_graduation_year}</w:t>
+      </w:r>
+    </w:p>
+    <w:p>
+      <w:pPr>
+        <w:spacing w:after="220" w:before="0" w:line="276" w:lineRule="auto"/>
+        <w:jc w:val="left"/>
+        <w:rPr>
+          <w:rFonts w:ascii="Inter" w:hAnsi="Inter" w:cs="Inter" w:eastAsia="Inter"/>
+          <w:b w:val="0"/>
+          <w:bCs w:val="0"/>
+          <w:i/>
+          <w:iCs/>
+          <w:color w:val="555555"/>
+          <w:sz w:val="21"/>
+          <w:szCs w:val="21"/>
+        </w:rPr>
+      </w:pPr>
+      <w:r>
+        <w:rPr>
+          <w:rFonts w:ascii="Inter" w:hAnsi="Inter" w:cs="Inter" w:eastAsia="Inter"/>
+          <w:b w:val="0"/>
+          <w:bCs w:val="0"/>
+          <w:i/>
+          <w:iCs/>
+          <w:color w:val="555555"/>
+          <w:sz w:val="21"/>
+          <w:szCs w:val="21"/>
+        </w:rPr>
+        <w:t xml:space="preserve">{education_school_name}</w:t>
+      </w:r>
+    </w:p>
+    <w:p>
+      <w:pPr>
+        <w:spacing w:after="0" w:before="0" w:line="240" w:lineRule="auto"/>
+        <w:jc w:val="left"/>
+        <w:rPr>
+          <w:rFonts w:ascii="Inter" w:hAnsi="Inter" w:cs="Inter" w:eastAsia="Inter"/>
+          <w:b w:val="0"/>
+          <w:bCs w:val="0"/>
+          <w:i w:val="0"/>
+          <w:iCs w:val="0"/>
+          <w:color w:val="333333"/>
+          <w:sz w:val="21"/>
+          <w:szCs w:val="21"/>
+        </w:rPr>
+      </w:pPr>
+      <w:r>
+        <w:rPr>
+          <w:rFonts w:ascii="Inter" w:hAnsi="Inter" w:cs="Inter" w:eastAsia="Inter"/>
+          <w:b w:val="0"/>
+          <w:bCs w:val="0"/>
+          <w:i w:val="0"/>
+          <w:iCs w:val="0"/>
+          <w:color w:val="333333"/>
+          <w:sz w:val="21"/>
+          <w:szCs w:val="21"/>
         </w:rPr>
         <w:t xml:space="preserve">{/education}</w:t>
       </w:r>
     </w:p>
     <w:p>
       <w:pPr>
-        <w:rPr/>
-      </w:pPr>
-      <w:r>
-        <w:rPr>
-          <w:rtl w:val="0"/>
-        </w:rPr>
-      </w:r>
-    </w:p>
-    <w:p>
-      <w:pPr>
-        <w:rPr/>
-      </w:pPr>
-      <w:r>
-        <w:rPr>
-          <w:rtl w:val="0"/>
-        </w:rPr>
-        <w:t xml:space="preserve">PROFESSIONAL EXPERIENCE</w:t>
-      </w:r>
-    </w:p>
-    <w:p>
-      <w:pPr>
-        <w:rPr/>
-      </w:pPr>
-      <w:r>
-        <w:rPr>
-          <w:rtl w:val="0"/>
+        <w:pBdr>
+          <w:bottom w:val="single" w:sz="6" w:space="1" w:color="C0C0C0"/>
+        </w:pBdr>
+        <w:spacing w:after="120" w:before="280" w:line="276" w:lineRule="auto"/>
+        <w:jc w:val="left"/>
+        <w:rPr>
+          <w:rFonts w:ascii="Inter" w:hAnsi="Inter" w:cs="Inter" w:eastAsia="Inter"/>
+          <w:b/>
+          <w:bCs/>
+          <w:i w:val="0"/>
+          <w:iCs w:val="0"/>
+          <w:caps/>
+          <w:color w:val="333333"/>
+          <w:sz w:val="24"/>
+          <w:szCs w:val="24"/>
+        </w:rPr>
+      </w:pPr>
+      <w:r>
+        <w:rPr>
+          <w:rFonts w:ascii="Inter" w:hAnsi="Inter" w:cs="Inter" w:eastAsia="Inter"/>
+          <w:b/>
+          <w:bCs/>
+          <w:i w:val="0"/>
+          <w:iCs w:val="0"/>
+          <w:caps/>
+          <w:color w:val="333333"/>
+          <w:sz w:val="24"/>
+          <w:szCs w:val="24"/>
+        </w:rPr>
+        <w:t>PROFESSIONAL EXPERIENCE</w:t>
+      </w:r>
+    </w:p>
+    <w:p>
+      <w:pPr>
+        <w:spacing w:after="0" w:before="0" w:line="240" w:lineRule="auto"/>
+        <w:jc w:val="left"/>
+        <w:rPr>
+          <w:rFonts w:ascii="Inter" w:hAnsi="Inter" w:cs="Inter" w:eastAsia="Inter"/>
+          <w:b w:val="0"/>
+          <w:bCs w:val="0"/>
+          <w:i w:val="0"/>
+          <w:iCs w:val="0"/>
+          <w:color w:val="333333"/>
+          <w:sz w:val="21"/>
+          <w:szCs w:val="21"/>
+        </w:rPr>
+      </w:pPr>
+      <w:r>
+        <w:rPr>
+          <w:rFonts w:ascii="Inter" w:hAnsi="Inter" w:cs="Inter" w:eastAsia="Inter"/>
+          <w:b w:val="0"/>
+          <w:bCs w:val="0"/>
+          <w:i w:val="0"/>
+          <w:iCs w:val="0"/>
+          <w:color w:val="333333"/>
+          <w:sz w:val="21"/>
+          <w:szCs w:val="21"/>
         </w:rPr>
         <w:t xml:space="preserve">{#professional_experiences}</w:t>
       </w:r>
     </w:p>
     <w:p>
       <w:pPr>
-        <w:rPr/>
-      </w:pPr>
-      <w:r>
-        <w:rPr>
-          <w:rtl w:val="0"/>
+        <w:tabs>
+          <w:tab w:val="right" w:pos="8640"/>
+        </w:tabs>
+        <w:spacing w:after="40" w:before="0" w:line="276" w:lineRule="auto"/>
+        <w:jc w:val="left"/>
+        <w:rPr>
+          <w:rFonts w:ascii="Inter" w:hAnsi="Inter" w:cs="Inter" w:eastAsia="Inter"/>
+          <w:b/>
+          <w:bCs/>
+          <w:i w:val="0"/>
+          <w:iCs w:val="0"/>
+          <w:color w:val="333333"/>
+          <w:sz w:val="22"/>
+          <w:szCs w:val="22"/>
+        </w:rPr>
+      </w:pPr>
+      <w:r>
+        <w:rPr>
+          <w:rFonts w:ascii="Inter" w:hAnsi="Inter" w:cs="Inter" w:eastAsia="Inter"/>
+          <w:b/>
+          <w:bCs/>
+          <w:i w:val="0"/>
+          <w:iCs w:val="0"/>
+          <w:color w:val="333333"/>
+          <w:sz w:val="22"/>
+          <w:szCs w:val="22"/>
         </w:rPr>
         <w:t xml:space="preserve">RN - {experience_unit_specialty}</w:t>
       </w:r>
-    </w:p>
-    <w:p>
-      <w:pPr>
-        <w:rPr/>
-      </w:pPr>
-      <w:r>
-        <w:rPr>
-          <w:rtl w:val="0"/>
+      <w:r>
+        <w:rPr>
+          <w:rFonts w:ascii="Inter" w:hAnsi="Inter" w:cs="Inter" w:eastAsia="Inter"/>
+          <w:b w:val="0"/>
+          <w:bCs w:val="0"/>
+          <w:i w:val="0"/>
+          <w:iCs w:val="0"/>
+          <w:color w:val="555555"/>
+          <w:sz w:val="22"/>
+          <w:szCs w:val="22"/>
+        </w:rPr>
+        <w:tab/>
+      </w:r>
+      <w:r>
+        <w:rPr>
+          <w:rFonts w:ascii="Inter" w:hAnsi="Inter" w:cs="Inter" w:eastAsia="Inter"/>
+          <w:b w:val="0"/>
+          <w:bCs w:val="0"/>
+          <w:i w:val="0"/>
+          <w:iCs w:val="0"/>
+          <w:color w:val="555555"/>
+          <w:sz w:val="22"/>
+          <w:szCs w:val="22"/>
+        </w:rPr>
+        <w:t xml:space="preserve">{experience_employment_dates}</w:t>
+      </w:r>
+    </w:p>
+    <w:p>
+      <w:pPr>
+        <w:spacing w:after="0" w:before="0" w:line="240" w:lineRule="auto"/>
+        <w:jc w:val="left"/>
+        <w:rPr>
+          <w:rFonts w:ascii="Inter" w:hAnsi="Inter" w:cs="Inter" w:eastAsia="Inter"/>
+          <w:b w:val="0"/>
+          <w:bCs w:val="0"/>
+          <w:i w:val="0"/>
+          <w:iCs w:val="0"/>
+          <w:color w:val="333333"/>
+          <w:sz w:val="20"/>
+          <w:szCs w:val="20"/>
+        </w:rPr>
+      </w:pPr>
+      <w:r>
+        <w:rPr>
+          <w:rFonts w:ascii="Inter" w:hAnsi="Inter" w:cs="Inter" w:eastAsia="Inter"/>
+          <w:b w:val="0"/>
+          <w:bCs w:val="0"/>
+          <w:i w:val="0"/>
+          <w:iCs w:val="0"/>
+          <w:color w:val="333333"/>
+          <w:sz w:val="20"/>
+          <w:szCs w:val="20"/>
+        </w:rPr>
+        <w:t xml:space="preserve">{#experience_metrics_rows}</w:t>
+      </w:r>
+    </w:p>
+    <w:p>
+      <w:pPr>
+        <w:spacing w:after="60" w:before="0" w:line="276" w:lineRule="auto"/>
+        <w:jc w:val="left"/>
+        <w:rPr>
+          <w:rFonts w:ascii="Inter" w:hAnsi="Inter" w:cs="Inter" w:eastAsia="Inter"/>
+          <w:b w:val="0"/>
+          <w:bCs w:val="0"/>
+          <w:i/>
+          <w:iCs/>
+          <w:color w:val="555555"/>
+          <w:sz w:val="21"/>
+          <w:szCs w:val="21"/>
+        </w:rPr>
+      </w:pPr>
+      <w:r>
+        <w:rPr>
+          <w:rFonts w:ascii="Inter" w:hAnsi="Inter" w:cs="Inter" w:eastAsia="Inter"/>
+          <w:b w:val="0"/>
+          <w:bCs w:val="0"/>
+          <w:i/>
+          <w:iCs/>
+          <w:color w:val="555555"/>
+          <w:sz w:val="21"/>
+          <w:szCs w:val="21"/>
         </w:rPr>
         <w:t xml:space="preserve">{experience_hospital_name} | {experience_facility_location}</w:t>
       </w:r>
     </w:p>
     <w:p>
       <w:pPr>
-        <w:rPr/>
-      </w:pPr>
-      <w:r>
-        <w:rPr>
-          <w:rtl w:val="0"/>
-        </w:rPr>
-        <w:t xml:space="preserve">{experience_employment_dates}</w:t>
-      </w:r>
-    </w:p>
-    <w:p>
-      <w:pPr>
-        <w:rPr/>
-      </w:pPr>
-      <w:r>
-        <w:rPr>
-          <w:rtl w:val="0"/>
+        <w:spacing w:after="120" w:before="0" w:line="276" w:lineRule="auto"/>
+        <w:jc w:val="left"/>
+        <w:rPr>
+          <w:rFonts w:ascii="Inter" w:hAnsi="Inter" w:cs="Inter" w:eastAsia="Inter"/>
+          <w:b w:val="0"/>
+          <w:bCs w:val="0"/>
+          <w:i w:val="0"/>
+          <w:iCs w:val="0"/>
+          <w:color w:val="333333"/>
+          <w:sz w:val="20"/>
+          <w:szCs w:val="20"/>
+        </w:rPr>
+      </w:pPr>
+      <w:r>
+        <w:rPr>
+          <w:rFonts w:ascii="Inter" w:hAnsi="Inter" w:cs="Inter" w:eastAsia="Inter"/>
+          <w:b w:val="0"/>
+          <w:bCs w:val="0"/>
+          <w:i w:val="0"/>
+          <w:iCs w:val="0"/>
+          <w:color w:val="333333"/>
+          <w:sz w:val="20"/>
+          <w:szCs w:val="20"/>
         </w:rPr>
         <w:t xml:space="preserve">{experience_metrics_line}</w:t>
       </w:r>
     </w:p>
     <w:p>
       <w:pPr>
-        <w:rPr/>
-      </w:pPr>
-      <w:r>
-        <w:rPr>
-          <w:rtl w:val="0"/>
-        </w:rPr>
-      </w:r>
-    </w:p>
-    <w:p>
-      <w:pPr>
-        <w:rPr/>
-      </w:pPr>
-      <w:r>
-        <w:rPr>
-          <w:rtl w:val="0"/>
+        <w:spacing w:after="0" w:before="0" w:line="240" w:lineRule="auto"/>
+        <w:jc w:val="left"/>
+        <w:rPr>
+          <w:rFonts w:ascii="Inter" w:hAnsi="Inter" w:cs="Inter" w:eastAsia="Inter"/>
+          <w:b w:val="0"/>
+          <w:bCs w:val="0"/>
+          <w:i w:val="0"/>
+          <w:iCs w:val="0"/>
+          <w:color w:val="333333"/>
+          <w:sz w:val="20"/>
+          <w:szCs w:val="20"/>
+        </w:rPr>
+      </w:pPr>
+      <w:r>
+        <w:rPr>
+          <w:rFonts w:ascii="Inter" w:hAnsi="Inter" w:cs="Inter" w:eastAsia="Inter"/>
+          <w:b w:val="0"/>
+          <w:bCs w:val="0"/>
+          <w:i w:val="0"/>
+          <w:iCs w:val="0"/>
+          <w:color w:val="333333"/>
+          <w:sz w:val="20"/>
+          <w:szCs w:val="20"/>
+        </w:rPr>
+        <w:t xml:space="preserve">{/experience_metrics_rows}</w:t>
+      </w:r>
+    </w:p>
+    <w:p>
+      <w:pPr>
+        <w:spacing w:after="0" w:before="0" w:line="240" w:lineRule="auto"/>
+        <w:jc w:val="left"/>
+        <w:rPr>
+          <w:rFonts w:ascii="Inter" w:hAnsi="Inter" w:cs="Inter" w:eastAsia="Inter"/>
+          <w:b w:val="0"/>
+          <w:bCs w:val="0"/>
+          <w:i w:val="0"/>
+          <w:iCs w:val="0"/>
+          <w:color w:val="333333"/>
+          <w:sz w:val="21"/>
+          <w:szCs w:val="21"/>
+        </w:rPr>
+      </w:pPr>
+      <w:r>
+        <w:rPr>
+          <w:rFonts w:ascii="Inter" w:hAnsi="Inter" w:cs="Inter" w:eastAsia="Inter"/>
+          <w:b w:val="0"/>
+          <w:bCs w:val="0"/>
+          <w:i w:val="0"/>
+          <w:iCs w:val="0"/>
+          <w:color w:val="333333"/>
+          <w:sz w:val="21"/>
+          <w:szCs w:val="21"/>
+        </w:rPr>
+        <w:t xml:space="preserve">{^experience_metrics_rows}</w:t>
+      </w:r>
+    </w:p>
+    <w:p>
+      <w:pPr>
+        <w:spacing w:after="120" w:before="0" w:line="276" w:lineRule="auto"/>
+        <w:jc w:val="left"/>
+        <w:rPr>
+          <w:rFonts w:ascii="Inter" w:hAnsi="Inter" w:cs="Inter" w:eastAsia="Inter"/>
+          <w:b w:val="0"/>
+          <w:bCs w:val="0"/>
+          <w:i/>
+          <w:iCs/>
+          <w:color w:val="555555"/>
+          <w:sz w:val="21"/>
+          <w:szCs w:val="21"/>
+        </w:rPr>
+      </w:pPr>
+      <w:r>
+        <w:rPr>
+          <w:rFonts w:ascii="Inter" w:hAnsi="Inter" w:cs="Inter" w:eastAsia="Inter"/>
+          <w:b w:val="0"/>
+          <w:bCs w:val="0"/>
+          <w:i/>
+          <w:iCs/>
+          <w:color w:val="555555"/>
+          <w:sz w:val="21"/>
+          <w:szCs w:val="21"/>
+        </w:rPr>
+        <w:t xml:space="preserve">{experience_hospital_name} | {experience_facility_location}</w:t>
+      </w:r>
+    </w:p>
+    <w:p>
+      <w:pPr>
+        <w:spacing w:after="0" w:before="0" w:line="240" w:lineRule="auto"/>
+        <w:jc w:val="left"/>
+        <w:rPr>
+          <w:rFonts w:ascii="Inter" w:hAnsi="Inter" w:cs="Inter" w:eastAsia="Inter"/>
+          <w:b w:val="0"/>
+          <w:bCs w:val="0"/>
+          <w:i w:val="0"/>
+          <w:iCs w:val="0"/>
+          <w:color w:val="333333"/>
+          <w:sz w:val="21"/>
+          <w:szCs w:val="21"/>
+        </w:rPr>
+      </w:pPr>
+      <w:r>
+        <w:rPr>
+          <w:rFonts w:ascii="Inter" w:hAnsi="Inter" w:cs="Inter" w:eastAsia="Inter"/>
+          <w:b w:val="0"/>
+          <w:bCs w:val="0"/>
+          <w:i w:val="0"/>
+          <w:iCs w:val="0"/>
+          <w:color w:val="333333"/>
+          <w:sz w:val="21"/>
+          <w:szCs w:val="21"/>
+        </w:rPr>
+        <w:t xml:space="preserve">{/experience_metrics_rows}</w:t>
+      </w:r>
+    </w:p>
+    <w:p>
+      <w:pPr>
+        <w:spacing w:after="0" w:before="0" w:line="240" w:lineRule="auto"/>
+        <w:jc w:val="left"/>
+        <w:rPr>
+          <w:rFonts w:ascii="Inter" w:hAnsi="Inter" w:cs="Inter" w:eastAsia="Inter"/>
+          <w:b w:val="0"/>
+          <w:bCs w:val="0"/>
+          <w:i w:val="0"/>
+          <w:iCs w:val="0"/>
+          <w:color w:val="333333"/>
+          <w:sz w:val="21"/>
+          <w:szCs w:val="21"/>
+        </w:rPr>
+      </w:pPr>
+      <w:r>
+        <w:rPr>
+          <w:rFonts w:ascii="Inter" w:hAnsi="Inter" w:cs="Inter" w:eastAsia="Inter"/>
+          <w:b w:val="0"/>
+          <w:bCs w:val="0"/>
+          <w:i w:val="0"/>
+          <w:iCs w:val="0"/>
+          <w:color w:val="333333"/>
+          <w:sz w:val="21"/>
+          <w:szCs w:val="21"/>
         </w:rPr>
         <w:t xml:space="preserve">{/professional_experiences}</w:t>
       </w:r>
     </w:p>
     <w:sectPr>
+      <w:headerReference r:id="rId6" w:type="default"/>
+      <w:footerReference r:id="rId7" w:type="default"/>
       <w:pgSz w:h="15840" w:w="12240" w:orient="portrait"/>
       <w:pgMar w:bottom="1440" w:top="1440" w:left="1800" w:right="1800" w:header="720" w:footer="720"/>
       <w:pgNumType w:start="1"/>
     </w:sectPr>
   </w:body>
 </w:document>
+</file>
+
+<file path=word/footer1.xml><?xml version="1.0" encoding="utf-8"?>
+<w:ftr xmlns:mc="http://schemas.openxmlformats.org/markup-compatibility/2006" xmlns:o="urn:schemas-microsoft-com:office:office" xmlns:r="http://schemas.openxmlformats.org/officeDocument/2006/relationships" xmlns:m="http://schemas.openxmlformats.org/officeDocument/2006/math" xmlns:v="urn:schemas-microsoft-com:vml" xmlns:wp="http://schemas.openxmlformats.org/drawingml/2006/wordprocessingDrawing" xmlns:w10="urn:schemas-microsoft-com:office:word" xmlns:w="http://schemas.openxmlformats.org/wordprocessingml/2006/main" xmlns:wne="http://schemas.microsoft.com/office/word/2006/wordml" xmlns:sl="http://schemas.openxmlformats.org/schemaLibrary/2006/main" xmlns:a="http://schemas.openxmlformats.org/drawingml/2006/main" xmlns:pic="http://schemas.openxmlformats.org/drawingml/2006/picture" xmlns:c="http://schemas.openxmlformats.org/drawingml/2006/chart" xmlns:lc="http://schemas.openxmlformats.org/drawingml/2006/lockedCanvas" xmlns:dgm="http://schemas.openxmlformats.org/drawingml/2006/diagram" xmlns:wps="http://schemas.microsoft.com/office/word/2010/wordprocessingShape" xmlns:wpg="http://schemas.microsoft.com/office/word/2010/wordprocessingGroup" xmlns:w14="http://schemas.microsoft.com/office/word/2010/wordml" xmlns:w15="http://schemas.microsoft.com/office/word/2012/wordml" xmlns:w16="http://schemas.microsoft.com/office/word/2018/wordml" xmlns:w16cex="http://schemas.microsoft.com/office/word/2018/wordml/cex" xmlns:w16cid="http://schemas.microsoft.com/office/word/2016/wordml/cid" xmlns="http://schemas.microsoft.com/office/tasks/2019/documenttasks" xmlns:cr="http://schemas.microsoft.com/office/comments/2020/reactions">
+  <w:p>
+    <w:pPr>
+      <w:keepNext w:val="0"/>
+      <w:keepLines w:val="0"/>
+      <w:pageBreakBefore w:val="0"/>
+      <w:widowControl w:val="1"/>
+      <w:pBdr>
+        <w:top w:space="0" w:sz="0" w:val="nil"/>
+        <w:left w:space="0" w:sz="0" w:val="nil"/>
+        <w:bottom w:space="0" w:sz="0" w:val="nil"/>
+        <w:right w:space="0" w:sz="0" w:val="nil"/>
+        <w:between w:space="0" w:sz="0" w:val="nil"/>
+      </w:pBdr>
+      <w:shd w:fill="auto" w:val="clear"/>
+      <w:tabs>
+        <w:tab w:val="right" w:leader="none" w:pos="9020"/>
+      </w:tabs>
+      <w:spacing w:after="0" w:before="0" w:line="240" w:lineRule="auto"/>
+      <w:ind w:left="0" w:right="0" w:firstLine="0"/>
+      <w:jc w:val="left"/>
+      <w:rPr>
+        <w:rFonts w:ascii="Inter" w:cs="Inter" w:eastAsia="Inter" w:hAnsi="Inter"/>
+        <w:b w:val="0"/>
+        <w:bCs w:val="0"/>
+        <w:i w:val="0"/>
+        <w:iCs w:val="0"/>
+        <w:smallCaps w:val="0"/>
+        <w:strike w:val="0"/>
+        <w:color w:val="000000"/>
+        <w:sz w:val="24"/>
+        <w:szCs w:val="24"/>
+        <w:u w:val="none"/>
+        <w:shd w:fill="auto" w:val="clear"/>
+        <w:vertAlign w:val="baseline"/>
+      </w:rPr>
+    </w:pPr>
+    <w:r>
+      <w:rPr>
+        <w:rtl w:val="0"/>
+      </w:rPr>
+    </w:r>
+  </w:p>
+</w:ftr>
+</file>
+
+<file path=word/header1.xml><?xml version="1.0" encoding="utf-8"?>
+<w:hdr xmlns:mc="http://schemas.openxmlformats.org/markup-compatibility/2006" xmlns:o="urn:schemas-microsoft-com:office:office" xmlns:r="http://schemas.openxmlformats.org/officeDocument/2006/relationships" xmlns:m="http://schemas.openxmlformats.org/officeDocument/2006/math" xmlns:v="urn:schemas-microsoft-com:vml" xmlns:wp="http://schemas.openxmlformats.org/drawingml/2006/wordprocessingDrawing" xmlns:w10="urn:schemas-microsoft-com:office:word" xmlns:w="http://schemas.openxmlformats.org/wordprocessingml/2006/main" xmlns:wne="http://schemas.microsoft.com/office/word/2006/wordml" xmlns:sl="http://schemas.openxmlformats.org/schemaLibrary/2006/main" xmlns:a="http://schemas.openxmlformats.org/drawingml/2006/main" xmlns:pic="http://schemas.openxmlformats.org/drawingml/2006/picture" xmlns:c="http://schemas.openxmlformats.org/drawingml/2006/chart" xmlns:lc="http://schemas.openxmlformats.org/drawingml/2006/lockedCanvas" xmlns:dgm="http://schemas.openxmlformats.org/drawingml/2006/diagram" xmlns:wps="http://schemas.microsoft.com/office/word/2010/wordprocessingShape" xmlns:wpg="http://schemas.microsoft.com/office/word/2010/wordprocessingGroup" xmlns:w14="http://schemas.microsoft.com/office/word/2010/wordml" xmlns:w15="http://schemas.microsoft.com/office/word/2012/wordml" xmlns:w16="http://schemas.microsoft.com/office/word/2018/wordml" xmlns:w16cex="http://schemas.microsoft.com/office/word/2018/wordml/cex" xmlns:w16cid="http://schemas.microsoft.com/office/word/2016/wordml/cid" xmlns="http://schemas.microsoft.com/office/tasks/2019/documenttasks" xmlns:cr="http://schemas.microsoft.com/office/comments/2020/reactions">
+  <w:p>
+    <w:pPr>
+      <w:keepNext w:val="0"/>
+      <w:keepLines w:val="0"/>
+      <w:pageBreakBefore w:val="0"/>
+      <w:widowControl w:val="1"/>
+      <w:pBdr>
+        <w:top w:space="0" w:sz="0" w:val="nil"/>
+        <w:left w:space="0" w:sz="0" w:val="nil"/>
+        <w:bottom w:space="0" w:sz="0" w:val="nil"/>
+        <w:right w:space="0" w:sz="0" w:val="nil"/>
+        <w:between w:space="0" w:sz="0" w:val="nil"/>
+      </w:pBdr>
+      <w:shd w:fill="auto" w:val="clear"/>
+      <w:tabs>
+        <w:tab w:val="right" w:leader="none" w:pos="9020"/>
+      </w:tabs>
+      <w:spacing w:after="0" w:before="0" w:line="240" w:lineRule="auto"/>
+      <w:ind w:left="0" w:right="0" w:firstLine="0"/>
+      <w:jc w:val="left"/>
+      <w:rPr>
+        <w:rFonts w:ascii="Inter" w:cs="Inter" w:eastAsia="Inter" w:hAnsi="Inter"/>
+        <w:b w:val="0"/>
+        <w:bCs w:val="0"/>
+        <w:i w:val="0"/>
+        <w:iCs w:val="0"/>
+        <w:smallCaps w:val="0"/>
+        <w:strike w:val="0"/>
+        <w:color w:val="000000"/>
+        <w:sz w:val="24"/>
+        <w:szCs w:val="24"/>
+        <w:u w:val="none"/>
+        <w:shd w:fill="auto" w:val="clear"/>
+        <w:vertAlign w:val="baseline"/>
+      </w:rPr>
+    </w:pPr>
+    <w:r>
+      <w:rPr>
+        <w:rtl w:val="0"/>
+      </w:rPr>
+    </w:r>
+  </w:p>
+</w:hdr>
 </file>
 
 <file path=word/numbering.xml><?xml version="1.0" encoding="utf-8"?>
@@ -365,106 +1081,193 @@
         <w:ind w:left="360" w:hanging="360"/>
       </w:pPr>
       <w:rPr>
-        <w:rFonts w:ascii="Arial" w:hAnsi="Arial" w:cs="Arial" w:eastAsia="Arial"/>
+        <w:rFonts w:ascii="Inter" w:cs="Inter" w:eastAsia="Inter" w:hAnsi="Inter"/>
+        <w:b w:val="0"/>
+        <w:bCs w:val="0"/>
+        <w:i w:val="0"/>
+        <w:iCs w:val="0"/>
+        <w:smallCaps w:val="0"/>
+        <w:strike w:val="0"/>
         <w:sz w:val="20"/>
         <w:szCs w:val="20"/>
-        <w:u w:val="none"/>
+        <w:shd w:fill="auto" w:val="clear"/>
+        <w:vertAlign w:val="baseline"/>
       </w:rPr>
     </w:lvl>
     <w:lvl w:ilvl="1">
       <w:start w:val="1"/>
       <w:numFmt w:val="bullet"/>
-      <w:lvlText w:val=""/>
+      <w:lvlText w:val="•"/>
       <w:lvlJc w:val="left"/>
       <w:pPr>
-        <w:ind w:left="0" w:firstLine="0"/>
+        <w:ind w:left="1080" w:hanging="360"/>
       </w:pPr>
       <w:rPr>
-        <w:u w:val="none"/>
+        <w:rFonts w:ascii="Inter" w:cs="Inter" w:eastAsia="Inter" w:hAnsi="Inter"/>
+        <w:b w:val="0"/>
+        <w:bCs w:val="0"/>
+        <w:i w:val="0"/>
+        <w:iCs w:val="0"/>
+        <w:smallCaps w:val="0"/>
+        <w:strike w:val="0"/>
+        <w:sz w:val="20"/>
+        <w:szCs w:val="20"/>
+        <w:shd w:fill="auto" w:val="clear"/>
+        <w:vertAlign w:val="baseline"/>
       </w:rPr>
     </w:lvl>
     <w:lvl w:ilvl="2">
       <w:start w:val="1"/>
       <w:numFmt w:val="bullet"/>
-      <w:lvlText w:val=""/>
+      <w:lvlText w:val="•"/>
       <w:lvlJc w:val="left"/>
       <w:pPr>
-        <w:ind w:left="0" w:firstLine="0"/>
+        <w:ind w:left="1800" w:hanging="360"/>
       </w:pPr>
       <w:rPr>
-        <w:u w:val="none"/>
+        <w:rFonts w:ascii="Inter" w:cs="Inter" w:eastAsia="Inter" w:hAnsi="Inter"/>
+        <w:b w:val="0"/>
+        <w:bCs w:val="0"/>
+        <w:i w:val="0"/>
+        <w:iCs w:val="0"/>
+        <w:smallCaps w:val="0"/>
+        <w:strike w:val="0"/>
+        <w:sz w:val="20"/>
+        <w:szCs w:val="20"/>
+        <w:shd w:fill="auto" w:val="clear"/>
+        <w:vertAlign w:val="baseline"/>
       </w:rPr>
     </w:lvl>
     <w:lvl w:ilvl="3">
       <w:start w:val="1"/>
       <w:numFmt w:val="bullet"/>
-      <w:lvlText w:val=""/>
+      <w:lvlText w:val="•"/>
       <w:lvlJc w:val="left"/>
       <w:pPr>
-        <w:ind w:left="0" w:firstLine="0"/>
+        <w:ind w:left="2520" w:hanging="360"/>
       </w:pPr>
       <w:rPr>
-        <w:u w:val="none"/>
+        <w:rFonts w:ascii="Inter" w:cs="Inter" w:eastAsia="Inter" w:hAnsi="Inter"/>
+        <w:b w:val="0"/>
+        <w:bCs w:val="0"/>
+        <w:i w:val="0"/>
+        <w:iCs w:val="0"/>
+        <w:smallCaps w:val="0"/>
+        <w:strike w:val="0"/>
+        <w:sz w:val="20"/>
+        <w:szCs w:val="20"/>
+        <w:shd w:fill="auto" w:val="clear"/>
+        <w:vertAlign w:val="baseline"/>
       </w:rPr>
     </w:lvl>
     <w:lvl w:ilvl="4">
       <w:start w:val="1"/>
       <w:numFmt w:val="bullet"/>
-      <w:lvlText w:val=""/>
+      <w:lvlText w:val="•"/>
       <w:lvlJc w:val="left"/>
       <w:pPr>
-        <w:ind w:left="0" w:firstLine="0"/>
+        <w:ind w:left="3240" w:hanging="360"/>
       </w:pPr>
       <w:rPr>
-        <w:u w:val="none"/>
+        <w:rFonts w:ascii="Inter" w:cs="Inter" w:eastAsia="Inter" w:hAnsi="Inter"/>
+        <w:b w:val="0"/>
+        <w:bCs w:val="0"/>
+        <w:i w:val="0"/>
+        <w:iCs w:val="0"/>
+        <w:smallCaps w:val="0"/>
+        <w:strike w:val="0"/>
+        <w:sz w:val="20"/>
+        <w:szCs w:val="20"/>
+        <w:shd w:fill="auto" w:val="clear"/>
+        <w:vertAlign w:val="baseline"/>
       </w:rPr>
     </w:lvl>
     <w:lvl w:ilvl="5">
       <w:start w:val="1"/>
       <w:numFmt w:val="bullet"/>
-      <w:lvlText w:val=""/>
+      <w:lvlText w:val="•"/>
       <w:lvlJc w:val="left"/>
       <w:pPr>
-        <w:ind w:left="0" w:firstLine="0"/>
+        <w:ind w:left="3960" w:hanging="360"/>
       </w:pPr>
       <w:rPr>
-        <w:u w:val="none"/>
+        <w:rFonts w:ascii="Inter" w:cs="Inter" w:eastAsia="Inter" w:hAnsi="Inter"/>
+        <w:b w:val="0"/>
+        <w:bCs w:val="0"/>
+        <w:i w:val="0"/>
+        <w:iCs w:val="0"/>
+        <w:smallCaps w:val="0"/>
+        <w:strike w:val="0"/>
+        <w:sz w:val="20"/>
+        <w:szCs w:val="20"/>
+        <w:shd w:fill="auto" w:val="clear"/>
+        <w:vertAlign w:val="baseline"/>
       </w:rPr>
     </w:lvl>
     <w:lvl w:ilvl="6">
       <w:start w:val="1"/>
       <w:numFmt w:val="bullet"/>
-      <w:lvlText w:val=""/>
+      <w:lvlText w:val="•"/>
       <w:lvlJc w:val="left"/>
       <w:pPr>
-        <w:ind w:left="0" w:firstLine="0"/>
+        <w:ind w:left="4680" w:hanging="360"/>
       </w:pPr>
       <w:rPr>
-        <w:u w:val="none"/>
+        <w:rFonts w:ascii="Inter" w:cs="Inter" w:eastAsia="Inter" w:hAnsi="Inter"/>
+        <w:b w:val="0"/>
+        <w:bCs w:val="0"/>
+        <w:i w:val="0"/>
+        <w:iCs w:val="0"/>
+        <w:smallCaps w:val="0"/>
+        <w:strike w:val="0"/>
+        <w:sz w:val="20"/>
+        <w:szCs w:val="20"/>
+        <w:shd w:fill="auto" w:val="clear"/>
+        <w:vertAlign w:val="baseline"/>
       </w:rPr>
     </w:lvl>
     <w:lvl w:ilvl="7">
       <w:start w:val="1"/>
       <w:numFmt w:val="bullet"/>
-      <w:lvlText w:val=""/>
+      <w:lvlText w:val="•"/>
       <w:lvlJc w:val="left"/>
       <w:pPr>
-        <w:ind w:left="0" w:firstLine="0"/>
+        <w:ind w:left="5400" w:hanging="360"/>
       </w:pPr>
       <w:rPr>
-        <w:u w:val="none"/>
+        <w:rFonts w:ascii="Inter" w:cs="Inter" w:eastAsia="Inter" w:hAnsi="Inter"/>
+        <w:b w:val="0"/>
+        <w:bCs w:val="0"/>
+        <w:i w:val="0"/>
+        <w:iCs w:val="0"/>
+        <w:smallCaps w:val="0"/>
+        <w:strike w:val="0"/>
+        <w:sz w:val="20"/>
+        <w:szCs w:val="20"/>
+        <w:shd w:fill="auto" w:val="clear"/>
+        <w:vertAlign w:val="baseline"/>
       </w:rPr>
     </w:lvl>
     <w:lvl w:ilvl="8">
       <w:start w:val="1"/>
       <w:numFmt w:val="bullet"/>
-      <w:lvlText w:val=""/>
+      <w:lvlText w:val="•"/>
       <w:lvlJc w:val="left"/>
       <w:pPr>
-        <w:ind w:left="0" w:firstLine="0"/>
+        <w:ind w:left="6120" w:hanging="360"/>
       </w:pPr>
       <w:rPr>
-        <w:u w:val="none"/>
+        <w:rFonts w:ascii="Inter" w:cs="Inter" w:eastAsia="Inter" w:hAnsi="Inter"/>
+        <w:b w:val="0"/>
+        <w:bCs w:val="0"/>
+        <w:i w:val="0"/>
+        <w:iCs w:val="0"/>
+        <w:smallCaps w:val="0"/>
+        <w:strike w:val="0"/>
+        <w:sz w:val="20"/>
+        <w:szCs w:val="20"/>
+        <w:shd w:fill="auto" w:val="clear"/>
+        <w:vertAlign w:val="baseline"/>
       </w:rPr>
     </w:lvl>
   </w:abstractNum>
@@ -479,15 +1282,16 @@
   <w:docDefaults>
     <w:rPrDefault>
       <w:rPr>
-        <w:rFonts w:ascii="Cambria" w:cs="Cambria" w:eastAsia="Cambria" w:hAnsi="Cambria"/>
-        <w:sz w:val="22"/>
-        <w:szCs w:val="22"/>
+        <w:rFonts w:ascii="Inter" w:hAnsi="Inter" w:cs="Inter" w:eastAsia="Inter"/>
+        <w:color w:val="333333"/>
+        <w:sz w:val="21"/>
+        <w:szCs w:val="21"/>
         <w:lang w:val="en"/>
       </w:rPr>
     </w:rPrDefault>
     <w:pPrDefault>
       <w:pPr>
-        <w:spacing w:after="200" w:line="276" w:lineRule="auto"/>
+        <w:spacing w:after="60" w:line="336" w:lineRule="auto"/>
       </w:pPr>
     </w:pPrDefault>
   </w:docDefaults>
@@ -512,15 +1316,14 @@
     <w:pPr>
       <w:keepNext w:val="1"/>
       <w:keepLines w:val="1"/>
-      <w:spacing w:after="0" w:before="480" w:lineRule="auto"/>
+      <w:pageBreakBefore w:val="0"/>
+      <w:spacing w:after="120" w:before="480" w:lineRule="auto"/>
     </w:pPr>
     <w:rPr>
-      <w:rFonts w:ascii="Calibri" w:cs="Calibri" w:eastAsia="Calibri" w:hAnsi="Calibri"/>
       <w:b w:val="1"/>
       <w:bCs w:val="1"/>
-      <w:color w:val="366091"/>
-      <w:sz w:val="28"/>
-      <w:szCs w:val="28"/>
+      <w:sz w:val="48"/>
+      <w:szCs w:val="48"/>
     </w:rPr>
   </w:style>
   <w:style w:type="paragraph" w:styleId="Heading2">
@@ -530,15 +1333,14 @@
     <w:pPr>
       <w:keepNext w:val="1"/>
       <w:keepLines w:val="1"/>
-      <w:spacing w:after="0" w:before="200" w:lineRule="auto"/>
+      <w:pageBreakBefore w:val="0"/>
+      <w:spacing w:after="80" w:before="360" w:lineRule="auto"/>
     </w:pPr>
     <w:rPr>
-      <w:rFonts w:ascii="Calibri" w:cs="Calibri" w:eastAsia="Calibri" w:hAnsi="Calibri"/>
       <w:b w:val="1"/>
       <w:bCs w:val="1"/>
-      <w:color w:val="4f81bd"/>
-      <w:sz w:val="26"/>
-      <w:szCs w:val="26"/>
+      <w:sz w:val="36"/>
+      <w:szCs w:val="36"/>
     </w:rPr>
   </w:style>
   <w:style w:type="paragraph" w:styleId="Heading3">
@@ -548,13 +1350,14 @@
     <w:pPr>
       <w:keepNext w:val="1"/>
       <w:keepLines w:val="1"/>
-      <w:spacing w:after="0" w:before="200" w:lineRule="auto"/>
+      <w:pageBreakBefore w:val="0"/>
+      <w:spacing w:after="80" w:before="280" w:lineRule="auto"/>
     </w:pPr>
     <w:rPr>
-      <w:rFonts w:ascii="Calibri" w:cs="Calibri" w:eastAsia="Calibri" w:hAnsi="Calibri"/>
       <w:b w:val="1"/>
       <w:bCs w:val="1"/>
-      <w:color w:val="4f81bd"/>
+      <w:sz w:val="28"/>
+      <w:szCs w:val="28"/>
     </w:rPr>
   </w:style>
   <w:style w:type="paragraph" w:styleId="Heading4">
@@ -564,15 +1367,14 @@
     <w:pPr>
       <w:keepNext w:val="1"/>
       <w:keepLines w:val="1"/>
-      <w:spacing w:after="0" w:before="200" w:lineRule="auto"/>
+      <w:pageBreakBefore w:val="0"/>
+      <w:spacing w:after="40" w:before="240" w:lineRule="auto"/>
     </w:pPr>
     <w:rPr>
-      <w:rFonts w:ascii="Calibri" w:cs="Calibri" w:eastAsia="Calibri" w:hAnsi="Calibri"/>
       <w:b w:val="1"/>
       <w:bCs w:val="1"/>
-      <w:i w:val="1"/>
-      <w:iCs w:val="1"/>
-      <w:color w:val="4f81bd"/>
+      <w:sz w:val="24"/>
+      <w:szCs w:val="24"/>
     </w:rPr>
   </w:style>
   <w:style w:type="paragraph" w:styleId="Heading5">
@@ -582,11 +1384,14 @@
     <w:pPr>
       <w:keepNext w:val="1"/>
       <w:keepLines w:val="1"/>
-      <w:spacing w:after="0" w:before="200" w:lineRule="auto"/>
+      <w:pageBreakBefore w:val="0"/>
+      <w:spacing w:after="40" w:before="220" w:lineRule="auto"/>
     </w:pPr>
     <w:rPr>
-      <w:rFonts w:ascii="Calibri" w:cs="Calibri" w:eastAsia="Calibri" w:hAnsi="Calibri"/>
-      <w:color w:val="243f61"/>
+      <w:b w:val="1"/>
+      <w:bCs w:val="1"/>
+      <w:sz w:val="22"/>
+      <w:szCs w:val="22"/>
     </w:rPr>
   </w:style>
   <w:style w:type="paragraph" w:styleId="Heading6">
@@ -596,13 +1401,14 @@
     <w:pPr>
       <w:keepNext w:val="1"/>
       <w:keepLines w:val="1"/>
-      <w:spacing w:after="0" w:before="200" w:lineRule="auto"/>
+      <w:pageBreakBefore w:val="0"/>
+      <w:spacing w:after="40" w:before="200" w:lineRule="auto"/>
     </w:pPr>
     <w:rPr>
-      <w:rFonts w:ascii="Calibri" w:cs="Calibri" w:eastAsia="Calibri" w:hAnsi="Calibri"/>
-      <w:i w:val="1"/>
-      <w:iCs w:val="1"/>
-      <w:color w:val="243f61"/>
+      <w:b w:val="1"/>
+      <w:bCs w:val="1"/>
+      <w:sz w:val="20"/>
+      <w:szCs w:val="20"/>
     </w:rPr>
   </w:style>
   <w:style w:type="paragraph" w:styleId="Title">
@@ -610,30 +1416,35 @@
     <w:basedOn w:val="Normal"/>
     <w:next w:val="Normal"/>
     <w:pPr>
-      <w:pBdr>
-        <w:bottom w:color="4f81bd" w:space="4" w:sz="8" w:val="single"/>
-      </w:pBdr>
-      <w:spacing w:after="300" w:line="240" w:lineRule="auto"/>
+      <w:keepNext w:val="1"/>
+      <w:keepLines w:val="1"/>
+      <w:pageBreakBefore w:val="0"/>
+      <w:spacing w:after="120" w:before="480" w:lineRule="auto"/>
     </w:pPr>
     <w:rPr>
-      <w:rFonts w:ascii="Calibri" w:cs="Calibri" w:eastAsia="Calibri" w:hAnsi="Calibri"/>
-      <w:color w:val="17365d"/>
-      <w:sz w:val="52"/>
-      <w:szCs w:val="52"/>
+      <w:b w:val="1"/>
+      <w:bCs w:val="1"/>
+      <w:sz w:val="72"/>
+      <w:szCs w:val="72"/>
     </w:rPr>
   </w:style>
   <w:style w:type="paragraph" w:styleId="Subtitle">
     <w:name w:val="Subtitle"/>
     <w:basedOn w:val="Normal"/>
     <w:next w:val="Normal"/>
-    <w:pPr/>
+    <w:pPr>
+      <w:keepNext w:val="1"/>
+      <w:keepLines w:val="1"/>
+      <w:pageBreakBefore w:val="0"/>
+      <w:spacing w:after="80" w:before="360" w:lineRule="auto"/>
+    </w:pPr>
     <w:rPr>
-      <w:rFonts w:ascii="Calibri" w:cs="Calibri" w:eastAsia="Calibri" w:hAnsi="Calibri"/>
+      <w:rFonts w:ascii="Inter" w:cs="Inter" w:eastAsia="Inter" w:hAnsi="Inter"/>
       <w:i w:val="1"/>
       <w:iCs w:val="1"/>
-      <w:color w:val="4f81bd"/>
-      <w:sz w:val="24"/>
-      <w:szCs w:val="24"/>
+      <w:color w:val="666666"/>
+      <w:sz w:val="48"/>
+      <w:szCs w:val="48"/>
     </w:rPr>
   </w:style>
 </w:styles>
@@ -682,7 +1493,7 @@
     </a:clrScheme>
     <a:fontScheme name="Office">
       <a:majorFont>
-        <a:latin typeface="Calibri"/>
+        <a:latin typeface="Inter"/>
         <a:ea typeface=""/>
         <a:cs typeface=""/>
         <a:font script="Jpan" typeface="ＭＳ ゴシック"/>
@@ -717,15 +1528,15 @@
         <a:font script="Geor" typeface="Sylfaen"/>
       </a:majorFont>
       <a:minorFont>
-        <a:latin typeface="Cambria"/>
+        <a:latin typeface="Inter"/>
         <a:ea typeface=""/>
         <a:cs typeface=""/>
         <a:font script="Jpan" typeface="ＭＳ 明朝"/>
         <a:font script="Hang" typeface="맑은 고딕"/>
         <a:font script="Hans" typeface="宋体"/>
         <a:font script="Hant" typeface="新細明體"/>
-        <a:font script="Arab" typeface="Arial"/>
-        <a:font script="Hebr" typeface="Arial"/>
+        <a:font script="Arab" typeface="Inter"/>
+        <a:font script="Hebr" typeface="Inter"/>
         <a:font script="Thai" typeface="Cordia New"/>
         <a:font script="Ethi" typeface="Nyala"/>
         <a:font script="Beng" typeface="Vrinda"/>
@@ -747,7 +1558,7 @@
         <a:font script="Laoo" typeface="DokChampa"/>
         <a:font script="Sinh" typeface="Iskoola Pota"/>
         <a:font script="Mong" typeface="Mongolian Baiti"/>
-        <a:font script="Viet" typeface="Arial"/>
+        <a:font script="Viet" typeface="Inter"/>
         <a:font script="Uigh" typeface="Microsoft Uighur"/>
         <a:font script="Geor" typeface="Sylfaen"/>
       </a:minorFont>

</xml_diff>

<commit_message>
Restyle DOCX packet with Inter and tighter resume layout. (#127)
Co-authored-by: juanrod <juanrod@Skyss-MacBook-Neo.local>
Co-authored-by: Cursor <cursoragent@cursor.com>
</commit_message>
<xml_diff>
--- a/server/assets/template.docx
+++ b/server/assets/template.docx
@@ -4,68 +4,152 @@
   <w:body>
     <w:p>
       <w:pPr>
-        <w:spacing w:line="240" w:lineRule="auto"/>
-        <w:rPr/>
-      </w:pPr>
-      <w:r>
-        <w:rPr>
-          <w:rtl w:val="0"/>
+        <w:spacing w:after="80" w:before="0" w:line="276" w:lineRule="auto"/>
+        <w:jc w:val="left"/>
+        <w:rPr>
+          <w:rFonts w:ascii="Inter" w:hAnsi="Inter" w:cs="Inter" w:eastAsia="Inter"/>
+          <w:b/>
+          <w:bCs/>
+          <w:i w:val="0"/>
+          <w:iCs w:val="0"/>
+          <w:caps/>
+          <w:color w:val="333333"/>
+          <w:sz w:val="40"/>
+          <w:szCs w:val="40"/>
+        </w:rPr>
+      </w:pPr>
+      <w:r>
+        <w:rPr>
+          <w:rFonts w:ascii="Inter" w:hAnsi="Inter" w:cs="Inter" w:eastAsia="Inter"/>
+          <w:b/>
+          <w:bCs/>
+          <w:i w:val="0"/>
+          <w:iCs w:val="0"/>
+          <w:caps/>
+          <w:color w:val="333333"/>
+          <w:sz w:val="40"/>
+          <w:szCs w:val="40"/>
         </w:rPr>
         <w:t xml:space="preserve">{candidate_first_name} {candidate_last_name}, RN</w:t>
       </w:r>
     </w:p>
     <w:p>
       <w:pPr>
-        <w:spacing w:line="240" w:lineRule="auto"/>
-        <w:rPr/>
-      </w:pPr>
-      <w:r>
-        <w:rPr>
-          <w:rtl w:val="0"/>
+        <w:spacing w:after="40" w:before="0" w:line="276" w:lineRule="auto"/>
+        <w:jc w:val="left"/>
+        <w:rPr>
+          <w:rFonts w:ascii="Inter" w:hAnsi="Inter" w:cs="Inter" w:eastAsia="Inter"/>
+          <w:b w:val="0"/>
+          <w:bCs w:val="0"/>
+          <w:i w:val="0"/>
+          <w:iCs w:val="0"/>
+          <w:color w:val="555555"/>
+          <w:sz w:val="20"/>
+          <w:szCs w:val="20"/>
+        </w:rPr>
+      </w:pPr>
+      <w:r>
+        <w:rPr>
+          <w:rFonts w:ascii="Inter" w:hAnsi="Inter" w:cs="Inter" w:eastAsia="Inter"/>
+          <w:b w:val="0"/>
+          <w:bCs w:val="0"/>
+          <w:i w:val="0"/>
+          <w:iCs w:val="0"/>
+          <w:color w:val="555555"/>
+          <w:sz w:val="20"/>
+          <w:szCs w:val="20"/>
         </w:rPr>
         <w:t xml:space="preserve">{candidate_phone} | {candidate_email}</w:t>
       </w:r>
     </w:p>
     <w:p>
       <w:pPr>
-        <w:spacing w:line="240" w:lineRule="auto"/>
-        <w:rPr/>
-      </w:pPr>
-      <w:r>
-        <w:rPr>
-          <w:rtl w:val="0"/>
+        <w:spacing w:after="360" w:before="0" w:line="276" w:lineRule="auto"/>
+        <w:jc w:val="left"/>
+        <w:rPr>
+          <w:rFonts w:ascii="Inter" w:hAnsi="Inter" w:cs="Inter" w:eastAsia="Inter"/>
+          <w:b w:val="0"/>
+          <w:bCs w:val="0"/>
+          <w:i w:val="0"/>
+          <w:iCs w:val="0"/>
+          <w:color w:val="555555"/>
+          <w:sz w:val="20"/>
+          <w:szCs w:val="20"/>
+        </w:rPr>
+      </w:pPr>
+      <w:r>
+        <w:rPr>
+          <w:rFonts w:ascii="Inter" w:hAnsi="Inter" w:cs="Inter" w:eastAsia="Inter"/>
+          <w:b w:val="0"/>
+          <w:bCs w:val="0"/>
+          <w:i w:val="0"/>
+          <w:iCs w:val="0"/>
+          <w:color w:val="555555"/>
+          <w:sz w:val="20"/>
+          <w:szCs w:val="20"/>
         </w:rPr>
         <w:t xml:space="preserve">{candidate_home_address}, {candidate_city}, {candidate_state}</w:t>
       </w:r>
     </w:p>
     <w:p>
       <w:pPr>
-        <w:rPr/>
-      </w:pPr>
-      <w:r>
-        <w:rPr>
-          <w:rtl w:val="0"/>
-        </w:rPr>
-      </w:r>
-    </w:p>
-    <w:p>
-      <w:pPr>
-        <w:rPr/>
-      </w:pPr>
-      <w:r>
-        <w:rPr>
-          <w:rtl w:val="0"/>
-        </w:rPr>
-        <w:t xml:space="preserve">PROFESSIONAL SNAPSHOT</w:t>
-      </w:r>
-    </w:p>
-    <w:p>
-      <w:pPr>
-        <w:rPr/>
-      </w:pPr>
-      <w:r>
-        <w:rPr>
-          <w:rtl w:val="0"/>
+        <w:pBdr>
+          <w:bottom w:val="single" w:sz="6" w:space="1" w:color="C0C0C0"/>
+        </w:pBdr>
+        <w:spacing w:after="120" w:before="280" w:line="276" w:lineRule="auto"/>
+        <w:jc w:val="left"/>
+        <w:rPr>
+          <w:rFonts w:ascii="Inter" w:hAnsi="Inter" w:cs="Inter" w:eastAsia="Inter"/>
+          <w:b/>
+          <w:bCs/>
+          <w:i w:val="0"/>
+          <w:iCs w:val="0"/>
+          <w:caps/>
+          <w:color w:val="333333"/>
+          <w:sz w:val="24"/>
+          <w:szCs w:val="24"/>
+        </w:rPr>
+      </w:pPr>
+      <w:r>
+        <w:rPr>
+          <w:rFonts w:ascii="Inter" w:hAnsi="Inter" w:cs="Inter" w:eastAsia="Inter"/>
+          <w:b/>
+          <w:bCs/>
+          <w:i w:val="0"/>
+          <w:iCs w:val="0"/>
+          <w:caps/>
+          <w:color w:val="333333"/>
+          <w:sz w:val="24"/>
+          <w:szCs w:val="24"/>
+        </w:rPr>
+        <w:t>PROFESSIONAL SNAPSHOT</w:t>
+      </w:r>
+    </w:p>
+    <w:p>
+      <w:pPr>
+        <w:spacing w:after="0" w:before="0" w:line="240" w:lineRule="auto"/>
+        <w:jc w:val="left"/>
+        <w:rPr>
+          <w:rFonts w:ascii="Inter" w:hAnsi="Inter" w:cs="Inter" w:eastAsia="Inter"/>
+          <w:b w:val="0"/>
+          <w:bCs w:val="0"/>
+          <w:i w:val="0"/>
+          <w:iCs w:val="0"/>
+          <w:color w:val="333333"/>
+          <w:sz w:val="21"/>
+          <w:szCs w:val="21"/>
+        </w:rPr>
+      </w:pPr>
+      <w:r>
+        <w:rPr>
+          <w:rFonts w:ascii="Inter" w:hAnsi="Inter" w:cs="Inter" w:eastAsia="Inter"/>
+          <w:b w:val="0"/>
+          <w:bCs w:val="0"/>
+          <w:i w:val="0"/>
+          <w:iCs w:val="0"/>
+          <w:color w:val="333333"/>
+          <w:sz w:val="21"/>
+          <w:szCs w:val="21"/>
         </w:rPr>
         <w:t xml:space="preserve">{#snapshot_lines}</w:t>
       </w:r>
@@ -76,54 +160,121 @@
           <w:ilvl w:val="0"/>
           <w:numId w:val="1"/>
         </w:numPr>
-        <w:ind w:left="360"/>
-      </w:pPr>
-      <w:r>
-        <w:rPr>
-          <w:rtl w:val="0"/>
+        <w:spacing w:after="60" w:before="0" w:line="276" w:lineRule="auto"/>
+        <w:jc w:val="left"/>
+        <w:rPr>
+          <w:rFonts w:ascii="Inter" w:hAnsi="Inter" w:cs="Inter" w:eastAsia="Inter"/>
+          <w:b w:val="0"/>
+          <w:bCs w:val="0"/>
+          <w:i w:val="0"/>
+          <w:iCs w:val="0"/>
+          <w:color w:val="333333"/>
+          <w:sz w:val="21"/>
+          <w:szCs w:val="21"/>
+        </w:rPr>
+      </w:pPr>
+      <w:r>
+        <w:rPr>
+          <w:rFonts w:ascii="Inter" w:hAnsi="Inter" w:cs="Inter" w:eastAsia="Inter"/>
+          <w:b w:val="0"/>
+          <w:bCs w:val="0"/>
+          <w:i w:val="0"/>
+          <w:iCs w:val="0"/>
+          <w:color w:val="333333"/>
+          <w:sz w:val="21"/>
+          <w:szCs w:val="21"/>
         </w:rPr>
         <w:t xml:space="preserve">{snapshot_line}</w:t>
       </w:r>
     </w:p>
     <w:p>
       <w:pPr>
-        <w:rPr/>
-      </w:pPr>
-      <w:r>
-        <w:rPr>
-          <w:rtl w:val="0"/>
+        <w:spacing w:after="0" w:before="0" w:line="240" w:lineRule="auto"/>
+        <w:jc w:val="left"/>
+        <w:rPr>
+          <w:rFonts w:ascii="Inter" w:hAnsi="Inter" w:cs="Inter" w:eastAsia="Inter"/>
+          <w:b w:val="0"/>
+          <w:bCs w:val="0"/>
+          <w:i w:val="0"/>
+          <w:iCs w:val="0"/>
+          <w:color w:val="333333"/>
+          <w:sz w:val="21"/>
+          <w:szCs w:val="21"/>
+        </w:rPr>
+      </w:pPr>
+      <w:r>
+        <w:rPr>
+          <w:rFonts w:ascii="Inter" w:hAnsi="Inter" w:cs="Inter" w:eastAsia="Inter"/>
+          <w:b w:val="0"/>
+          <w:bCs w:val="0"/>
+          <w:i w:val="0"/>
+          <w:iCs w:val="0"/>
+          <w:color w:val="333333"/>
+          <w:sz w:val="21"/>
+          <w:szCs w:val="21"/>
         </w:rPr>
         <w:t xml:space="preserve">{/snapshot_lines}</w:t>
       </w:r>
     </w:p>
     <w:p>
       <w:pPr>
-        <w:rPr/>
-      </w:pPr>
-      <w:r>
-        <w:rPr>
-          <w:rtl w:val="0"/>
-        </w:rPr>
-      </w:r>
-    </w:p>
-    <w:p>
-      <w:pPr>
-        <w:rPr/>
-      </w:pPr>
-      <w:r>
-        <w:rPr>
-          <w:rtl w:val="0"/>
-        </w:rPr>
-        <w:t xml:space="preserve">LICENSES &amp; CERTIFICATIONS</w:t>
-      </w:r>
-    </w:p>
-    <w:p>
-      <w:pPr>
-        <w:rPr/>
-      </w:pPr>
-      <w:r>
-        <w:rPr>
-          <w:rtl w:val="0"/>
+        <w:pBdr>
+          <w:bottom w:val="single" w:sz="6" w:space="1" w:color="C0C0C0"/>
+        </w:pBdr>
+        <w:spacing w:after="120" w:before="280" w:line="276" w:lineRule="auto"/>
+        <w:jc w:val="left"/>
+        <w:rPr>
+          <w:rFonts w:ascii="Inter" w:hAnsi="Inter" w:cs="Inter" w:eastAsia="Inter"/>
+          <w:b/>
+          <w:bCs/>
+          <w:i w:val="0"/>
+          <w:iCs w:val="0"/>
+          <w:caps/>
+          <w:color w:val="333333"/>
+          <w:sz w:val="24"/>
+          <w:szCs w:val="24"/>
+        </w:rPr>
+      </w:pPr>
+      <w:r>
+        <w:rPr>
+          <w:rFonts w:ascii="Inter" w:hAnsi="Inter" w:cs="Inter" w:eastAsia="Inter"/>
+          <w:b/>
+          <w:bCs/>
+          <w:i w:val="0"/>
+          <w:iCs w:val="0"/>
+          <w:caps/>
+          <w:color w:val="333333"/>
+          <w:sz w:val="24"/>
+          <w:szCs w:val="24"/>
+        </w:rPr>
+        <w:t>LICENSES &amp; CERTIFICATIONS</w:t>
+      </w:r>
+    </w:p>
+    <w:p>
+      <w:pPr>
+        <w:spacing w:after="0" w:before="0" w:line="240" w:lineRule="auto"/>
+        <w:jc w:val="left"/>
+        <w:rPr>
+          <w:rFonts w:ascii="Inter" w:hAnsi="Inter" w:cs="Inter" w:eastAsia="Inter"/>
+          <w:b w:val="0"/>
+          <w:bCs w:val="0"/>
+          <w:i w:val="0"/>
+          <w:iCs w:val="0"/>
+          <w:color w:val="333333"/>
+          <w:sz w:val="21"/>
+          <w:szCs w:val="21"/>
+        </w:rPr>
+      </w:pPr>
+      <w:r>
+        <w:rPr>
+          <w:rFonts w:ascii="Inter" w:hAnsi="Inter" w:cs="Inter" w:eastAsia="Inter"/>
+          <w:b w:val="0"/>
+          <w:bCs w:val="0"/>
+          <w:i w:val="0"/>
+          <w:iCs w:val="0"/>
+          <w:color w:val="333333"/>
+          <w:sz w:val="21"/>
+          <w:szCs w:val="21"/>
         </w:rPr>
         <w:t xml:space="preserve">{#licenses_list}</w:t>
       </w:r>
@@ -134,34 +285,87 @@
           <w:ilvl w:val="0"/>
           <w:numId w:val="1"/>
         </w:numPr>
-        <w:ind w:left="360"/>
-        <w:rPr/>
-      </w:pPr>
-      <w:r>
-        <w:rPr>
-          <w:rtl w:val="0"/>
+        <w:spacing w:after="60" w:before="0" w:line="276" w:lineRule="auto"/>
+        <w:jc w:val="left"/>
+        <w:rPr>
+          <w:rFonts w:ascii="Inter" w:hAnsi="Inter" w:cs="Inter" w:eastAsia="Inter"/>
+          <w:b w:val="0"/>
+          <w:bCs w:val="0"/>
+          <w:i w:val="0"/>
+          <w:iCs w:val="0"/>
+          <w:color w:val="333333"/>
+          <w:sz w:val="21"/>
+          <w:szCs w:val="21"/>
+        </w:rPr>
+      </w:pPr>
+      <w:r>
+        <w:rPr>
+          <w:rFonts w:ascii="Inter" w:hAnsi="Inter" w:cs="Inter" w:eastAsia="Inter"/>
+          <w:b w:val="0"/>
+          <w:bCs w:val="0"/>
+          <w:i w:val="0"/>
+          <w:iCs w:val="0"/>
+          <w:color w:val="333333"/>
+          <w:sz w:val="21"/>
+          <w:szCs w:val="21"/>
         </w:rPr>
         <w:t xml:space="preserve">{rn_license_state_and_expiry}</w:t>
       </w:r>
     </w:p>
     <w:p>
       <w:pPr>
-        <w:rPr/>
-      </w:pPr>
-      <w:r>
-        <w:rPr>
-          <w:rtl w:val="0"/>
+        <w:spacing w:after="0" w:before="0" w:line="240" w:lineRule="auto"/>
+        <w:jc w:val="left"/>
+        <w:rPr>
+          <w:rFonts w:ascii="Inter" w:hAnsi="Inter" w:cs="Inter" w:eastAsia="Inter"/>
+          <w:b w:val="0"/>
+          <w:bCs w:val="0"/>
+          <w:i w:val="0"/>
+          <w:iCs w:val="0"/>
+          <w:color w:val="333333"/>
+          <w:sz w:val="21"/>
+          <w:szCs w:val="21"/>
+        </w:rPr>
+      </w:pPr>
+      <w:r>
+        <w:rPr>
+          <w:rFonts w:ascii="Inter" w:hAnsi="Inter" w:cs="Inter" w:eastAsia="Inter"/>
+          <w:b w:val="0"/>
+          <w:bCs w:val="0"/>
+          <w:i w:val="0"/>
+          <w:iCs w:val="0"/>
+          <w:color w:val="333333"/>
+          <w:sz w:val="21"/>
+          <w:szCs w:val="21"/>
         </w:rPr>
         <w:t xml:space="preserve">{/licenses_list}</w:t>
       </w:r>
     </w:p>
     <w:p>
       <w:pPr>
-        <w:rPr/>
-      </w:pPr>
-      <w:r>
-        <w:rPr>
-          <w:rtl w:val="0"/>
+        <w:spacing w:after="0" w:before="0" w:line="240" w:lineRule="auto"/>
+        <w:jc w:val="left"/>
+        <w:rPr>
+          <w:rFonts w:ascii="Inter" w:hAnsi="Inter" w:cs="Inter" w:eastAsia="Inter"/>
+          <w:b w:val="0"/>
+          <w:bCs w:val="0"/>
+          <w:i w:val="0"/>
+          <w:iCs w:val="0"/>
+          <w:color w:val="333333"/>
+          <w:sz w:val="21"/>
+          <w:szCs w:val="21"/>
+        </w:rPr>
+      </w:pPr>
+      <w:r>
+        <w:rPr>
+          <w:rFonts w:ascii="Inter" w:hAnsi="Inter" w:cs="Inter" w:eastAsia="Inter"/>
+          <w:b w:val="0"/>
+          <w:bCs w:val="0"/>
+          <w:i w:val="0"/>
+          <w:iCs w:val="0"/>
+          <w:color w:val="333333"/>
+          <w:sz w:val="21"/>
+          <w:szCs w:val="21"/>
         </w:rPr>
         <w:t xml:space="preserve">{#certifications_list}</w:t>
       </w:r>
@@ -172,185 +376,697 @@
           <w:ilvl w:val="0"/>
           <w:numId w:val="1"/>
         </w:numPr>
-        <w:ind w:left="360"/>
-        <w:rPr/>
-      </w:pPr>
-      <w:r>
-        <w:rPr>
-          <w:rtl w:val="0"/>
+        <w:spacing w:after="60" w:before="0" w:line="276" w:lineRule="auto"/>
+        <w:jc w:val="left"/>
+        <w:rPr>
+          <w:rFonts w:ascii="Inter" w:hAnsi="Inter" w:cs="Inter" w:eastAsia="Inter"/>
+          <w:b w:val="0"/>
+          <w:bCs w:val="0"/>
+          <w:i w:val="0"/>
+          <w:iCs w:val="0"/>
+          <w:color w:val="333333"/>
+          <w:sz w:val="21"/>
+          <w:szCs w:val="21"/>
+        </w:rPr>
+      </w:pPr>
+      <w:r>
+        <w:rPr>
+          <w:rFonts w:ascii="Inter" w:hAnsi="Inter" w:cs="Inter" w:eastAsia="Inter"/>
+          <w:b w:val="0"/>
+          <w:bCs w:val="0"/>
+          <w:i w:val="0"/>
+          <w:iCs w:val="0"/>
+          <w:color w:val="333333"/>
+          <w:sz w:val="21"/>
+          <w:szCs w:val="21"/>
         </w:rPr>
         <w:t xml:space="preserve">{certification_name} | {certification_expiration_date}</w:t>
       </w:r>
     </w:p>
     <w:p>
       <w:pPr>
-        <w:rPr/>
-      </w:pPr>
-      <w:r>
-        <w:rPr>
-          <w:rtl w:val="0"/>
+        <w:spacing w:after="0" w:before="0" w:line="240" w:lineRule="auto"/>
+        <w:jc w:val="left"/>
+        <w:rPr>
+          <w:rFonts w:ascii="Inter" w:hAnsi="Inter" w:cs="Inter" w:eastAsia="Inter"/>
+          <w:b w:val="0"/>
+          <w:bCs w:val="0"/>
+          <w:i w:val="0"/>
+          <w:iCs w:val="0"/>
+          <w:color w:val="333333"/>
+          <w:sz w:val="21"/>
+          <w:szCs w:val="21"/>
+        </w:rPr>
+      </w:pPr>
+      <w:r>
+        <w:rPr>
+          <w:rFonts w:ascii="Inter" w:hAnsi="Inter" w:cs="Inter" w:eastAsia="Inter"/>
+          <w:b w:val="0"/>
+          <w:bCs w:val="0"/>
+          <w:i w:val="0"/>
+          <w:iCs w:val="0"/>
+          <w:color w:val="333333"/>
+          <w:sz w:val="21"/>
+          <w:szCs w:val="21"/>
         </w:rPr>
         <w:t xml:space="preserve">{/certifications_list}</w:t>
       </w:r>
     </w:p>
     <w:p>
       <w:pPr>
-        <w:rPr/>
-      </w:pPr>
-      <w:r>
-        <w:rPr>
-          <w:rtl w:val="0"/>
-        </w:rPr>
-        <w:t xml:space="preserve">EDUCATION</w:t>
-      </w:r>
-    </w:p>
-    <w:p>
-      <w:pPr>
-        <w:rPr/>
-      </w:pPr>
-      <w:r>
-        <w:rPr>
-          <w:rtl w:val="0"/>
+        <w:pBdr>
+          <w:bottom w:val="single" w:sz="6" w:space="1" w:color="C0C0C0"/>
+        </w:pBdr>
+        <w:spacing w:after="120" w:before="280" w:line="276" w:lineRule="auto"/>
+        <w:jc w:val="left"/>
+        <w:rPr>
+          <w:rFonts w:ascii="Inter" w:hAnsi="Inter" w:cs="Inter" w:eastAsia="Inter"/>
+          <w:b/>
+          <w:bCs/>
+          <w:i w:val="0"/>
+          <w:iCs w:val="0"/>
+          <w:caps/>
+          <w:color w:val="333333"/>
+          <w:sz w:val="24"/>
+          <w:szCs w:val="24"/>
+        </w:rPr>
+      </w:pPr>
+      <w:r>
+        <w:rPr>
+          <w:rFonts w:ascii="Inter" w:hAnsi="Inter" w:cs="Inter" w:eastAsia="Inter"/>
+          <w:b/>
+          <w:bCs/>
+          <w:i w:val="0"/>
+          <w:iCs w:val="0"/>
+          <w:caps/>
+          <w:color w:val="333333"/>
+          <w:sz w:val="24"/>
+          <w:szCs w:val="24"/>
+        </w:rPr>
+        <w:t>EDUCATION</w:t>
+      </w:r>
+    </w:p>
+    <w:p>
+      <w:pPr>
+        <w:spacing w:after="0" w:before="0" w:line="240" w:lineRule="auto"/>
+        <w:jc w:val="left"/>
+        <w:rPr>
+          <w:rFonts w:ascii="Inter" w:hAnsi="Inter" w:cs="Inter" w:eastAsia="Inter"/>
+          <w:b w:val="0"/>
+          <w:bCs w:val="0"/>
+          <w:i w:val="0"/>
+          <w:iCs w:val="0"/>
+          <w:color w:val="333333"/>
+          <w:sz w:val="21"/>
+          <w:szCs w:val="21"/>
+        </w:rPr>
+      </w:pPr>
+      <w:r>
+        <w:rPr>
+          <w:rFonts w:ascii="Inter" w:hAnsi="Inter" w:cs="Inter" w:eastAsia="Inter"/>
+          <w:b w:val="0"/>
+          <w:bCs w:val="0"/>
+          <w:i w:val="0"/>
+          <w:iCs w:val="0"/>
+          <w:color w:val="333333"/>
+          <w:sz w:val="21"/>
+          <w:szCs w:val="21"/>
         </w:rPr>
         <w:t xml:space="preserve">{#education}</w:t>
       </w:r>
     </w:p>
     <w:p>
       <w:pPr>
-        <w:rPr/>
-      </w:pPr>
-      <w:r>
-        <w:rPr>
-          <w:rtl w:val="0"/>
-        </w:rPr>
-        <w:t xml:space="preserve">{education_degree} | {education_school_name} |{education_graduation_year}</w:t>
-      </w:r>
-    </w:p>
-    <w:p>
-      <w:pPr>
-        <w:rPr/>
-      </w:pPr>
-      <w:r>
-        <w:rPr>
-          <w:rtl w:val="0"/>
-        </w:rPr>
-      </w:r>
-    </w:p>
-    <w:p>
-      <w:pPr>
-        <w:rPr/>
-      </w:pPr>
-      <w:r>
-        <w:rPr>
-          <w:rtl w:val="0"/>
+        <w:tabs>
+          <w:tab w:val="right" w:pos="8640"/>
+        </w:tabs>
+        <w:spacing w:after="40" w:before="120" w:line="276" w:lineRule="auto"/>
+        <w:jc w:val="left"/>
+        <w:rPr>
+          <w:rFonts w:ascii="Inter" w:hAnsi="Inter" w:cs="Inter" w:eastAsia="Inter"/>
+          <w:b/>
+          <w:bCs/>
+          <w:i w:val="0"/>
+          <w:iCs w:val="0"/>
+          <w:color w:val="333333"/>
+          <w:sz w:val="22"/>
+          <w:szCs w:val="22"/>
+        </w:rPr>
+      </w:pPr>
+      <w:r>
+        <w:rPr>
+          <w:rFonts w:ascii="Inter" w:hAnsi="Inter" w:cs="Inter" w:eastAsia="Inter"/>
+          <w:b/>
+          <w:bCs/>
+          <w:i w:val="0"/>
+          <w:iCs w:val="0"/>
+          <w:color w:val="333333"/>
+          <w:sz w:val="22"/>
+          <w:szCs w:val="22"/>
+        </w:rPr>
+        <w:t xml:space="preserve">{education_degree}</w:t>
+      </w:r>
+      <w:r>
+        <w:rPr>
+          <w:rFonts w:ascii="Inter" w:hAnsi="Inter" w:cs="Inter" w:eastAsia="Inter"/>
+          <w:b/>
+          <w:bCs/>
+          <w:i w:val="0"/>
+          <w:iCs w:val="0"/>
+          <w:color w:val="333333"/>
+          <w:sz w:val="22"/>
+          <w:szCs w:val="22"/>
+        </w:rPr>
+        <w:tab/>
+      </w:r>
+      <w:r>
+        <w:rPr>
+          <w:rFonts w:ascii="Inter" w:hAnsi="Inter" w:cs="Inter" w:eastAsia="Inter"/>
+          <w:b/>
+          <w:bCs/>
+          <w:i w:val="0"/>
+          <w:iCs w:val="0"/>
+          <w:color w:val="333333"/>
+          <w:sz w:val="22"/>
+          <w:szCs w:val="22"/>
+        </w:rPr>
+        <w:t xml:space="preserve">{education_graduation_year}</w:t>
+      </w:r>
+    </w:p>
+    <w:p>
+      <w:pPr>
+        <w:spacing w:after="220" w:before="0" w:line="276" w:lineRule="auto"/>
+        <w:jc w:val="left"/>
+        <w:rPr>
+          <w:rFonts w:ascii="Inter" w:hAnsi="Inter" w:cs="Inter" w:eastAsia="Inter"/>
+          <w:b w:val="0"/>
+          <w:bCs w:val="0"/>
+          <w:i/>
+          <w:iCs/>
+          <w:color w:val="555555"/>
+          <w:sz w:val="21"/>
+          <w:szCs w:val="21"/>
+        </w:rPr>
+      </w:pPr>
+      <w:r>
+        <w:rPr>
+          <w:rFonts w:ascii="Inter" w:hAnsi="Inter" w:cs="Inter" w:eastAsia="Inter"/>
+          <w:b w:val="0"/>
+          <w:bCs w:val="0"/>
+          <w:i/>
+          <w:iCs/>
+          <w:color w:val="555555"/>
+          <w:sz w:val="21"/>
+          <w:szCs w:val="21"/>
+        </w:rPr>
+        <w:t xml:space="preserve">{education_school_name}</w:t>
+      </w:r>
+    </w:p>
+    <w:p>
+      <w:pPr>
+        <w:spacing w:after="0" w:before="0" w:line="240" w:lineRule="auto"/>
+        <w:jc w:val="left"/>
+        <w:rPr>
+          <w:rFonts w:ascii="Inter" w:hAnsi="Inter" w:cs="Inter" w:eastAsia="Inter"/>
+          <w:b w:val="0"/>
+          <w:bCs w:val="0"/>
+          <w:i w:val="0"/>
+          <w:iCs w:val="0"/>
+          <w:color w:val="333333"/>
+          <w:sz w:val="21"/>
+          <w:szCs w:val="21"/>
+        </w:rPr>
+      </w:pPr>
+      <w:r>
+        <w:rPr>
+          <w:rFonts w:ascii="Inter" w:hAnsi="Inter" w:cs="Inter" w:eastAsia="Inter"/>
+          <w:b w:val="0"/>
+          <w:bCs w:val="0"/>
+          <w:i w:val="0"/>
+          <w:iCs w:val="0"/>
+          <w:color w:val="333333"/>
+          <w:sz w:val="21"/>
+          <w:szCs w:val="21"/>
         </w:rPr>
         <w:t xml:space="preserve">{/education}</w:t>
       </w:r>
     </w:p>
     <w:p>
       <w:pPr>
-        <w:rPr/>
-      </w:pPr>
-      <w:r>
-        <w:rPr>
-          <w:rtl w:val="0"/>
-        </w:rPr>
-      </w:r>
-    </w:p>
-    <w:p>
-      <w:pPr>
-        <w:rPr/>
-      </w:pPr>
-      <w:r>
-        <w:rPr>
-          <w:rtl w:val="0"/>
-        </w:rPr>
-        <w:t xml:space="preserve">PROFESSIONAL EXPERIENCE</w:t>
-      </w:r>
-    </w:p>
-    <w:p>
-      <w:pPr>
-        <w:rPr/>
-      </w:pPr>
-      <w:r>
-        <w:rPr>
-          <w:rtl w:val="0"/>
+        <w:pBdr>
+          <w:bottom w:val="single" w:sz="6" w:space="1" w:color="C0C0C0"/>
+        </w:pBdr>
+        <w:spacing w:after="120" w:before="280" w:line="276" w:lineRule="auto"/>
+        <w:jc w:val="left"/>
+        <w:rPr>
+          <w:rFonts w:ascii="Inter" w:hAnsi="Inter" w:cs="Inter" w:eastAsia="Inter"/>
+          <w:b/>
+          <w:bCs/>
+          <w:i w:val="0"/>
+          <w:iCs w:val="0"/>
+          <w:caps/>
+          <w:color w:val="333333"/>
+          <w:sz w:val="24"/>
+          <w:szCs w:val="24"/>
+        </w:rPr>
+      </w:pPr>
+      <w:r>
+        <w:rPr>
+          <w:rFonts w:ascii="Inter" w:hAnsi="Inter" w:cs="Inter" w:eastAsia="Inter"/>
+          <w:b/>
+          <w:bCs/>
+          <w:i w:val="0"/>
+          <w:iCs w:val="0"/>
+          <w:caps/>
+          <w:color w:val="333333"/>
+          <w:sz w:val="24"/>
+          <w:szCs w:val="24"/>
+        </w:rPr>
+        <w:t>PROFESSIONAL EXPERIENCE</w:t>
+      </w:r>
+    </w:p>
+    <w:p>
+      <w:pPr>
+        <w:spacing w:after="0" w:before="0" w:line="240" w:lineRule="auto"/>
+        <w:jc w:val="left"/>
+        <w:rPr>
+          <w:rFonts w:ascii="Inter" w:hAnsi="Inter" w:cs="Inter" w:eastAsia="Inter"/>
+          <w:b w:val="0"/>
+          <w:bCs w:val="0"/>
+          <w:i w:val="0"/>
+          <w:iCs w:val="0"/>
+          <w:color w:val="333333"/>
+          <w:sz w:val="21"/>
+          <w:szCs w:val="21"/>
+        </w:rPr>
+      </w:pPr>
+      <w:r>
+        <w:rPr>
+          <w:rFonts w:ascii="Inter" w:hAnsi="Inter" w:cs="Inter" w:eastAsia="Inter"/>
+          <w:b w:val="0"/>
+          <w:bCs w:val="0"/>
+          <w:i w:val="0"/>
+          <w:iCs w:val="0"/>
+          <w:color w:val="333333"/>
+          <w:sz w:val="21"/>
+          <w:szCs w:val="21"/>
         </w:rPr>
         <w:t xml:space="preserve">{#professional_experiences}</w:t>
       </w:r>
     </w:p>
     <w:p>
       <w:pPr>
-        <w:rPr/>
-      </w:pPr>
-      <w:r>
-        <w:rPr>
-          <w:rtl w:val="0"/>
+        <w:tabs>
+          <w:tab w:val="right" w:pos="8640"/>
+        </w:tabs>
+        <w:spacing w:after="40" w:before="0" w:line="276" w:lineRule="auto"/>
+        <w:jc w:val="left"/>
+        <w:rPr>
+          <w:rFonts w:ascii="Inter" w:hAnsi="Inter" w:cs="Inter" w:eastAsia="Inter"/>
+          <w:b/>
+          <w:bCs/>
+          <w:i w:val="0"/>
+          <w:iCs w:val="0"/>
+          <w:color w:val="333333"/>
+          <w:sz w:val="22"/>
+          <w:szCs w:val="22"/>
+        </w:rPr>
+      </w:pPr>
+      <w:r>
+        <w:rPr>
+          <w:rFonts w:ascii="Inter" w:hAnsi="Inter" w:cs="Inter" w:eastAsia="Inter"/>
+          <w:b/>
+          <w:bCs/>
+          <w:i w:val="0"/>
+          <w:iCs w:val="0"/>
+          <w:color w:val="333333"/>
+          <w:sz w:val="22"/>
+          <w:szCs w:val="22"/>
         </w:rPr>
         <w:t xml:space="preserve">RN - {experience_unit_specialty}</w:t>
       </w:r>
-    </w:p>
-    <w:p>
-      <w:pPr>
-        <w:rPr/>
-      </w:pPr>
-      <w:r>
-        <w:rPr>
-          <w:rtl w:val="0"/>
+      <w:r>
+        <w:rPr>
+          <w:rFonts w:ascii="Inter" w:hAnsi="Inter" w:cs="Inter" w:eastAsia="Inter"/>
+          <w:b w:val="0"/>
+          <w:bCs w:val="0"/>
+          <w:i w:val="0"/>
+          <w:iCs w:val="0"/>
+          <w:color w:val="555555"/>
+          <w:sz w:val="22"/>
+          <w:szCs w:val="22"/>
+        </w:rPr>
+        <w:tab/>
+      </w:r>
+      <w:r>
+        <w:rPr>
+          <w:rFonts w:ascii="Inter" w:hAnsi="Inter" w:cs="Inter" w:eastAsia="Inter"/>
+          <w:b w:val="0"/>
+          <w:bCs w:val="0"/>
+          <w:i w:val="0"/>
+          <w:iCs w:val="0"/>
+          <w:color w:val="555555"/>
+          <w:sz w:val="22"/>
+          <w:szCs w:val="22"/>
+        </w:rPr>
+        <w:t xml:space="preserve">{experience_employment_dates}</w:t>
+      </w:r>
+    </w:p>
+    <w:p>
+      <w:pPr>
+        <w:spacing w:after="0" w:before="0" w:line="240" w:lineRule="auto"/>
+        <w:jc w:val="left"/>
+        <w:rPr>
+          <w:rFonts w:ascii="Inter" w:hAnsi="Inter" w:cs="Inter" w:eastAsia="Inter"/>
+          <w:b w:val="0"/>
+          <w:bCs w:val="0"/>
+          <w:i w:val="0"/>
+          <w:iCs w:val="0"/>
+          <w:color w:val="333333"/>
+          <w:sz w:val="20"/>
+          <w:szCs w:val="20"/>
+        </w:rPr>
+      </w:pPr>
+      <w:r>
+        <w:rPr>
+          <w:rFonts w:ascii="Inter" w:hAnsi="Inter" w:cs="Inter" w:eastAsia="Inter"/>
+          <w:b w:val="0"/>
+          <w:bCs w:val="0"/>
+          <w:i w:val="0"/>
+          <w:iCs w:val="0"/>
+          <w:color w:val="333333"/>
+          <w:sz w:val="20"/>
+          <w:szCs w:val="20"/>
+        </w:rPr>
+        <w:t xml:space="preserve">{#experience_metrics_rows}</w:t>
+      </w:r>
+    </w:p>
+    <w:p>
+      <w:pPr>
+        <w:spacing w:after="60" w:before="0" w:line="276" w:lineRule="auto"/>
+        <w:jc w:val="left"/>
+        <w:rPr>
+          <w:rFonts w:ascii="Inter" w:hAnsi="Inter" w:cs="Inter" w:eastAsia="Inter"/>
+          <w:b w:val="0"/>
+          <w:bCs w:val="0"/>
+          <w:i/>
+          <w:iCs/>
+          <w:color w:val="555555"/>
+          <w:sz w:val="21"/>
+          <w:szCs w:val="21"/>
+        </w:rPr>
+      </w:pPr>
+      <w:r>
+        <w:rPr>
+          <w:rFonts w:ascii="Inter" w:hAnsi="Inter" w:cs="Inter" w:eastAsia="Inter"/>
+          <w:b w:val="0"/>
+          <w:bCs w:val="0"/>
+          <w:i/>
+          <w:iCs/>
+          <w:color w:val="555555"/>
+          <w:sz w:val="21"/>
+          <w:szCs w:val="21"/>
         </w:rPr>
         <w:t xml:space="preserve">{experience_hospital_name} | {experience_facility_location}</w:t>
       </w:r>
     </w:p>
     <w:p>
       <w:pPr>
-        <w:rPr/>
-      </w:pPr>
-      <w:r>
-        <w:rPr>
-          <w:rtl w:val="0"/>
-        </w:rPr>
-        <w:t xml:space="preserve">{experience_employment_dates}</w:t>
-      </w:r>
-    </w:p>
-    <w:p>
-      <w:pPr>
-        <w:rPr/>
-      </w:pPr>
-      <w:r>
-        <w:rPr>
-          <w:rtl w:val="0"/>
+        <w:spacing w:after="120" w:before="0" w:line="276" w:lineRule="auto"/>
+        <w:jc w:val="left"/>
+        <w:rPr>
+          <w:rFonts w:ascii="Inter" w:hAnsi="Inter" w:cs="Inter" w:eastAsia="Inter"/>
+          <w:b w:val="0"/>
+          <w:bCs w:val="0"/>
+          <w:i w:val="0"/>
+          <w:iCs w:val="0"/>
+          <w:color w:val="333333"/>
+          <w:sz w:val="20"/>
+          <w:szCs w:val="20"/>
+        </w:rPr>
+      </w:pPr>
+      <w:r>
+        <w:rPr>
+          <w:rFonts w:ascii="Inter" w:hAnsi="Inter" w:cs="Inter" w:eastAsia="Inter"/>
+          <w:b w:val="0"/>
+          <w:bCs w:val="0"/>
+          <w:i w:val="0"/>
+          <w:iCs w:val="0"/>
+          <w:color w:val="333333"/>
+          <w:sz w:val="20"/>
+          <w:szCs w:val="20"/>
         </w:rPr>
         <w:t xml:space="preserve">{experience_metrics_line}</w:t>
       </w:r>
     </w:p>
     <w:p>
       <w:pPr>
-        <w:rPr/>
-      </w:pPr>
-      <w:r>
-        <w:rPr>
-          <w:rtl w:val="0"/>
-        </w:rPr>
-      </w:r>
-    </w:p>
-    <w:p>
-      <w:pPr>
-        <w:rPr/>
-      </w:pPr>
-      <w:r>
-        <w:rPr>
-          <w:rtl w:val="0"/>
+        <w:spacing w:after="0" w:before="0" w:line="240" w:lineRule="auto"/>
+        <w:jc w:val="left"/>
+        <w:rPr>
+          <w:rFonts w:ascii="Inter" w:hAnsi="Inter" w:cs="Inter" w:eastAsia="Inter"/>
+          <w:b w:val="0"/>
+          <w:bCs w:val="0"/>
+          <w:i w:val="0"/>
+          <w:iCs w:val="0"/>
+          <w:color w:val="333333"/>
+          <w:sz w:val="20"/>
+          <w:szCs w:val="20"/>
+        </w:rPr>
+      </w:pPr>
+      <w:r>
+        <w:rPr>
+          <w:rFonts w:ascii="Inter" w:hAnsi="Inter" w:cs="Inter" w:eastAsia="Inter"/>
+          <w:b w:val="0"/>
+          <w:bCs w:val="0"/>
+          <w:i w:val="0"/>
+          <w:iCs w:val="0"/>
+          <w:color w:val="333333"/>
+          <w:sz w:val="20"/>
+          <w:szCs w:val="20"/>
+        </w:rPr>
+        <w:t xml:space="preserve">{/experience_metrics_rows}</w:t>
+      </w:r>
+    </w:p>
+    <w:p>
+      <w:pPr>
+        <w:spacing w:after="0" w:before="0" w:line="240" w:lineRule="auto"/>
+        <w:jc w:val="left"/>
+        <w:rPr>
+          <w:rFonts w:ascii="Inter" w:hAnsi="Inter" w:cs="Inter" w:eastAsia="Inter"/>
+          <w:b w:val="0"/>
+          <w:bCs w:val="0"/>
+          <w:i w:val="0"/>
+          <w:iCs w:val="0"/>
+          <w:color w:val="333333"/>
+          <w:sz w:val="21"/>
+          <w:szCs w:val="21"/>
+        </w:rPr>
+      </w:pPr>
+      <w:r>
+        <w:rPr>
+          <w:rFonts w:ascii="Inter" w:hAnsi="Inter" w:cs="Inter" w:eastAsia="Inter"/>
+          <w:b w:val="0"/>
+          <w:bCs w:val="0"/>
+          <w:i w:val="0"/>
+          <w:iCs w:val="0"/>
+          <w:color w:val="333333"/>
+          <w:sz w:val="21"/>
+          <w:szCs w:val="21"/>
+        </w:rPr>
+        <w:t xml:space="preserve">{^experience_metrics_rows}</w:t>
+      </w:r>
+    </w:p>
+    <w:p>
+      <w:pPr>
+        <w:spacing w:after="120" w:before="0" w:line="276" w:lineRule="auto"/>
+        <w:jc w:val="left"/>
+        <w:rPr>
+          <w:rFonts w:ascii="Inter" w:hAnsi="Inter" w:cs="Inter" w:eastAsia="Inter"/>
+          <w:b w:val="0"/>
+          <w:bCs w:val="0"/>
+          <w:i/>
+          <w:iCs/>
+          <w:color w:val="555555"/>
+          <w:sz w:val="21"/>
+          <w:szCs w:val="21"/>
+        </w:rPr>
+      </w:pPr>
+      <w:r>
+        <w:rPr>
+          <w:rFonts w:ascii="Inter" w:hAnsi="Inter" w:cs="Inter" w:eastAsia="Inter"/>
+          <w:b w:val="0"/>
+          <w:bCs w:val="0"/>
+          <w:i/>
+          <w:iCs/>
+          <w:color w:val="555555"/>
+          <w:sz w:val="21"/>
+          <w:szCs w:val="21"/>
+        </w:rPr>
+        <w:t xml:space="preserve">{experience_hospital_name} | {experience_facility_location}</w:t>
+      </w:r>
+    </w:p>
+    <w:p>
+      <w:pPr>
+        <w:spacing w:after="0" w:before="0" w:line="240" w:lineRule="auto"/>
+        <w:jc w:val="left"/>
+        <w:rPr>
+          <w:rFonts w:ascii="Inter" w:hAnsi="Inter" w:cs="Inter" w:eastAsia="Inter"/>
+          <w:b w:val="0"/>
+          <w:bCs w:val="0"/>
+          <w:i w:val="0"/>
+          <w:iCs w:val="0"/>
+          <w:color w:val="333333"/>
+          <w:sz w:val="21"/>
+          <w:szCs w:val="21"/>
+        </w:rPr>
+      </w:pPr>
+      <w:r>
+        <w:rPr>
+          <w:rFonts w:ascii="Inter" w:hAnsi="Inter" w:cs="Inter" w:eastAsia="Inter"/>
+          <w:b w:val="0"/>
+          <w:bCs w:val="0"/>
+          <w:i w:val="0"/>
+          <w:iCs w:val="0"/>
+          <w:color w:val="333333"/>
+          <w:sz w:val="21"/>
+          <w:szCs w:val="21"/>
+        </w:rPr>
+        <w:t xml:space="preserve">{/experience_metrics_rows}</w:t>
+      </w:r>
+    </w:p>
+    <w:p>
+      <w:pPr>
+        <w:spacing w:after="0" w:before="0" w:line="240" w:lineRule="auto"/>
+        <w:jc w:val="left"/>
+        <w:rPr>
+          <w:rFonts w:ascii="Inter" w:hAnsi="Inter" w:cs="Inter" w:eastAsia="Inter"/>
+          <w:b w:val="0"/>
+          <w:bCs w:val="0"/>
+          <w:i w:val="0"/>
+          <w:iCs w:val="0"/>
+          <w:color w:val="333333"/>
+          <w:sz w:val="21"/>
+          <w:szCs w:val="21"/>
+        </w:rPr>
+      </w:pPr>
+      <w:r>
+        <w:rPr>
+          <w:rFonts w:ascii="Inter" w:hAnsi="Inter" w:cs="Inter" w:eastAsia="Inter"/>
+          <w:b w:val="0"/>
+          <w:bCs w:val="0"/>
+          <w:i w:val="0"/>
+          <w:iCs w:val="0"/>
+          <w:color w:val="333333"/>
+          <w:sz w:val="21"/>
+          <w:szCs w:val="21"/>
         </w:rPr>
         <w:t xml:space="preserve">{/professional_experiences}</w:t>
       </w:r>
     </w:p>
     <w:sectPr>
+      <w:headerReference r:id="rId6" w:type="default"/>
+      <w:footerReference r:id="rId7" w:type="default"/>
       <w:pgSz w:h="15840" w:w="12240" w:orient="portrait"/>
       <w:pgMar w:bottom="1440" w:top="1440" w:left="1800" w:right="1800" w:header="720" w:footer="720"/>
       <w:pgNumType w:start="1"/>
     </w:sectPr>
   </w:body>
 </w:document>
+</file>
+
+<file path=word/footer1.xml><?xml version="1.0" encoding="utf-8"?>
+<w:ftr xmlns:mc="http://schemas.openxmlformats.org/markup-compatibility/2006" xmlns:o="urn:schemas-microsoft-com:office:office" xmlns:r="http://schemas.openxmlformats.org/officeDocument/2006/relationships" xmlns:m="http://schemas.openxmlformats.org/officeDocument/2006/math" xmlns:v="urn:schemas-microsoft-com:vml" xmlns:wp="http://schemas.openxmlformats.org/drawingml/2006/wordprocessingDrawing" xmlns:w10="urn:schemas-microsoft-com:office:word" xmlns:w="http://schemas.openxmlformats.org/wordprocessingml/2006/main" xmlns:wne="http://schemas.microsoft.com/office/word/2006/wordml" xmlns:sl="http://schemas.openxmlformats.org/schemaLibrary/2006/main" xmlns:a="http://schemas.openxmlformats.org/drawingml/2006/main" xmlns:pic="http://schemas.openxmlformats.org/drawingml/2006/picture" xmlns:c="http://schemas.openxmlformats.org/drawingml/2006/chart" xmlns:lc="http://schemas.openxmlformats.org/drawingml/2006/lockedCanvas" xmlns:dgm="http://schemas.openxmlformats.org/drawingml/2006/diagram" xmlns:wps="http://schemas.microsoft.com/office/word/2010/wordprocessingShape" xmlns:wpg="http://schemas.microsoft.com/office/word/2010/wordprocessingGroup" xmlns:w14="http://schemas.microsoft.com/office/word/2010/wordml" xmlns:w15="http://schemas.microsoft.com/office/word/2012/wordml" xmlns:w16="http://schemas.microsoft.com/office/word/2018/wordml" xmlns:w16cex="http://schemas.microsoft.com/office/word/2018/wordml/cex" xmlns:w16cid="http://schemas.microsoft.com/office/word/2016/wordml/cid" xmlns="http://schemas.microsoft.com/office/tasks/2019/documenttasks" xmlns:cr="http://schemas.microsoft.com/office/comments/2020/reactions">
+  <w:p>
+    <w:pPr>
+      <w:keepNext w:val="0"/>
+      <w:keepLines w:val="0"/>
+      <w:pageBreakBefore w:val="0"/>
+      <w:widowControl w:val="1"/>
+      <w:pBdr>
+        <w:top w:space="0" w:sz="0" w:val="nil"/>
+        <w:left w:space="0" w:sz="0" w:val="nil"/>
+        <w:bottom w:space="0" w:sz="0" w:val="nil"/>
+        <w:right w:space="0" w:sz="0" w:val="nil"/>
+        <w:between w:space="0" w:sz="0" w:val="nil"/>
+      </w:pBdr>
+      <w:shd w:fill="auto" w:val="clear"/>
+      <w:tabs>
+        <w:tab w:val="right" w:leader="none" w:pos="9020"/>
+      </w:tabs>
+      <w:spacing w:after="0" w:before="0" w:line="240" w:lineRule="auto"/>
+      <w:ind w:left="0" w:right="0" w:firstLine="0"/>
+      <w:jc w:val="left"/>
+      <w:rPr>
+        <w:rFonts w:ascii="Inter" w:cs="Inter" w:eastAsia="Inter" w:hAnsi="Inter"/>
+        <w:b w:val="0"/>
+        <w:bCs w:val="0"/>
+        <w:i w:val="0"/>
+        <w:iCs w:val="0"/>
+        <w:smallCaps w:val="0"/>
+        <w:strike w:val="0"/>
+        <w:color w:val="000000"/>
+        <w:sz w:val="24"/>
+        <w:szCs w:val="24"/>
+        <w:u w:val="none"/>
+        <w:shd w:fill="auto" w:val="clear"/>
+        <w:vertAlign w:val="baseline"/>
+      </w:rPr>
+    </w:pPr>
+    <w:r>
+      <w:rPr>
+        <w:rtl w:val="0"/>
+      </w:rPr>
+    </w:r>
+  </w:p>
+</w:ftr>
+</file>
+
+<file path=word/header1.xml><?xml version="1.0" encoding="utf-8"?>
+<w:hdr xmlns:mc="http://schemas.openxmlformats.org/markup-compatibility/2006" xmlns:o="urn:schemas-microsoft-com:office:office" xmlns:r="http://schemas.openxmlformats.org/officeDocument/2006/relationships" xmlns:m="http://schemas.openxmlformats.org/officeDocument/2006/math" xmlns:v="urn:schemas-microsoft-com:vml" xmlns:wp="http://schemas.openxmlformats.org/drawingml/2006/wordprocessingDrawing" xmlns:w10="urn:schemas-microsoft-com:office:word" xmlns:w="http://schemas.openxmlformats.org/wordprocessingml/2006/main" xmlns:wne="http://schemas.microsoft.com/office/word/2006/wordml" xmlns:sl="http://schemas.openxmlformats.org/schemaLibrary/2006/main" xmlns:a="http://schemas.openxmlformats.org/drawingml/2006/main" xmlns:pic="http://schemas.openxmlformats.org/drawingml/2006/picture" xmlns:c="http://schemas.openxmlformats.org/drawingml/2006/chart" xmlns:lc="http://schemas.openxmlformats.org/drawingml/2006/lockedCanvas" xmlns:dgm="http://schemas.openxmlformats.org/drawingml/2006/diagram" xmlns:wps="http://schemas.microsoft.com/office/word/2010/wordprocessingShape" xmlns:wpg="http://schemas.microsoft.com/office/word/2010/wordprocessingGroup" xmlns:w14="http://schemas.microsoft.com/office/word/2010/wordml" xmlns:w15="http://schemas.microsoft.com/office/word/2012/wordml" xmlns:w16="http://schemas.microsoft.com/office/word/2018/wordml" xmlns:w16cex="http://schemas.microsoft.com/office/word/2018/wordml/cex" xmlns:w16cid="http://schemas.microsoft.com/office/word/2016/wordml/cid" xmlns="http://schemas.microsoft.com/office/tasks/2019/documenttasks" xmlns:cr="http://schemas.microsoft.com/office/comments/2020/reactions">
+  <w:p>
+    <w:pPr>
+      <w:keepNext w:val="0"/>
+      <w:keepLines w:val="0"/>
+      <w:pageBreakBefore w:val="0"/>
+      <w:widowControl w:val="1"/>
+      <w:pBdr>
+        <w:top w:space="0" w:sz="0" w:val="nil"/>
+        <w:left w:space="0" w:sz="0" w:val="nil"/>
+        <w:bottom w:space="0" w:sz="0" w:val="nil"/>
+        <w:right w:space="0" w:sz="0" w:val="nil"/>
+        <w:between w:space="0" w:sz="0" w:val="nil"/>
+      </w:pBdr>
+      <w:shd w:fill="auto" w:val="clear"/>
+      <w:tabs>
+        <w:tab w:val="right" w:leader="none" w:pos="9020"/>
+      </w:tabs>
+      <w:spacing w:after="0" w:before="0" w:line="240" w:lineRule="auto"/>
+      <w:ind w:left="0" w:right="0" w:firstLine="0"/>
+      <w:jc w:val="left"/>
+      <w:rPr>
+        <w:rFonts w:ascii="Inter" w:cs="Inter" w:eastAsia="Inter" w:hAnsi="Inter"/>
+        <w:b w:val="0"/>
+        <w:bCs w:val="0"/>
+        <w:i w:val="0"/>
+        <w:iCs w:val="0"/>
+        <w:smallCaps w:val="0"/>
+        <w:strike w:val="0"/>
+        <w:color w:val="000000"/>
+        <w:sz w:val="24"/>
+        <w:szCs w:val="24"/>
+        <w:u w:val="none"/>
+        <w:shd w:fill="auto" w:val="clear"/>
+        <w:vertAlign w:val="baseline"/>
+      </w:rPr>
+    </w:pPr>
+    <w:r>
+      <w:rPr>
+        <w:rtl w:val="0"/>
+      </w:rPr>
+    </w:r>
+  </w:p>
+</w:hdr>
 </file>
 
 <file path=word/numbering.xml><?xml version="1.0" encoding="utf-8"?>
@@ -365,106 +1081,193 @@
         <w:ind w:left="360" w:hanging="360"/>
       </w:pPr>
       <w:rPr>
-        <w:rFonts w:ascii="Arial" w:hAnsi="Arial" w:cs="Arial" w:eastAsia="Arial"/>
+        <w:rFonts w:ascii="Inter" w:cs="Inter" w:eastAsia="Inter" w:hAnsi="Inter"/>
+        <w:b w:val="0"/>
+        <w:bCs w:val="0"/>
+        <w:i w:val="0"/>
+        <w:iCs w:val="0"/>
+        <w:smallCaps w:val="0"/>
+        <w:strike w:val="0"/>
         <w:sz w:val="20"/>
         <w:szCs w:val="20"/>
-        <w:u w:val="none"/>
+        <w:shd w:fill="auto" w:val="clear"/>
+        <w:vertAlign w:val="baseline"/>
       </w:rPr>
     </w:lvl>
     <w:lvl w:ilvl="1">
       <w:start w:val="1"/>
       <w:numFmt w:val="bullet"/>
-      <w:lvlText w:val=""/>
+      <w:lvlText w:val="•"/>
       <w:lvlJc w:val="left"/>
       <w:pPr>
-        <w:ind w:left="0" w:firstLine="0"/>
+        <w:ind w:left="1080" w:hanging="360"/>
       </w:pPr>
       <w:rPr>
-        <w:u w:val="none"/>
+        <w:rFonts w:ascii="Inter" w:cs="Inter" w:eastAsia="Inter" w:hAnsi="Inter"/>
+        <w:b w:val="0"/>
+        <w:bCs w:val="0"/>
+        <w:i w:val="0"/>
+        <w:iCs w:val="0"/>
+        <w:smallCaps w:val="0"/>
+        <w:strike w:val="0"/>
+        <w:sz w:val="20"/>
+        <w:szCs w:val="20"/>
+        <w:shd w:fill="auto" w:val="clear"/>
+        <w:vertAlign w:val="baseline"/>
       </w:rPr>
     </w:lvl>
     <w:lvl w:ilvl="2">
       <w:start w:val="1"/>
       <w:numFmt w:val="bullet"/>
-      <w:lvlText w:val=""/>
+      <w:lvlText w:val="•"/>
       <w:lvlJc w:val="left"/>
       <w:pPr>
-        <w:ind w:left="0" w:firstLine="0"/>
+        <w:ind w:left="1800" w:hanging="360"/>
       </w:pPr>
       <w:rPr>
-        <w:u w:val="none"/>
+        <w:rFonts w:ascii="Inter" w:cs="Inter" w:eastAsia="Inter" w:hAnsi="Inter"/>
+        <w:b w:val="0"/>
+        <w:bCs w:val="0"/>
+        <w:i w:val="0"/>
+        <w:iCs w:val="0"/>
+        <w:smallCaps w:val="0"/>
+        <w:strike w:val="0"/>
+        <w:sz w:val="20"/>
+        <w:szCs w:val="20"/>
+        <w:shd w:fill="auto" w:val="clear"/>
+        <w:vertAlign w:val="baseline"/>
       </w:rPr>
     </w:lvl>
     <w:lvl w:ilvl="3">
       <w:start w:val="1"/>
       <w:numFmt w:val="bullet"/>
-      <w:lvlText w:val=""/>
+      <w:lvlText w:val="•"/>
       <w:lvlJc w:val="left"/>
       <w:pPr>
-        <w:ind w:left="0" w:firstLine="0"/>
+        <w:ind w:left="2520" w:hanging="360"/>
       </w:pPr>
       <w:rPr>
-        <w:u w:val="none"/>
+        <w:rFonts w:ascii="Inter" w:cs="Inter" w:eastAsia="Inter" w:hAnsi="Inter"/>
+        <w:b w:val="0"/>
+        <w:bCs w:val="0"/>
+        <w:i w:val="0"/>
+        <w:iCs w:val="0"/>
+        <w:smallCaps w:val="0"/>
+        <w:strike w:val="0"/>
+        <w:sz w:val="20"/>
+        <w:szCs w:val="20"/>
+        <w:shd w:fill="auto" w:val="clear"/>
+        <w:vertAlign w:val="baseline"/>
       </w:rPr>
     </w:lvl>
     <w:lvl w:ilvl="4">
       <w:start w:val="1"/>
       <w:numFmt w:val="bullet"/>
-      <w:lvlText w:val=""/>
+      <w:lvlText w:val="•"/>
       <w:lvlJc w:val="left"/>
       <w:pPr>
-        <w:ind w:left="0" w:firstLine="0"/>
+        <w:ind w:left="3240" w:hanging="360"/>
       </w:pPr>
       <w:rPr>
-        <w:u w:val="none"/>
+        <w:rFonts w:ascii="Inter" w:cs="Inter" w:eastAsia="Inter" w:hAnsi="Inter"/>
+        <w:b w:val="0"/>
+        <w:bCs w:val="0"/>
+        <w:i w:val="0"/>
+        <w:iCs w:val="0"/>
+        <w:smallCaps w:val="0"/>
+        <w:strike w:val="0"/>
+        <w:sz w:val="20"/>
+        <w:szCs w:val="20"/>
+        <w:shd w:fill="auto" w:val="clear"/>
+        <w:vertAlign w:val="baseline"/>
       </w:rPr>
     </w:lvl>
     <w:lvl w:ilvl="5">
       <w:start w:val="1"/>
       <w:numFmt w:val="bullet"/>
-      <w:lvlText w:val=""/>
+      <w:lvlText w:val="•"/>
       <w:lvlJc w:val="left"/>
       <w:pPr>
-        <w:ind w:left="0" w:firstLine="0"/>
+        <w:ind w:left="3960" w:hanging="360"/>
       </w:pPr>
       <w:rPr>
-        <w:u w:val="none"/>
+        <w:rFonts w:ascii="Inter" w:cs="Inter" w:eastAsia="Inter" w:hAnsi="Inter"/>
+        <w:b w:val="0"/>
+        <w:bCs w:val="0"/>
+        <w:i w:val="0"/>
+        <w:iCs w:val="0"/>
+        <w:smallCaps w:val="0"/>
+        <w:strike w:val="0"/>
+        <w:sz w:val="20"/>
+        <w:szCs w:val="20"/>
+        <w:shd w:fill="auto" w:val="clear"/>
+        <w:vertAlign w:val="baseline"/>
       </w:rPr>
     </w:lvl>
     <w:lvl w:ilvl="6">
       <w:start w:val="1"/>
       <w:numFmt w:val="bullet"/>
-      <w:lvlText w:val=""/>
+      <w:lvlText w:val="•"/>
       <w:lvlJc w:val="left"/>
       <w:pPr>
-        <w:ind w:left="0" w:firstLine="0"/>
+        <w:ind w:left="4680" w:hanging="360"/>
       </w:pPr>
       <w:rPr>
-        <w:u w:val="none"/>
+        <w:rFonts w:ascii="Inter" w:cs="Inter" w:eastAsia="Inter" w:hAnsi="Inter"/>
+        <w:b w:val="0"/>
+        <w:bCs w:val="0"/>
+        <w:i w:val="0"/>
+        <w:iCs w:val="0"/>
+        <w:smallCaps w:val="0"/>
+        <w:strike w:val="0"/>
+        <w:sz w:val="20"/>
+        <w:szCs w:val="20"/>
+        <w:shd w:fill="auto" w:val="clear"/>
+        <w:vertAlign w:val="baseline"/>
       </w:rPr>
     </w:lvl>
     <w:lvl w:ilvl="7">
       <w:start w:val="1"/>
       <w:numFmt w:val="bullet"/>
-      <w:lvlText w:val=""/>
+      <w:lvlText w:val="•"/>
       <w:lvlJc w:val="left"/>
       <w:pPr>
-        <w:ind w:left="0" w:firstLine="0"/>
+        <w:ind w:left="5400" w:hanging="360"/>
       </w:pPr>
       <w:rPr>
-        <w:u w:val="none"/>
+        <w:rFonts w:ascii="Inter" w:cs="Inter" w:eastAsia="Inter" w:hAnsi="Inter"/>
+        <w:b w:val="0"/>
+        <w:bCs w:val="0"/>
+        <w:i w:val="0"/>
+        <w:iCs w:val="0"/>
+        <w:smallCaps w:val="0"/>
+        <w:strike w:val="0"/>
+        <w:sz w:val="20"/>
+        <w:szCs w:val="20"/>
+        <w:shd w:fill="auto" w:val="clear"/>
+        <w:vertAlign w:val="baseline"/>
       </w:rPr>
     </w:lvl>
     <w:lvl w:ilvl="8">
       <w:start w:val="1"/>
       <w:numFmt w:val="bullet"/>
-      <w:lvlText w:val=""/>
+      <w:lvlText w:val="•"/>
       <w:lvlJc w:val="left"/>
       <w:pPr>
-        <w:ind w:left="0" w:firstLine="0"/>
+        <w:ind w:left="6120" w:hanging="360"/>
       </w:pPr>
       <w:rPr>
-        <w:u w:val="none"/>
+        <w:rFonts w:ascii="Inter" w:cs="Inter" w:eastAsia="Inter" w:hAnsi="Inter"/>
+        <w:b w:val="0"/>
+        <w:bCs w:val="0"/>
+        <w:i w:val="0"/>
+        <w:iCs w:val="0"/>
+        <w:smallCaps w:val="0"/>
+        <w:strike w:val="0"/>
+        <w:sz w:val="20"/>
+        <w:szCs w:val="20"/>
+        <w:shd w:fill="auto" w:val="clear"/>
+        <w:vertAlign w:val="baseline"/>
       </w:rPr>
     </w:lvl>
   </w:abstractNum>
@@ -479,15 +1282,16 @@
   <w:docDefaults>
     <w:rPrDefault>
       <w:rPr>
-        <w:rFonts w:ascii="Cambria" w:cs="Cambria" w:eastAsia="Cambria" w:hAnsi="Cambria"/>
-        <w:sz w:val="22"/>
-        <w:szCs w:val="22"/>
+        <w:rFonts w:ascii="Inter" w:hAnsi="Inter" w:cs="Inter" w:eastAsia="Inter"/>
+        <w:color w:val="333333"/>
+        <w:sz w:val="21"/>
+        <w:szCs w:val="21"/>
         <w:lang w:val="en"/>
       </w:rPr>
     </w:rPrDefault>
     <w:pPrDefault>
       <w:pPr>
-        <w:spacing w:after="200" w:line="276" w:lineRule="auto"/>
+        <w:spacing w:after="60" w:line="336" w:lineRule="auto"/>
       </w:pPr>
     </w:pPrDefault>
   </w:docDefaults>
@@ -512,15 +1316,14 @@
     <w:pPr>
       <w:keepNext w:val="1"/>
       <w:keepLines w:val="1"/>
-      <w:spacing w:after="0" w:before="480" w:lineRule="auto"/>
+      <w:pageBreakBefore w:val="0"/>
+      <w:spacing w:after="120" w:before="480" w:lineRule="auto"/>
     </w:pPr>
     <w:rPr>
-      <w:rFonts w:ascii="Calibri" w:cs="Calibri" w:eastAsia="Calibri" w:hAnsi="Calibri"/>
       <w:b w:val="1"/>
       <w:bCs w:val="1"/>
-      <w:color w:val="366091"/>
-      <w:sz w:val="28"/>
-      <w:szCs w:val="28"/>
+      <w:sz w:val="48"/>
+      <w:szCs w:val="48"/>
     </w:rPr>
   </w:style>
   <w:style w:type="paragraph" w:styleId="Heading2">
@@ -530,15 +1333,14 @@
     <w:pPr>
       <w:keepNext w:val="1"/>
       <w:keepLines w:val="1"/>
-      <w:spacing w:after="0" w:before="200" w:lineRule="auto"/>
+      <w:pageBreakBefore w:val="0"/>
+      <w:spacing w:after="80" w:before="360" w:lineRule="auto"/>
     </w:pPr>
     <w:rPr>
-      <w:rFonts w:ascii="Calibri" w:cs="Calibri" w:eastAsia="Calibri" w:hAnsi="Calibri"/>
       <w:b w:val="1"/>
       <w:bCs w:val="1"/>
-      <w:color w:val="4f81bd"/>
-      <w:sz w:val="26"/>
-      <w:szCs w:val="26"/>
+      <w:sz w:val="36"/>
+      <w:szCs w:val="36"/>
     </w:rPr>
   </w:style>
   <w:style w:type="paragraph" w:styleId="Heading3">
@@ -548,13 +1350,14 @@
     <w:pPr>
       <w:keepNext w:val="1"/>
       <w:keepLines w:val="1"/>
-      <w:spacing w:after="0" w:before="200" w:lineRule="auto"/>
+      <w:pageBreakBefore w:val="0"/>
+      <w:spacing w:after="80" w:before="280" w:lineRule="auto"/>
     </w:pPr>
     <w:rPr>
-      <w:rFonts w:ascii="Calibri" w:cs="Calibri" w:eastAsia="Calibri" w:hAnsi="Calibri"/>
       <w:b w:val="1"/>
       <w:bCs w:val="1"/>
-      <w:color w:val="4f81bd"/>
+      <w:sz w:val="28"/>
+      <w:szCs w:val="28"/>
     </w:rPr>
   </w:style>
   <w:style w:type="paragraph" w:styleId="Heading4">
@@ -564,15 +1367,14 @@
     <w:pPr>
       <w:keepNext w:val="1"/>
       <w:keepLines w:val="1"/>
-      <w:spacing w:after="0" w:before="200" w:lineRule="auto"/>
+      <w:pageBreakBefore w:val="0"/>
+      <w:spacing w:after="40" w:before="240" w:lineRule="auto"/>
     </w:pPr>
     <w:rPr>
-      <w:rFonts w:ascii="Calibri" w:cs="Calibri" w:eastAsia="Calibri" w:hAnsi="Calibri"/>
       <w:b w:val="1"/>
       <w:bCs w:val="1"/>
-      <w:i w:val="1"/>
-      <w:iCs w:val="1"/>
-      <w:color w:val="4f81bd"/>
+      <w:sz w:val="24"/>
+      <w:szCs w:val="24"/>
     </w:rPr>
   </w:style>
   <w:style w:type="paragraph" w:styleId="Heading5">
@@ -582,11 +1384,14 @@
     <w:pPr>
       <w:keepNext w:val="1"/>
       <w:keepLines w:val="1"/>
-      <w:spacing w:after="0" w:before="200" w:lineRule="auto"/>
+      <w:pageBreakBefore w:val="0"/>
+      <w:spacing w:after="40" w:before="220" w:lineRule="auto"/>
     </w:pPr>
     <w:rPr>
-      <w:rFonts w:ascii="Calibri" w:cs="Calibri" w:eastAsia="Calibri" w:hAnsi="Calibri"/>
-      <w:color w:val="243f61"/>
+      <w:b w:val="1"/>
+      <w:bCs w:val="1"/>
+      <w:sz w:val="22"/>
+      <w:szCs w:val="22"/>
     </w:rPr>
   </w:style>
   <w:style w:type="paragraph" w:styleId="Heading6">
@@ -596,13 +1401,14 @@
     <w:pPr>
       <w:keepNext w:val="1"/>
       <w:keepLines w:val="1"/>
-      <w:spacing w:after="0" w:before="200" w:lineRule="auto"/>
+      <w:pageBreakBefore w:val="0"/>
+      <w:spacing w:after="40" w:before="200" w:lineRule="auto"/>
     </w:pPr>
     <w:rPr>
-      <w:rFonts w:ascii="Calibri" w:cs="Calibri" w:eastAsia="Calibri" w:hAnsi="Calibri"/>
-      <w:i w:val="1"/>
-      <w:iCs w:val="1"/>
-      <w:color w:val="243f61"/>
+      <w:b w:val="1"/>
+      <w:bCs w:val="1"/>
+      <w:sz w:val="20"/>
+      <w:szCs w:val="20"/>
     </w:rPr>
   </w:style>
   <w:style w:type="paragraph" w:styleId="Title">
@@ -610,30 +1416,35 @@
     <w:basedOn w:val="Normal"/>
     <w:next w:val="Normal"/>
     <w:pPr>
-      <w:pBdr>
-        <w:bottom w:color="4f81bd" w:space="4" w:sz="8" w:val="single"/>
-      </w:pBdr>
-      <w:spacing w:after="300" w:line="240" w:lineRule="auto"/>
+      <w:keepNext w:val="1"/>
+      <w:keepLines w:val="1"/>
+      <w:pageBreakBefore w:val="0"/>
+      <w:spacing w:after="120" w:before="480" w:lineRule="auto"/>
     </w:pPr>
     <w:rPr>
-      <w:rFonts w:ascii="Calibri" w:cs="Calibri" w:eastAsia="Calibri" w:hAnsi="Calibri"/>
-      <w:color w:val="17365d"/>
-      <w:sz w:val="52"/>
-      <w:szCs w:val="52"/>
+      <w:b w:val="1"/>
+      <w:bCs w:val="1"/>
+      <w:sz w:val="72"/>
+      <w:szCs w:val="72"/>
     </w:rPr>
   </w:style>
   <w:style w:type="paragraph" w:styleId="Subtitle">
     <w:name w:val="Subtitle"/>
     <w:basedOn w:val="Normal"/>
     <w:next w:val="Normal"/>
-    <w:pPr/>
+    <w:pPr>
+      <w:keepNext w:val="1"/>
+      <w:keepLines w:val="1"/>
+      <w:pageBreakBefore w:val="0"/>
+      <w:spacing w:after="80" w:before="360" w:lineRule="auto"/>
+    </w:pPr>
     <w:rPr>
-      <w:rFonts w:ascii="Calibri" w:cs="Calibri" w:eastAsia="Calibri" w:hAnsi="Calibri"/>
+      <w:rFonts w:ascii="Inter" w:cs="Inter" w:eastAsia="Inter" w:hAnsi="Inter"/>
       <w:i w:val="1"/>
       <w:iCs w:val="1"/>
-      <w:color w:val="4f81bd"/>
-      <w:sz w:val="24"/>
-      <w:szCs w:val="24"/>
+      <w:color w:val="666666"/>
+      <w:sz w:val="48"/>
+      <w:szCs w:val="48"/>
     </w:rPr>
   </w:style>
 </w:styles>
@@ -682,7 +1493,7 @@
     </a:clrScheme>
     <a:fontScheme name="Office">
       <a:majorFont>
-        <a:latin typeface="Calibri"/>
+        <a:latin typeface="Inter"/>
         <a:ea typeface=""/>
         <a:cs typeface=""/>
         <a:font script="Jpan" typeface="ＭＳ ゴシック"/>
@@ -717,15 +1528,15 @@
         <a:font script="Geor" typeface="Sylfaen"/>
       </a:majorFont>
       <a:minorFont>
-        <a:latin typeface="Cambria"/>
+        <a:latin typeface="Inter"/>
         <a:ea typeface=""/>
         <a:cs typeface=""/>
         <a:font script="Jpan" typeface="ＭＳ 明朝"/>
         <a:font script="Hang" typeface="맑은 고딕"/>
         <a:font script="Hans" typeface="宋体"/>
         <a:font script="Hant" typeface="新細明體"/>
-        <a:font script="Arab" typeface="Arial"/>
-        <a:font script="Hebr" typeface="Arial"/>
+        <a:font script="Arab" typeface="Inter"/>
+        <a:font script="Hebr" typeface="Inter"/>
         <a:font script="Thai" typeface="Cordia New"/>
         <a:font script="Ethi" typeface="Nyala"/>
         <a:font script="Beng" typeface="Vrinda"/>
@@ -747,7 +1558,7 @@
         <a:font script="Laoo" typeface="DokChampa"/>
         <a:font script="Sinh" typeface="Iskoola Pota"/>
         <a:font script="Mong" typeface="Mongolian Baiti"/>
-        <a:font script="Viet" typeface="Arial"/>
+        <a:font script="Viet" typeface="Inter"/>
         <a:font script="Uigh" typeface="Microsoft Uighur"/>
         <a:font script="Geor" typeface="Sylfaen"/>
       </a:minorFont>

</xml_diff>

<commit_message>
Print per-job highlights as bullets under the employment metrics line.
Co-authored-by: Cursor <cursoragent@cursor.com>
</commit_message>
<xml_diff>
--- a/server/assets/template.docx
+++ b/server/assets/template.docx
@@ -792,7 +792,7 @@
     </w:p>
     <w:p>
       <w:pPr>
-        <w:spacing w:after="120" w:before="0" w:line="276" w:lineRule="auto"/>
+        <w:spacing w:after="60" w:before="0" w:line="276" w:lineRule="auto"/>
         <w:jc w:val="left"/>
         <w:rPr>
           <w:rFonts w:ascii="Inter" w:hAnsi="Inter" w:cs="Inter" w:eastAsia="Inter"/>
@@ -879,7 +879,7 @@
     </w:p>
     <w:p>
       <w:pPr>
-        <w:spacing w:after="120" w:before="0" w:line="276" w:lineRule="auto"/>
+        <w:spacing w:after="60" w:before="0" w:line="276" w:lineRule="auto"/>
         <w:jc w:val="left"/>
         <w:rPr>
           <w:rFonts w:ascii="Inter" w:hAnsi="Inter" w:cs="Inter" w:eastAsia="Inter"/>
@@ -933,6 +933,97 @@
           <w:szCs w:val="21"/>
         </w:rPr>
         <w:t xml:space="preserve">{/experience_metrics_rows}</w:t>
+      </w:r>
+    </w:p>
+    <w:p>
+      <w:pPr>
+        <w:spacing w:after="0" w:before="0" w:line="240" w:lineRule="auto"/>
+        <w:jc w:val="left"/>
+        <w:rPr>
+          <w:rFonts w:ascii="Inter" w:hAnsi="Inter" w:cs="Inter" w:eastAsia="Inter"/>
+          <w:b w:val="0"/>
+          <w:bCs w:val="0"/>
+          <w:i w:val="0"/>
+          <w:iCs w:val="0"/>
+          <w:color w:val="333333"/>
+          <w:sz w:val="20"/>
+          <w:szCs w:val="20"/>
+        </w:rPr>
+      </w:pPr>
+      <w:r>
+        <w:rPr>
+          <w:rFonts w:ascii="Inter" w:hAnsi="Inter" w:cs="Inter" w:eastAsia="Inter"/>
+          <w:b w:val="0"/>
+          <w:bCs w:val="0"/>
+          <w:i w:val="0"/>
+          <w:iCs w:val="0"/>
+          <w:color w:val="333333"/>
+          <w:sz w:val="20"/>
+          <w:szCs w:val="20"/>
+        </w:rPr>
+        <w:t xml:space="preserve">{#experience_highlights}</w:t>
+      </w:r>
+    </w:p>
+    <w:p>
+      <w:pPr>
+        <w:numPr>
+          <w:ilvl w:val="0"/>
+          <w:numId w:val="1"/>
+        </w:numPr>
+        <w:spacing w:after="60" w:before="0" w:line="276" w:lineRule="auto"/>
+        <w:jc w:val="left"/>
+        <w:rPr>
+          <w:rFonts w:ascii="Inter" w:hAnsi="Inter" w:cs="Inter" w:eastAsia="Inter"/>
+          <w:b w:val="0"/>
+          <w:bCs w:val="0"/>
+          <w:i w:val="0"/>
+          <w:iCs w:val="0"/>
+          <w:color w:val="333333"/>
+          <w:sz w:val="20"/>
+          <w:szCs w:val="20"/>
+        </w:rPr>
+      </w:pPr>
+      <w:r>
+        <w:rPr>
+          <w:rFonts w:ascii="Inter" w:hAnsi="Inter" w:cs="Inter" w:eastAsia="Inter"/>
+          <w:b w:val="0"/>
+          <w:bCs w:val="0"/>
+          <w:i w:val="0"/>
+          <w:iCs w:val="0"/>
+          <w:color w:val="333333"/>
+          <w:sz w:val="20"/>
+          <w:szCs w:val="20"/>
+        </w:rPr>
+        <w:t xml:space="preserve">{.}</w:t>
+      </w:r>
+    </w:p>
+    <w:p>
+      <w:pPr>
+        <w:spacing w:after="0" w:before="0" w:line="240" w:lineRule="auto"/>
+        <w:jc w:val="left"/>
+        <w:rPr>
+          <w:rFonts w:ascii="Inter" w:hAnsi="Inter" w:cs="Inter" w:eastAsia="Inter"/>
+          <w:b w:val="0"/>
+          <w:bCs w:val="0"/>
+          <w:i w:val="0"/>
+          <w:iCs w:val="0"/>
+          <w:color w:val="333333"/>
+          <w:sz w:val="20"/>
+          <w:szCs w:val="20"/>
+        </w:rPr>
+      </w:pPr>
+      <w:r>
+        <w:rPr>
+          <w:rFonts w:ascii="Inter" w:hAnsi="Inter" w:cs="Inter" w:eastAsia="Inter"/>
+          <w:b w:val="0"/>
+          <w:bCs w:val="0"/>
+          <w:i w:val="0"/>
+          <w:iCs w:val="0"/>
+          <w:color w:val="333333"/>
+          <w:sz w:val="20"/>
+          <w:szCs w:val="20"/>
+        </w:rPr>
+        <w:t xml:space="preserve">{/experience_highlights}</w:t>
       </w:r>
     </w:p>
     <w:p>

</xml_diff>

<commit_message>
Print per-job highlights as bullets under the employment metrics line. (#196)
Co-authored-by: juanrod <juanrod@Skyss-MacBook-Neo.local>
Co-authored-by: Cursor <cursoragent@cursor.com>
</commit_message>
<xml_diff>
--- a/server/assets/template.docx
+++ b/server/assets/template.docx
@@ -792,7 +792,7 @@
     </w:p>
     <w:p>
       <w:pPr>
-        <w:spacing w:after="120" w:before="0" w:line="276" w:lineRule="auto"/>
+        <w:spacing w:after="60" w:before="0" w:line="276" w:lineRule="auto"/>
         <w:jc w:val="left"/>
         <w:rPr>
           <w:rFonts w:ascii="Inter" w:hAnsi="Inter" w:cs="Inter" w:eastAsia="Inter"/>
@@ -879,7 +879,7 @@
     </w:p>
     <w:p>
       <w:pPr>
-        <w:spacing w:after="120" w:before="0" w:line="276" w:lineRule="auto"/>
+        <w:spacing w:after="60" w:before="0" w:line="276" w:lineRule="auto"/>
         <w:jc w:val="left"/>
         <w:rPr>
           <w:rFonts w:ascii="Inter" w:hAnsi="Inter" w:cs="Inter" w:eastAsia="Inter"/>
@@ -933,6 +933,97 @@
           <w:szCs w:val="21"/>
         </w:rPr>
         <w:t xml:space="preserve">{/experience_metrics_rows}</w:t>
+      </w:r>
+    </w:p>
+    <w:p>
+      <w:pPr>
+        <w:spacing w:after="0" w:before="0" w:line="240" w:lineRule="auto"/>
+        <w:jc w:val="left"/>
+        <w:rPr>
+          <w:rFonts w:ascii="Inter" w:hAnsi="Inter" w:cs="Inter" w:eastAsia="Inter"/>
+          <w:b w:val="0"/>
+          <w:bCs w:val="0"/>
+          <w:i w:val="0"/>
+          <w:iCs w:val="0"/>
+          <w:color w:val="333333"/>
+          <w:sz w:val="20"/>
+          <w:szCs w:val="20"/>
+        </w:rPr>
+      </w:pPr>
+      <w:r>
+        <w:rPr>
+          <w:rFonts w:ascii="Inter" w:hAnsi="Inter" w:cs="Inter" w:eastAsia="Inter"/>
+          <w:b w:val="0"/>
+          <w:bCs w:val="0"/>
+          <w:i w:val="0"/>
+          <w:iCs w:val="0"/>
+          <w:color w:val="333333"/>
+          <w:sz w:val="20"/>
+          <w:szCs w:val="20"/>
+        </w:rPr>
+        <w:t xml:space="preserve">{#experience_highlights}</w:t>
+      </w:r>
+    </w:p>
+    <w:p>
+      <w:pPr>
+        <w:numPr>
+          <w:ilvl w:val="0"/>
+          <w:numId w:val="1"/>
+        </w:numPr>
+        <w:spacing w:after="60" w:before="0" w:line="276" w:lineRule="auto"/>
+        <w:jc w:val="left"/>
+        <w:rPr>
+          <w:rFonts w:ascii="Inter" w:hAnsi="Inter" w:cs="Inter" w:eastAsia="Inter"/>
+          <w:b w:val="0"/>
+          <w:bCs w:val="0"/>
+          <w:i w:val="0"/>
+          <w:iCs w:val="0"/>
+          <w:color w:val="333333"/>
+          <w:sz w:val="20"/>
+          <w:szCs w:val="20"/>
+        </w:rPr>
+      </w:pPr>
+      <w:r>
+        <w:rPr>
+          <w:rFonts w:ascii="Inter" w:hAnsi="Inter" w:cs="Inter" w:eastAsia="Inter"/>
+          <w:b w:val="0"/>
+          <w:bCs w:val="0"/>
+          <w:i w:val="0"/>
+          <w:iCs w:val="0"/>
+          <w:color w:val="333333"/>
+          <w:sz w:val="20"/>
+          <w:szCs w:val="20"/>
+        </w:rPr>
+        <w:t xml:space="preserve">{.}</w:t>
+      </w:r>
+    </w:p>
+    <w:p>
+      <w:pPr>
+        <w:spacing w:after="0" w:before="0" w:line="240" w:lineRule="auto"/>
+        <w:jc w:val="left"/>
+        <w:rPr>
+          <w:rFonts w:ascii="Inter" w:hAnsi="Inter" w:cs="Inter" w:eastAsia="Inter"/>
+          <w:b w:val="0"/>
+          <w:bCs w:val="0"/>
+          <w:i w:val="0"/>
+          <w:iCs w:val="0"/>
+          <w:color w:val="333333"/>
+          <w:sz w:val="20"/>
+          <w:szCs w:val="20"/>
+        </w:rPr>
+      </w:pPr>
+      <w:r>
+        <w:rPr>
+          <w:rFonts w:ascii="Inter" w:hAnsi="Inter" w:cs="Inter" w:eastAsia="Inter"/>
+          <w:b w:val="0"/>
+          <w:bCs w:val="0"/>
+          <w:i w:val="0"/>
+          <w:iCs w:val="0"/>
+          <w:color w:val="333333"/>
+          <w:sz w:val="20"/>
+          <w:szCs w:val="20"/>
+        </w:rPr>
+        <w:t xml:space="preserve">{/experience_highlights}</w:t>
       </w:r>
     </w:p>
     <w:p>

</xml_diff>

<commit_message>
Space job blocks apart and drop italics on hospital names so experience is easier to scan.
Co-authored-by: Cursor <cursoragent@cursor.com>
</commit_message>
<xml_diff>
--- a/server/assets/template.docx
+++ b/server/assets/template.docx
@@ -679,7 +679,7 @@
         <w:tabs>
           <w:tab w:val="right" w:pos="8640"/>
         </w:tabs>
-        <w:spacing w:after="40" w:before="0" w:line="276" w:lineRule="auto"/>
+        <w:spacing w:after="40" w:before="200" w:line="276" w:lineRule="auto"/>
         <w:jc w:val="left"/>
         <w:rPr>
           <w:rFonts w:ascii="Inter" w:hAnsi="Inter" w:cs="Inter" w:eastAsia="Inter"/>
@@ -769,8 +769,8 @@
           <w:rFonts w:ascii="Inter" w:hAnsi="Inter" w:cs="Inter" w:eastAsia="Inter"/>
           <w:b w:val="0"/>
           <w:bCs w:val="0"/>
-          <w:i/>
-          <w:iCs/>
+          <w:i w:val="0"/>
+          <w:iCs w:val="0"/>
           <w:color w:val="555555"/>
           <w:sz w:val="21"/>
           <w:szCs w:val="21"/>
@@ -781,8 +781,8 @@
           <w:rFonts w:ascii="Inter" w:hAnsi="Inter" w:cs="Inter" w:eastAsia="Inter"/>
           <w:b w:val="0"/>
           <w:bCs w:val="0"/>
-          <w:i/>
-          <w:iCs/>
+          <w:i w:val="0"/>
+          <w:iCs w:val="0"/>
           <w:color w:val="555555"/>
           <w:sz w:val="21"/>
           <w:szCs w:val="21"/>
@@ -885,8 +885,8 @@
           <w:rFonts w:ascii="Inter" w:hAnsi="Inter" w:cs="Inter" w:eastAsia="Inter"/>
           <w:b w:val="0"/>
           <w:bCs w:val="0"/>
-          <w:i/>
-          <w:iCs/>
+          <w:i w:val="0"/>
+          <w:iCs w:val="0"/>
           <w:color w:val="555555"/>
           <w:sz w:val="21"/>
           <w:szCs w:val="21"/>
@@ -897,8 +897,8 @@
           <w:rFonts w:ascii="Inter" w:hAnsi="Inter" w:cs="Inter" w:eastAsia="Inter"/>
           <w:b w:val="0"/>
           <w:bCs w:val="0"/>
-          <w:i/>
-          <w:iCs/>
+          <w:i w:val="0"/>
+          <w:iCs w:val="0"/>
           <w:color w:val="555555"/>
           <w:sz w:val="21"/>
           <w:szCs w:val="21"/>

</xml_diff>

<commit_message>
Space job blocks apart and drop italics on hospital names so experience is easier to scan. (#199)
Co-authored-by: juanrod <juanrod@Skyss-MacBook-Neo.local>
Co-authored-by: Cursor <cursoragent@cursor.com>
</commit_message>
<xml_diff>
--- a/server/assets/template.docx
+++ b/server/assets/template.docx
@@ -679,7 +679,7 @@
         <w:tabs>
           <w:tab w:val="right" w:pos="8640"/>
         </w:tabs>
-        <w:spacing w:after="40" w:before="0" w:line="276" w:lineRule="auto"/>
+        <w:spacing w:after="40" w:before="200" w:line="276" w:lineRule="auto"/>
         <w:jc w:val="left"/>
         <w:rPr>
           <w:rFonts w:ascii="Inter" w:hAnsi="Inter" w:cs="Inter" w:eastAsia="Inter"/>
@@ -769,8 +769,8 @@
           <w:rFonts w:ascii="Inter" w:hAnsi="Inter" w:cs="Inter" w:eastAsia="Inter"/>
           <w:b w:val="0"/>
           <w:bCs w:val="0"/>
-          <w:i/>
-          <w:iCs/>
+          <w:i w:val="0"/>
+          <w:iCs w:val="0"/>
           <w:color w:val="555555"/>
           <w:sz w:val="21"/>
           <w:szCs w:val="21"/>
@@ -781,8 +781,8 @@
           <w:rFonts w:ascii="Inter" w:hAnsi="Inter" w:cs="Inter" w:eastAsia="Inter"/>
           <w:b w:val="0"/>
           <w:bCs w:val="0"/>
-          <w:i/>
-          <w:iCs/>
+          <w:i w:val="0"/>
+          <w:iCs w:val="0"/>
           <w:color w:val="555555"/>
           <w:sz w:val="21"/>
           <w:szCs w:val="21"/>
@@ -885,8 +885,8 @@
           <w:rFonts w:ascii="Inter" w:hAnsi="Inter" w:cs="Inter" w:eastAsia="Inter"/>
           <w:b w:val="0"/>
           <w:bCs w:val="0"/>
-          <w:i/>
-          <w:iCs/>
+          <w:i w:val="0"/>
+          <w:iCs w:val="0"/>
           <w:color w:val="555555"/>
           <w:sz w:val="21"/>
           <w:szCs w:val="21"/>
@@ -897,8 +897,8 @@
           <w:rFonts w:ascii="Inter" w:hAnsi="Inter" w:cs="Inter" w:eastAsia="Inter"/>
           <w:b w:val="0"/>
           <w:bCs w:val="0"/>
-          <w:i/>
-          <w:iCs/>
+          <w:i w:val="0"/>
+          <w:iCs w:val="0"/>
           <w:color w:val="555555"/>
           <w:sz w:val="21"/>
           <w:szCs w:val="21"/>

</xml_diff>